<commit_message>
incorporate gross income and net income tests when applicanle. issue #30
</commit_message>
<xml_diff>
--- a/docassemble/MichiganFoodStampCalculator/data/templates/snap-summary.docx
+++ b/docassemble/MichiganFoodStampCalculator/data/templates/snap-summary.docx
@@ -1,6 +1,6 @@
 
 <file path=word/document.xml><?xml version="1.0" encoding="utf-8"?>
-<w:document xmlns:wpc="http://schemas.microsoft.com/office/word/2010/wordprocessingCanvas" xmlns:cx="http://schemas.microsoft.com/office/drawing/2014/chartex" xmlns:cx1="http://schemas.microsoft.com/office/drawing/2015/9/8/chartex" xmlns:cx2="http://schemas.microsoft.com/office/drawing/2015/10/21/chartex" xmlns:cx3="http://schemas.microsoft.com/office/drawing/2016/5/9/chartex" xmlns:cx4="http://schemas.microsoft.com/office/drawing/2016/5/10/chartex" xmlns:cx5="http://schemas.microsoft.com/office/drawing/2016/5/11/chartex" xmlns:cx6="http://schemas.microsoft.com/office/drawing/2016/5/12/chartex" xmlns:cx7="http://schemas.microsoft.com/office/drawing/2016/5/13/chartex" xmlns:cx8="http://schemas.microsoft.com/office/drawing/2016/5/14/chartex" xmlns:mc="http://schemas.openxmlformats.org/markup-compatibility/2006" xmlns:aink="http://schemas.microsoft.com/office/drawing/2016/ink" xmlns:am3d="http://schemas.microsoft.com/office/drawing/2017/model3d" xmlns:o="urn:schemas-microsoft-com:office:office" xmlns:oel="http://schemas.microsoft.com/office/2019/extlst" xmlns:r="http://schemas.openxmlformats.org/officeDocument/2006/relationships" xmlns:m="http://schemas.openxmlformats.org/officeDocument/2006/math" xmlns:v="urn:schemas-microsoft-com:vml" xmlns:wp14="http://schemas.microsoft.com/office/word/2010/wordprocessingDrawing" xmlns:wp="http://schemas.openxmlformats.org/drawingml/2006/wordprocessingDrawing" xmlns:w10="urn:schemas-microsoft-com:office:word" xmlns:w="http://schemas.openxmlformats.org/wordprocessingml/2006/main" xmlns:w14="http://schemas.microsoft.com/office/word/2010/wordml" xmlns:w15="http://schemas.microsoft.com/office/word/2012/wordml" xmlns:w16cex="http://schemas.microsoft.com/office/word/2018/wordml/cex" xmlns:w16cid="http://schemas.microsoft.com/office/word/2016/wordml/cid" xmlns:w16="http://schemas.microsoft.com/office/word/2018/wordml" xmlns:w16du="http://schemas.microsoft.com/office/word/2023/wordml/word16du" xmlns:w16sdtdh="http://schemas.microsoft.com/office/word/2020/wordml/sdtdatahash" xmlns:w16sdtfl="http://schemas.microsoft.com/office/word/2024/wordml/sdtformatlock" xmlns:w16se="http://schemas.microsoft.com/office/word/2015/wordml/symex" xmlns:wpg="http://schemas.microsoft.com/office/word/2010/wordprocessingGroup" xmlns:wpi="http://schemas.microsoft.com/office/word/2010/wordprocessingInk" xmlns:wne="http://schemas.microsoft.com/office/word/2006/wordml" xmlns:wps="http://schemas.microsoft.com/office/word/2010/wordprocessingShape" mc:Ignorable="w14 w15 w16se w16cid w16 w16cex w16sdtdh w16sdtfl w16du wp14">
+<w:document xmlns:wpc="http://schemas.microsoft.com/office/word/2010/wordprocessingCanvas" xmlns:cx="http://schemas.microsoft.com/office/drawing/2014/chartex" xmlns:mc="http://schemas.openxmlformats.org/markup-compatibility/2006" xmlns:o="urn:schemas-microsoft-com:office:office" xmlns:r="http://schemas.openxmlformats.org/officeDocument/2006/relationships" xmlns:m="http://schemas.openxmlformats.org/officeDocument/2006/math" xmlns:v="urn:schemas-microsoft-com:vml" xmlns:wp14="http://schemas.microsoft.com/office/word/2010/wordprocessingDrawing" xmlns:wp="http://schemas.openxmlformats.org/drawingml/2006/wordprocessingDrawing" xmlns:w10="urn:schemas-microsoft-com:office:word" xmlns:w="http://schemas.openxmlformats.org/wordprocessingml/2006/main" xmlns:w14="http://schemas.microsoft.com/office/word/2010/wordml" xmlns:w15="http://schemas.microsoft.com/office/word/2012/wordml" xmlns:w16se="http://schemas.microsoft.com/office/word/2015/wordml/symex" xmlns:wpg="http://schemas.microsoft.com/office/word/2010/wordprocessingGroup" xmlns:wpi="http://schemas.microsoft.com/office/word/2010/wordprocessingInk" xmlns:wne="http://schemas.microsoft.com/office/word/2006/wordml" xmlns:wps="http://schemas.microsoft.com/office/word/2010/wordprocessingShape" mc:Ignorable="w14 w15 w16se wp14">
   <w:body>
     <w:p>
       <w:pPr>
@@ -45,32 +45,23 @@
           <w:sz w:val="20"/>
           <w:szCs w:val="20"/>
         </w:rPr>
-        <w:t>_of_</w:t>
-      </w:r>
-      <w:proofErr w:type="gramStart"/>
+        <w:t>_of_date</w:t>
+      </w:r>
+      <w:proofErr w:type="spellEnd"/>
       <w:r>
         <w:rPr>
           <w:sz w:val="20"/>
           <w:szCs w:val="20"/>
         </w:rPr>
-        <w:t>date</w:t>
-      </w:r>
-      <w:proofErr w:type="spellEnd"/>
+        <w:t xml:space="preserve"> </w:t>
+      </w:r>
       <w:r>
         <w:rPr>
           <w:sz w:val="20"/>
           <w:szCs w:val="20"/>
         </w:rPr>
-        <w:t xml:space="preserve"> </w:t>
-      </w:r>
-      <w:r>
-        <w:rPr>
-          <w:sz w:val="20"/>
-          <w:szCs w:val="20"/>
-        </w:rPr>
         <w:t>}</w:t>
       </w:r>
-      <w:proofErr w:type="gramEnd"/>
       <w:r>
         <w:rPr>
           <w:sz w:val="20"/>
@@ -168,28 +159,14 @@
         <w:rPr>
           <w:b/>
         </w:rPr>
-        <w:t>round|</w:t>
-      </w:r>
-      <w:proofErr w:type="gramStart"/>
+        <w:t>round|int</w:t>
+      </w:r>
+      <w:proofErr w:type="spellEnd"/>
       <w:r>
         <w:rPr>
           <w:b/>
         </w:rPr>
-        <w:t>int</w:t>
-      </w:r>
-      <w:proofErr w:type="spellEnd"/>
-      <w:r>
-        <w:rPr>
-          <w:b/>
-        </w:rPr>
-        <w:t xml:space="preserve"> }</w:t>
-      </w:r>
-      <w:proofErr w:type="gramEnd"/>
-      <w:r>
-        <w:rPr>
-          <w:b/>
-        </w:rPr>
-        <w:t>} per month</w:t>
+        <w:t xml:space="preserve"> }} per month</w:t>
       </w:r>
       <w:r>
         <w:t xml:space="preserve">. This amount is only an estimate - there is no guarantee that you will receive this amount. </w:t>
@@ -245,13 +222,8 @@
             </w:r>
             <w:proofErr w:type="spellEnd"/>
             <w:r>
-              <w:t xml:space="preserve"> &gt; </w:t>
-            </w:r>
-            <w:proofErr w:type="gramStart"/>
-            <w:r>
-              <w:t>0 %}</w:t>
-            </w:r>
-            <w:proofErr w:type="gramEnd"/>
+              <w:t xml:space="preserve"> &gt; 0 %}</w:t>
+            </w:r>
           </w:p>
           <w:p>
             <w:pPr>
@@ -296,23 +268,17 @@
             </w:r>
             <w:proofErr w:type="spellEnd"/>
             <w:r>
-              <w:t xml:space="preserve"> == </w:t>
-            </w:r>
-            <w:proofErr w:type="gramStart"/>
-            <w:r>
-              <w:t>True</w:t>
+              <w:t xml:space="preserve"> == True</w:t>
             </w:r>
             <w:r>
               <w:t xml:space="preserve"> %}</w:t>
             </w:r>
-            <w:proofErr w:type="gramEnd"/>
             <w:r>
               <w:t xml:space="preserve"> </w:t>
             </w:r>
             <w:r>
               <w:t>(</w:t>
             </w:r>
-            <w:proofErr w:type="gramStart"/>
             <w:r>
               <w:t xml:space="preserve">{{ </w:t>
             </w:r>
@@ -321,34 +287,20 @@
               <w:t>HHSizeAdjusted</w:t>
             </w:r>
             <w:proofErr w:type="spellEnd"/>
-            <w:proofErr w:type="gramEnd"/>
             <w:r>
               <w:t xml:space="preserve"> }} </w:t>
             </w:r>
             <w:r>
-              <w:t xml:space="preserve">eligible for FAP </w:t>
-            </w:r>
-            <w:proofErr w:type="gramStart"/>
-            <w:r>
-              <w:t>benefits)</w:t>
+              <w:t>eligible for FAP benefits)</w:t>
             </w:r>
             <w:r>
               <w:t xml:space="preserve"> </w:t>
             </w:r>
             <w:r>
-              <w:t>{</w:t>
-            </w:r>
-            <w:proofErr w:type="gramEnd"/>
-            <w:r>
-              <w:t xml:space="preserve">% </w:t>
-            </w:r>
-            <w:proofErr w:type="gramStart"/>
-            <w:r>
-              <w:t>endif %}</w:t>
-            </w:r>
-            <w:proofErr w:type="gramEnd"/>
-            <w:r>
-              <w:t xml:space="preserve"> </w:t>
+              <w:t xml:space="preserve">{% </w:t>
+            </w:r>
+            <w:r>
+              <w:t xml:space="preserve">endif %} </w:t>
             </w:r>
           </w:p>
           <w:p>
@@ -362,13 +314,8 @@
               </w:rPr>
             </w:pPr>
             <w:r>
-              <w:t xml:space="preserve">{%p </w:t>
-            </w:r>
-            <w:proofErr w:type="gramStart"/>
-            <w:r>
-              <w:t>endif %}</w:t>
-            </w:r>
-            <w:proofErr w:type="gramEnd"/>
+              <w:t>{%p endif %}</w:t>
+            </w:r>
           </w:p>
           <w:p>
             <w:pPr>
@@ -381,13 +328,8 @@
               </w:rPr>
             </w:pPr>
             <w:r>
-              <w:t xml:space="preserve">{%p if GMUI &gt; </w:t>
-            </w:r>
-            <w:proofErr w:type="gramStart"/>
-            <w:r>
-              <w:t>0 %}</w:t>
-            </w:r>
-            <w:proofErr w:type="gramEnd"/>
+              <w:t>{%p if GMUI &gt; 0 %}</w:t>
+            </w:r>
           </w:p>
           <w:p>
             <w:pPr>
@@ -417,19 +359,11 @@
             </w:r>
             <w:proofErr w:type="spellStart"/>
             <w:r>
-              <w:t>round|</w:t>
-            </w:r>
-            <w:proofErr w:type="gramStart"/>
-            <w:r>
-              <w:t>int</w:t>
-            </w:r>
-            <w:proofErr w:type="spellEnd"/>
-            <w:r>
-              <w:t xml:space="preserve"> }</w:t>
-            </w:r>
-            <w:proofErr w:type="gramEnd"/>
-            <w:r>
-              <w:t xml:space="preserve">} </w:t>
+              <w:t>round|int</w:t>
+            </w:r>
+            <w:proofErr w:type="spellEnd"/>
+            <w:r>
+              <w:t xml:space="preserve"> }} </w:t>
             </w:r>
           </w:p>
           <w:p>
@@ -443,13 +377,8 @@
               </w:rPr>
             </w:pPr>
             <w:r>
-              <w:t xml:space="preserve">{%p </w:t>
-            </w:r>
-            <w:proofErr w:type="gramStart"/>
-            <w:r>
-              <w:t>endif %}</w:t>
-            </w:r>
-            <w:proofErr w:type="gramEnd"/>
+              <w:t>{%p endif %}</w:t>
+            </w:r>
           </w:p>
           <w:p>
             <w:pPr>
@@ -462,13 +391,8 @@
               </w:rPr>
             </w:pPr>
             <w:r>
-              <w:t xml:space="preserve">{%p if GMEI &gt; </w:t>
-            </w:r>
-            <w:proofErr w:type="gramStart"/>
-            <w:r>
-              <w:t>0 %}</w:t>
-            </w:r>
-            <w:proofErr w:type="gramEnd"/>
+              <w:t>{%p if GMEI &gt; 0 %}</w:t>
+            </w:r>
           </w:p>
           <w:p>
             <w:pPr>
@@ -498,19 +422,11 @@
             </w:r>
             <w:proofErr w:type="spellStart"/>
             <w:r>
-              <w:t>round|</w:t>
-            </w:r>
-            <w:proofErr w:type="gramStart"/>
-            <w:r>
-              <w:t>int</w:t>
-            </w:r>
-            <w:proofErr w:type="spellEnd"/>
-            <w:r>
-              <w:t xml:space="preserve"> }</w:t>
-            </w:r>
-            <w:proofErr w:type="gramEnd"/>
-            <w:r>
-              <w:t>}</w:t>
+              <w:t>round|int</w:t>
+            </w:r>
+            <w:proofErr w:type="spellEnd"/>
+            <w:r>
+              <w:t xml:space="preserve"> }}</w:t>
             </w:r>
           </w:p>
           <w:p>
@@ -524,13 +440,8 @@
               </w:rPr>
             </w:pPr>
             <w:r>
-              <w:t xml:space="preserve">{%p </w:t>
-            </w:r>
-            <w:proofErr w:type="gramStart"/>
-            <w:r>
-              <w:t>endif %}</w:t>
-            </w:r>
-            <w:proofErr w:type="gramEnd"/>
+              <w:t>{%p endif %}</w:t>
+            </w:r>
           </w:p>
           <w:p>
             <w:pPr>
@@ -551,13 +462,8 @@
             </w:r>
             <w:proofErr w:type="spellEnd"/>
             <w:r>
-              <w:t xml:space="preserve"> &gt; </w:t>
-            </w:r>
-            <w:proofErr w:type="gramStart"/>
-            <w:r>
-              <w:t>0 %}</w:t>
-            </w:r>
-            <w:proofErr w:type="gramEnd"/>
+              <w:t xml:space="preserve"> &gt; 0 %}</w:t>
+            </w:r>
           </w:p>
           <w:p>
             <w:pPr>
@@ -592,19 +498,11 @@
             </w:r>
             <w:proofErr w:type="spellStart"/>
             <w:r>
-              <w:t>round|</w:t>
-            </w:r>
-            <w:proofErr w:type="gramStart"/>
-            <w:r>
-              <w:t>int</w:t>
-            </w:r>
-            <w:proofErr w:type="spellEnd"/>
-            <w:r>
-              <w:t xml:space="preserve"> }</w:t>
-            </w:r>
-            <w:proofErr w:type="gramEnd"/>
-            <w:r>
-              <w:t>}</w:t>
+              <w:t>round|int</w:t>
+            </w:r>
+            <w:proofErr w:type="spellEnd"/>
+            <w:r>
+              <w:t xml:space="preserve"> }}</w:t>
             </w:r>
           </w:p>
           <w:p>
@@ -618,13 +516,8 @@
               </w:rPr>
             </w:pPr>
             <w:r>
-              <w:t xml:space="preserve">{%p </w:t>
-            </w:r>
-            <w:proofErr w:type="gramStart"/>
-            <w:r>
-              <w:t>endif %}</w:t>
-            </w:r>
-            <w:proofErr w:type="gramEnd"/>
+              <w:t>{%p endif %}</w:t>
+            </w:r>
           </w:p>
           <w:p>
             <w:pPr>
@@ -645,13 +538,8 @@
             </w:r>
             <w:proofErr w:type="spellEnd"/>
             <w:r>
-              <w:t xml:space="preserve"> &gt; </w:t>
-            </w:r>
-            <w:proofErr w:type="gramStart"/>
-            <w:r>
-              <w:t>0 %}</w:t>
-            </w:r>
-            <w:proofErr w:type="gramEnd"/>
+              <w:t xml:space="preserve"> &gt; 0 %}</w:t>
+            </w:r>
           </w:p>
           <w:p>
             <w:pPr>
@@ -686,19 +574,11 @@
             </w:r>
             <w:proofErr w:type="spellStart"/>
             <w:r>
-              <w:t>round|</w:t>
-            </w:r>
-            <w:proofErr w:type="gramStart"/>
-            <w:r>
-              <w:t>int</w:t>
-            </w:r>
-            <w:proofErr w:type="spellEnd"/>
-            <w:r>
-              <w:t xml:space="preserve"> }</w:t>
-            </w:r>
-            <w:proofErr w:type="gramEnd"/>
-            <w:r>
-              <w:t xml:space="preserve">} </w:t>
+              <w:t>round|int</w:t>
+            </w:r>
+            <w:proofErr w:type="spellEnd"/>
+            <w:r>
+              <w:t xml:space="preserve"> }} </w:t>
             </w:r>
           </w:p>
           <w:p>
@@ -712,13 +592,8 @@
               </w:rPr>
             </w:pPr>
             <w:r>
-              <w:t xml:space="preserve">{%p </w:t>
-            </w:r>
-            <w:proofErr w:type="gramStart"/>
-            <w:r>
-              <w:t>endif %}</w:t>
-            </w:r>
-            <w:proofErr w:type="gramEnd"/>
+              <w:t>{%p endif %}</w:t>
+            </w:r>
           </w:p>
           <w:p>
             <w:pPr>
@@ -739,13 +614,8 @@
             </w:r>
             <w:proofErr w:type="spellEnd"/>
             <w:r>
-              <w:t xml:space="preserve"> &gt; </w:t>
-            </w:r>
-            <w:proofErr w:type="gramStart"/>
-            <w:r>
-              <w:t>0 %}</w:t>
-            </w:r>
-            <w:proofErr w:type="gramEnd"/>
+              <w:t xml:space="preserve"> &gt; 0 %}</w:t>
+            </w:r>
           </w:p>
           <w:p>
             <w:pPr>
@@ -763,23 +633,15 @@
               </w:rPr>
             </w:pPr>
             <w:r>
-              <w:t xml:space="preserve">Your monthly </w:t>
+              <w:t>Your monthly child care costs are $</w:t>
             </w:r>
             <w:proofErr w:type="gramStart"/>
             <w:r>
-              <w:t>child care</w:t>
-            </w:r>
+              <w:t>{{ (</w:t>
+            </w:r>
+            <w:proofErr w:type="spellStart"/>
             <w:proofErr w:type="gramEnd"/>
             <w:r>
-              <w:t xml:space="preserve"> costs are $</w:t>
-            </w:r>
-            <w:proofErr w:type="gramStart"/>
-            <w:r>
-              <w:t>{{ (</w:t>
-            </w:r>
-            <w:proofErr w:type="spellStart"/>
-            <w:proofErr w:type="gramEnd"/>
-            <w:r>
               <w:t>DepCareDed</w:t>
             </w:r>
             <w:proofErr w:type="spellEnd"/>
@@ -788,19 +650,11 @@
             </w:r>
             <w:proofErr w:type="spellStart"/>
             <w:r>
-              <w:t>round|</w:t>
-            </w:r>
-            <w:proofErr w:type="gramStart"/>
-            <w:r>
-              <w:t>int</w:t>
-            </w:r>
-            <w:proofErr w:type="spellEnd"/>
-            <w:r>
-              <w:t xml:space="preserve"> }</w:t>
-            </w:r>
-            <w:proofErr w:type="gramEnd"/>
-            <w:r>
-              <w:t>}</w:t>
+              <w:t>round|int</w:t>
+            </w:r>
+            <w:proofErr w:type="spellEnd"/>
+            <w:r>
+              <w:t xml:space="preserve"> }}</w:t>
             </w:r>
           </w:p>
           <w:p>
@@ -814,13 +668,8 @@
               </w:rPr>
             </w:pPr>
             <w:r>
-              <w:t xml:space="preserve">{%p </w:t>
-            </w:r>
-            <w:proofErr w:type="gramStart"/>
-            <w:r>
-              <w:t>endif %}</w:t>
-            </w:r>
-            <w:proofErr w:type="gramEnd"/>
+              <w:t>{%p endif %}</w:t>
+            </w:r>
           </w:p>
           <w:p>
             <w:pPr>
@@ -874,13 +723,8 @@
               </w:rPr>
             </w:pPr>
             <w:r>
-              <w:t xml:space="preserve">{%p </w:t>
-            </w:r>
-            <w:proofErr w:type="gramStart"/>
-            <w:r>
-              <w:t>endif %}</w:t>
-            </w:r>
-            <w:proofErr w:type="gramEnd"/>
+              <w:t>{%p endif %}</w:t>
+            </w:r>
           </w:p>
           <w:p>
             <w:pPr>
@@ -945,13 +789,8 @@
               </w:rPr>
             </w:pPr>
             <w:r>
-              <w:t xml:space="preserve">{%p </w:t>
-            </w:r>
-            <w:proofErr w:type="gramStart"/>
-            <w:r>
-              <w:t>endif %}</w:t>
-            </w:r>
-            <w:proofErr w:type="gramEnd"/>
+              <w:t>{%p endif %}</w:t>
+            </w:r>
           </w:p>
           <w:p>
             <w:pPr>
@@ -1014,13 +853,8 @@
               </w:rPr>
             </w:pPr>
             <w:r>
-              <w:t xml:space="preserve">{%p </w:t>
-            </w:r>
-            <w:proofErr w:type="gramStart"/>
-            <w:r>
-              <w:t>endif %}</w:t>
-            </w:r>
-            <w:proofErr w:type="gramEnd"/>
+              <w:t>{%p endif %}</w:t>
+            </w:r>
           </w:p>
           <w:p>
             <w:pPr>
@@ -1039,13 +873,8 @@
             </w:r>
             <w:proofErr w:type="spellEnd"/>
             <w:r>
-              <w:t xml:space="preserve"> == "No</w:t>
-            </w:r>
-            <w:proofErr w:type="gramStart"/>
-            <w:r>
-              <w:t>" %}</w:t>
-            </w:r>
-            <w:proofErr w:type="gramEnd"/>
+              <w:t xml:space="preserve"> == "No" %}</w:t>
+            </w:r>
           </w:p>
           <w:p>
             <w:pPr>
@@ -1063,15 +892,7 @@
               </w:rPr>
             </w:pPr>
             <w:r>
-              <w:t xml:space="preserve">You </w:t>
-            </w:r>
-            <w:proofErr w:type="gramStart"/>
-            <w:r>
-              <w:t>pay</w:t>
-            </w:r>
-            <w:proofErr w:type="gramEnd"/>
-            <w:r>
-              <w:t xml:space="preserve"> the following utilities:</w:t>
+              <w:t>You pay the following utilities:</w:t>
             </w:r>
             <w:r>
               <w:t xml:space="preserve"> </w:t>
@@ -1104,13 +925,8 @@
               </w:rPr>
             </w:pPr>
             <w:r>
-              <w:t xml:space="preserve">{%p </w:t>
-            </w:r>
-            <w:proofErr w:type="gramStart"/>
-            <w:r>
-              <w:t>endif %}</w:t>
-            </w:r>
-            <w:proofErr w:type="gramEnd"/>
+              <w:t>{%p endif %}</w:t>
+            </w:r>
           </w:p>
           <w:p>
             <w:pPr>
@@ -1169,13 +985,8 @@
               </w:rPr>
             </w:pPr>
             <w:r>
-              <w:t xml:space="preserve">{%p </w:t>
-            </w:r>
-            <w:proofErr w:type="gramStart"/>
-            <w:r>
-              <w:t>endif %}</w:t>
-            </w:r>
-            <w:proofErr w:type="gramEnd"/>
+              <w:t>{%p endif %}</w:t>
+            </w:r>
           </w:p>
           <w:p>
             <w:pPr>
@@ -1196,13 +1007,8 @@
             </w:r>
             <w:proofErr w:type="spellEnd"/>
             <w:r>
-              <w:t xml:space="preserve"> &gt; </w:t>
-            </w:r>
-            <w:proofErr w:type="gramStart"/>
-            <w:r>
-              <w:t>0 %}</w:t>
-            </w:r>
-            <w:proofErr w:type="gramEnd"/>
+              <w:t xml:space="preserve"> &gt; 0 %}</w:t>
+            </w:r>
           </w:p>
           <w:p>
             <w:pPr>
@@ -1238,24 +1044,15 @@
             </w:r>
             <w:proofErr w:type="spellStart"/>
             <w:r>
-              <w:t>round|</w:t>
-            </w:r>
-            <w:proofErr w:type="gramStart"/>
-            <w:r>
-              <w:t>int</w:t>
-            </w:r>
-            <w:proofErr w:type="spellEnd"/>
-            <w:r>
-              <w:t xml:space="preserve"> }</w:t>
-            </w:r>
-            <w:proofErr w:type="gramEnd"/>
-            <w:r>
-              <w:t>}</w:t>
+              <w:t>round|int</w:t>
+            </w:r>
+            <w:proofErr w:type="spellEnd"/>
+            <w:r>
+              <w:t xml:space="preserve"> }}</w:t>
             </w:r>
             <w:r>
               <w:t xml:space="preserve"> </w:t>
             </w:r>
-            <w:proofErr w:type="gramStart"/>
             <w:r>
               <w:rPr>
                 <w:sz w:val="20"/>
@@ -1270,7 +1067,6 @@
               <w:t>ExcessMedTag</w:t>
             </w:r>
             <w:proofErr w:type="spellEnd"/>
-            <w:proofErr w:type="gramEnd"/>
             <w:r>
               <w:rPr>
                 <w:sz w:val="20"/>
@@ -1289,13 +1085,8 @@
               </w:rPr>
             </w:pPr>
             <w:r>
-              <w:t xml:space="preserve">{%p </w:t>
-            </w:r>
-            <w:proofErr w:type="gramStart"/>
-            <w:r>
-              <w:t>endif %}</w:t>
-            </w:r>
-            <w:proofErr w:type="gramEnd"/>
+              <w:t>{%p endif %}</w:t>
+            </w:r>
           </w:p>
           <w:p>
             <w:pPr>
@@ -1316,13 +1107,8 @@
             </w:r>
             <w:proofErr w:type="spellEnd"/>
             <w:r>
-              <w:t xml:space="preserve"> &gt; </w:t>
-            </w:r>
-            <w:proofErr w:type="gramStart"/>
-            <w:r>
-              <w:t>0 %}</w:t>
-            </w:r>
-            <w:proofErr w:type="gramEnd"/>
+              <w:t xml:space="preserve"> &gt; 0 %}</w:t>
+            </w:r>
           </w:p>
           <w:p/>
           <w:p>
@@ -1393,31 +1179,15 @@
                 <w:sz w:val="22"/>
                 <w:szCs w:val="22"/>
               </w:rPr>
-              <w:t>round|</w:t>
-            </w:r>
-            <w:proofErr w:type="gramStart"/>
+              <w:t>round|int</w:t>
+            </w:r>
+            <w:proofErr w:type="spellEnd"/>
             <w:r>
               <w:rPr>
                 <w:sz w:val="22"/>
                 <w:szCs w:val="22"/>
               </w:rPr>
-              <w:t>int</w:t>
-            </w:r>
-            <w:proofErr w:type="spellEnd"/>
-            <w:r>
-              <w:rPr>
-                <w:sz w:val="22"/>
-                <w:szCs w:val="22"/>
-              </w:rPr>
-              <w:t xml:space="preserve"> }</w:t>
-            </w:r>
-            <w:proofErr w:type="gramEnd"/>
-            <w:r>
-              <w:rPr>
-                <w:sz w:val="22"/>
-                <w:szCs w:val="22"/>
-              </w:rPr>
-              <w:t xml:space="preserve">} per </w:t>
+              <w:t xml:space="preserve"> }} per </w:t>
             </w:r>
             <w:r>
               <w:rPr>
@@ -1447,13 +1217,8 @@
               </w:rPr>
             </w:pPr>
             <w:r>
-              <w:t xml:space="preserve">{%p </w:t>
-            </w:r>
-            <w:proofErr w:type="gramStart"/>
-            <w:r>
-              <w:t>endif %}</w:t>
-            </w:r>
-            <w:proofErr w:type="gramEnd"/>
+              <w:t>{%p endif %}</w:t>
+            </w:r>
           </w:p>
           <w:p>
             <w:pPr>
@@ -1846,7 +1611,6 @@
               <w:spacing w:after="0"/>
               <w:jc w:val="center"/>
             </w:pPr>
-            <w:proofErr w:type="gramStart"/>
             <w:r>
               <w:t xml:space="preserve">{{ </w:t>
             </w:r>
@@ -1855,7 +1619,6 @@
               <w:t>HHSize</w:t>
             </w:r>
             <w:proofErr w:type="spellEnd"/>
-            <w:proofErr w:type="gramEnd"/>
             <w:r>
               <w:t xml:space="preserve"> }}</w:t>
             </w:r>
@@ -1905,7 +1668,6 @@
               <w:spacing w:after="0"/>
               <w:jc w:val="center"/>
             </w:pPr>
-            <w:proofErr w:type="gramStart"/>
             <w:r>
               <w:t xml:space="preserve">{{ </w:t>
             </w:r>
@@ -1917,12 +1679,19 @@
               <w:t>Adjusted</w:t>
             </w:r>
             <w:proofErr w:type="spellEnd"/>
-            <w:proofErr w:type="gramEnd"/>
             <w:r>
               <w:t xml:space="preserve"> }}</w:t>
             </w:r>
             <w:r>
-              <w:t xml:space="preserve"> {% endif %}</w:t>
+              <w:t xml:space="preserve"> {% </w:t>
+            </w:r>
+            <w:proofErr w:type="spellStart"/>
+            <w:r>
+              <w:t>endif</w:t>
+            </w:r>
+            <w:proofErr w:type="spellEnd"/>
+            <w:r>
+              <w:t xml:space="preserve"> %}</w:t>
             </w:r>
           </w:p>
         </w:tc>
@@ -1953,7 +1722,6 @@
               <w:spacing w:after="0"/>
               <w:jc w:val="center"/>
             </w:pPr>
-            <w:proofErr w:type="gramStart"/>
             <w:r>
               <w:t xml:space="preserve">{{ </w:t>
             </w:r>
@@ -1962,7 +1730,6 @@
               <w:t>ElderlyOrDisabled</w:t>
             </w:r>
             <w:proofErr w:type="spellEnd"/>
-            <w:proofErr w:type="gramEnd"/>
             <w:r>
               <w:t xml:space="preserve"> }}</w:t>
             </w:r>
@@ -1981,13 +1748,8 @@
             <w:r>
               <w:t xml:space="preserve">  </w:t>
             </w:r>
-            <w:proofErr w:type="gramStart"/>
-            <w:r>
-              <w:t>Child care</w:t>
-            </w:r>
-            <w:proofErr w:type="gramEnd"/>
-            <w:r>
-              <w:t xml:space="preserve"> or disabled adult care costs?</w:t>
+            <w:r>
+              <w:t>Child care or disabled adult care costs?</w:t>
             </w:r>
           </w:p>
         </w:tc>
@@ -2000,7 +1762,6 @@
               <w:spacing w:after="0"/>
               <w:jc w:val="center"/>
             </w:pPr>
-            <w:proofErr w:type="gramStart"/>
             <w:r>
               <w:t xml:space="preserve">{{ </w:t>
             </w:r>
@@ -2009,7 +1770,6 @@
               <w:t>hasDependent</w:t>
             </w:r>
             <w:proofErr w:type="spellEnd"/>
-            <w:proofErr w:type="gramEnd"/>
             <w:r>
               <w:t xml:space="preserve"> }}</w:t>
             </w:r>
@@ -2065,21 +1825,13 @@
               <w:spacing w:after="0"/>
             </w:pPr>
             <w:r>
-              <w:t xml:space="preserve">  2</w:t>
-            </w:r>
-            <w:proofErr w:type="gramStart"/>
-            <w:r>
-              <w:t>A</w:t>
+              <w:t xml:space="preserve">  2A</w:t>
             </w:r>
             <w:r>
               <w:t xml:space="preserve"> </w:t>
             </w:r>
             <w:r>
-              <w:t xml:space="preserve"> Total</w:t>
-            </w:r>
-            <w:proofErr w:type="gramEnd"/>
-            <w:r>
-              <w:t xml:space="preserve"> Unearned Income</w:t>
+              <w:t xml:space="preserve"> Total Unearned Income</w:t>
             </w:r>
           </w:p>
         </w:tc>
@@ -2093,23 +1845,7 @@
               <w:jc w:val="right"/>
             </w:pPr>
             <w:r>
-              <w:t>$</w:t>
-            </w:r>
-            <w:proofErr w:type="gramStart"/>
-            <w:r>
-              <w:t>{{ ‘</w:t>
-            </w:r>
-            <w:proofErr w:type="gramEnd"/>
-            <w:r>
-              <w:t>{:,.0f}</w:t>
-            </w:r>
-            <w:proofErr w:type="gramStart"/>
-            <w:r>
-              <w:t>’.format</w:t>
-            </w:r>
-            <w:proofErr w:type="gramEnd"/>
-            <w:r>
-              <w:t>(GMUI) }}</w:t>
+              <w:t>${{ ‘{:,.0f}’.format(GMUI) }}</w:t>
             </w:r>
           </w:p>
         </w:tc>
@@ -2124,21 +1860,13 @@
               <w:spacing w:after="0"/>
             </w:pPr>
             <w:r>
-              <w:t xml:space="preserve">  2</w:t>
-            </w:r>
-            <w:proofErr w:type="gramStart"/>
-            <w:r>
-              <w:t xml:space="preserve">B </w:t>
+              <w:t xml:space="preserve">  2B </w:t>
             </w:r>
             <w:r>
               <w:t xml:space="preserve"> </w:t>
             </w:r>
             <w:r>
-              <w:t>Total</w:t>
-            </w:r>
-            <w:proofErr w:type="gramEnd"/>
-            <w:r>
-              <w:t xml:space="preserve"> Earned Income</w:t>
+              <w:t>Total Earned Income</w:t>
             </w:r>
           </w:p>
         </w:tc>
@@ -2155,23 +1883,7 @@
               <w:t xml:space="preserve">+ </w:t>
             </w:r>
             <w:r>
-              <w:t>$</w:t>
-            </w:r>
-            <w:proofErr w:type="gramStart"/>
-            <w:r>
-              <w:t>{{ ‘</w:t>
-            </w:r>
-            <w:proofErr w:type="gramEnd"/>
-            <w:r>
-              <w:t>{:,.0f}</w:t>
-            </w:r>
-            <w:proofErr w:type="gramStart"/>
-            <w:r>
-              <w:t>’.format</w:t>
-            </w:r>
-            <w:proofErr w:type="gramEnd"/>
-            <w:r>
-              <w:t>(GMEI) }}</w:t>
+              <w:t>${{ ‘{:,.0f}’.format(GMEI) }}</w:t>
             </w:r>
           </w:p>
         </w:tc>
@@ -2186,21 +1898,13 @@
               <w:spacing w:after="0"/>
             </w:pPr>
             <w:r>
-              <w:t xml:space="preserve">  2</w:t>
-            </w:r>
-            <w:proofErr w:type="gramStart"/>
-            <w:r>
-              <w:t xml:space="preserve">C </w:t>
+              <w:t xml:space="preserve">  2C </w:t>
             </w:r>
             <w:r>
               <w:t xml:space="preserve"> </w:t>
             </w:r>
             <w:r>
-              <w:t>Child</w:t>
-            </w:r>
-            <w:proofErr w:type="gramEnd"/>
-            <w:r>
-              <w:t xml:space="preserve"> Support</w:t>
+              <w:t>Child Support</w:t>
             </w:r>
           </w:p>
         </w:tc>
@@ -2217,23 +1921,7 @@
               <w:t xml:space="preserve">- </w:t>
             </w:r>
             <w:r>
-              <w:t>$</w:t>
-            </w:r>
-            <w:proofErr w:type="gramStart"/>
-            <w:r>
-              <w:t>{{ ‘</w:t>
-            </w:r>
-            <w:proofErr w:type="gramEnd"/>
-            <w:r>
-              <w:t>{:,.0f}</w:t>
-            </w:r>
-            <w:proofErr w:type="gramStart"/>
-            <w:r>
-              <w:t>’.format</w:t>
-            </w:r>
-            <w:proofErr w:type="gramEnd"/>
-            <w:r>
-              <w:t>(</w:t>
+              <w:t>${{ ‘{:,.0f}’.format(</w:t>
             </w:r>
             <w:proofErr w:type="spellStart"/>
             <w:r>
@@ -2262,14 +1950,7 @@
               <w:rPr>
                 <w:b/>
               </w:rPr>
-              <w:t xml:space="preserve">  2</w:t>
-            </w:r>
-            <w:proofErr w:type="gramStart"/>
-            <w:r>
-              <w:rPr>
-                <w:b/>
-              </w:rPr>
-              <w:t xml:space="preserve">D </w:t>
+              <w:t xml:space="preserve">  2D </w:t>
             </w:r>
             <w:r>
               <w:rPr>
@@ -2281,14 +1962,7 @@
               <w:rPr>
                 <w:b/>
               </w:rPr>
-              <w:t>Total</w:t>
-            </w:r>
-            <w:proofErr w:type="gramEnd"/>
-            <w:r>
-              <w:rPr>
-                <w:b/>
-              </w:rPr>
-              <w:t xml:space="preserve"> Gross Income (TGMI):</w:t>
+              <w:t>Total Gross Income (TGMI):</w:t>
             </w:r>
           </w:p>
         </w:tc>
@@ -2308,35 +1982,7 @@
               <w:rPr>
                 <w:b/>
               </w:rPr>
-              <w:t>= $</w:t>
-            </w:r>
-            <w:proofErr w:type="gramStart"/>
-            <w:r>
-              <w:rPr>
-                <w:b/>
-              </w:rPr>
-              <w:t>{{ ‘</w:t>
-            </w:r>
-            <w:proofErr w:type="gramEnd"/>
-            <w:r>
-              <w:rPr>
-                <w:b/>
-              </w:rPr>
-              <w:t>{:,.0f}</w:t>
-            </w:r>
-            <w:proofErr w:type="gramStart"/>
-            <w:r>
-              <w:rPr>
-                <w:b/>
-              </w:rPr>
-              <w:t>’.format</w:t>
-            </w:r>
-            <w:proofErr w:type="gramEnd"/>
-            <w:r>
-              <w:rPr>
-                <w:b/>
-              </w:rPr>
-              <w:t>(TGMI) }}</w:t>
+              <w:t>= ${{ ‘{:,.0f}’.format(TGMI) }}</w:t>
             </w:r>
           </w:p>
         </w:tc>
@@ -2371,23 +2017,7 @@
               <w:jc w:val="right"/>
             </w:pPr>
             <w:r>
-              <w:t>$</w:t>
-            </w:r>
-            <w:proofErr w:type="gramStart"/>
-            <w:r>
-              <w:t>{{ ‘</w:t>
-            </w:r>
-            <w:proofErr w:type="gramEnd"/>
-            <w:r>
-              <w:t>{:,.0f}</w:t>
-            </w:r>
-            <w:proofErr w:type="gramStart"/>
-            <w:r>
-              <w:t>’.format</w:t>
-            </w:r>
-            <w:proofErr w:type="gramEnd"/>
-            <w:r>
-              <w:t>(</w:t>
+              <w:t>${{ ‘{:,.0f}’.format(</w:t>
             </w:r>
             <w:proofErr w:type="spellStart"/>
             <w:r>
@@ -2409,6 +2039,7 @@
           <w:p>
             <w:pPr>
               <w:spacing w:after="0"/>
+              <w:ind w:left="330" w:hanging="330"/>
               <w:rPr>
                 <w:b/>
               </w:rPr>
@@ -2418,6 +2049,35 @@
                 <w:b/>
               </w:rPr>
               <w:t xml:space="preserve">  Gross Income Test result</w:t>
+            </w:r>
+            <w:r>
+              <w:rPr>
+                <w:b/>
+              </w:rPr>
+              <w:t xml:space="preserve"> </w:t>
+            </w:r>
+            <w:r>
+              <w:rPr>
+                <w:b/>
+                <w:sz w:val="18"/>
+              </w:rPr>
+              <w:t xml:space="preserve">{{ </w:t>
+            </w:r>
+            <w:proofErr w:type="spellStart"/>
+            <w:r>
+              <w:rPr>
+                <w:b/>
+                <w:sz w:val="18"/>
+              </w:rPr>
+              <w:t>GITTag</w:t>
+            </w:r>
+            <w:proofErr w:type="spellEnd"/>
+            <w:r>
+              <w:rPr>
+                <w:b/>
+                <w:sz w:val="18"/>
+              </w:rPr>
+              <w:t xml:space="preserve"> }}</w:t>
             </w:r>
           </w:p>
         </w:tc>
@@ -2434,7 +2094,6 @@
                 <w:b/>
               </w:rPr>
             </w:pPr>
-            <w:proofErr w:type="gramStart"/>
             <w:r>
               <w:rPr>
                 <w:b/>
@@ -2449,7 +2108,6 @@
               <w:t>GITResult</w:t>
             </w:r>
             <w:proofErr w:type="spellEnd"/>
-            <w:proofErr w:type="gramEnd"/>
             <w:r>
               <w:rPr>
                 <w:b/>
@@ -2474,7 +2132,33 @@
               <w:rPr>
                 <w:b/>
               </w:rPr>
-              <w:t xml:space="preserve"> == “FAILED” %} (ineligible for FAP) {% endif %}</w:t>
+              <w:t xml:space="preserve"> == “FAILED”</w:t>
+            </w:r>
+            <w:r>
+              <w:rPr>
+                <w:b/>
+              </w:rPr>
+              <w:t xml:space="preserve"> and </w:t>
+            </w:r>
+            <w:proofErr w:type="spellStart"/>
+            <w:r>
+              <w:rPr>
+                <w:b/>
+              </w:rPr>
+              <w:t>ElderlyOrDisabled</w:t>
+            </w:r>
+            <w:proofErr w:type="spellEnd"/>
+            <w:r>
+              <w:rPr>
+                <w:b/>
+              </w:rPr>
+              <w:t xml:space="preserve"> == “No”</w:t>
+            </w:r>
+            <w:r>
+              <w:rPr>
+                <w:b/>
+              </w:rPr>
+              <w:t xml:space="preserve"> %} (ineligible for FAP) {% endif %}</w:t>
             </w:r>
           </w:p>
         </w:tc>
@@ -2555,76 +2239,50 @@
               <w:spacing w:after="0"/>
             </w:pPr>
             <w:r>
-              <w:t xml:space="preserve">  </w:t>
-            </w:r>
-            <w:proofErr w:type="gramStart"/>
-            <w:r>
-              <w:t>3.1A  Standard</w:t>
-            </w:r>
-            <w:proofErr w:type="gramEnd"/>
+              <w:t xml:space="preserve">  3.1A  Standard </w:t>
+            </w:r>
+            <w:r>
+              <w:t>d</w:t>
+            </w:r>
+            <w:r>
+              <w:t xml:space="preserve">eduction for </w:t>
+            </w:r>
+            <w:r>
+              <w:t>h</w:t>
+            </w:r>
+            <w:r>
+              <w:t xml:space="preserve">ousehold of </w:t>
+            </w:r>
+            <w:r>
+              <w:t xml:space="preserve">{{ </w:t>
+            </w:r>
+            <w:proofErr w:type="spellStart"/>
+            <w:r>
+              <w:t>HHSize</w:t>
+            </w:r>
+            <w:r>
+              <w:t>Adjusted</w:t>
+            </w:r>
+            <w:proofErr w:type="spellEnd"/>
+            <w:r>
+              <w:t xml:space="preserve"> }}</w:t>
+            </w:r>
+          </w:p>
+        </w:tc>
+        <w:tc>
+          <w:tcPr>
+            <w:tcW w:w="4140" w:type="dxa"/>
+          </w:tcPr>
+          <w:p>
+            <w:pPr>
+              <w:spacing w:after="0"/>
+              <w:jc w:val="right"/>
+            </w:pPr>
             <w:r>
               <w:t xml:space="preserve"> </w:t>
             </w:r>
             <w:r>
-              <w:t>d</w:t>
-            </w:r>
-            <w:r>
-              <w:t xml:space="preserve">eduction for </w:t>
-            </w:r>
-            <w:r>
-              <w:t>h</w:t>
-            </w:r>
-            <w:r>
-              <w:t xml:space="preserve">ousehold of </w:t>
-            </w:r>
-            <w:proofErr w:type="gramStart"/>
-            <w:r>
-              <w:t xml:space="preserve">{{ </w:t>
-            </w:r>
-            <w:proofErr w:type="spellStart"/>
-            <w:r>
-              <w:t>HHSize</w:t>
-            </w:r>
-            <w:r>
-              <w:t>Adjusted</w:t>
-            </w:r>
-            <w:proofErr w:type="spellEnd"/>
-            <w:proofErr w:type="gramEnd"/>
-            <w:r>
-              <w:t xml:space="preserve"> }}</w:t>
-            </w:r>
-          </w:p>
-        </w:tc>
-        <w:tc>
-          <w:tcPr>
-            <w:tcW w:w="4140" w:type="dxa"/>
-          </w:tcPr>
-          <w:p>
-            <w:pPr>
-              <w:spacing w:after="0"/>
-              <w:jc w:val="right"/>
-            </w:pPr>
-            <w:r>
-              <w:t xml:space="preserve"> </w:t>
-            </w:r>
-            <w:r>
-              <w:t>$</w:t>
-            </w:r>
-            <w:proofErr w:type="gramStart"/>
-            <w:r>
-              <w:t>{{ ‘</w:t>
-            </w:r>
-            <w:proofErr w:type="gramEnd"/>
-            <w:r>
-              <w:t>{:,.0f}</w:t>
-            </w:r>
-            <w:proofErr w:type="gramStart"/>
-            <w:r>
-              <w:t>’.format</w:t>
-            </w:r>
-            <w:proofErr w:type="gramEnd"/>
-            <w:r>
-              <w:t>(</w:t>
+              <w:t>${{ ‘{:,.0f}’.format(</w:t>
             </w:r>
             <w:proofErr w:type="spellStart"/>
             <w:r>
@@ -2647,15 +2305,7 @@
               <w:spacing w:after="0"/>
             </w:pPr>
             <w:r>
-              <w:t xml:space="preserve">  </w:t>
-            </w:r>
-            <w:proofErr w:type="gramStart"/>
-            <w:r>
-              <w:t>3.1B  Earned</w:t>
-            </w:r>
-            <w:proofErr w:type="gramEnd"/>
-            <w:r>
-              <w:t xml:space="preserve"> </w:t>
+              <w:t xml:space="preserve">  3.1B  Earned </w:t>
             </w:r>
             <w:r>
               <w:t>i</w:t>
@@ -2667,18 +2317,10 @@
               <w:t>d</w:t>
             </w:r>
             <w:r>
-              <w:t xml:space="preserve">eduction (2B * </w:t>
-            </w:r>
-            <w:proofErr w:type="gramStart"/>
-            <w:r>
-              <w:t xml:space="preserve">{{ </w:t>
-            </w:r>
-            <w:r>
-              <w:t>PCT</w:t>
-            </w:r>
-            <w:proofErr w:type="gramEnd"/>
-            <w:r>
-              <w:t>_TO_EARNED_INCOME_DED</w:t>
+              <w:t xml:space="preserve">eduction (2B * {{ </w:t>
+            </w:r>
+            <w:r>
+              <w:t>PCT_TO_EARNED_INCOME_DED</w:t>
             </w:r>
             <w:r>
               <w:t xml:space="preserve"> }})</w:t>
@@ -2698,23 +2340,7 @@
               <w:t xml:space="preserve">+ </w:t>
             </w:r>
             <w:r>
-              <w:t>$</w:t>
-            </w:r>
-            <w:proofErr w:type="gramStart"/>
-            <w:r>
-              <w:t>{{ ‘</w:t>
-            </w:r>
-            <w:proofErr w:type="gramEnd"/>
-            <w:r>
-              <w:t>{:,.0f}</w:t>
-            </w:r>
-            <w:proofErr w:type="gramStart"/>
-            <w:r>
-              <w:t>’.format</w:t>
-            </w:r>
-            <w:proofErr w:type="gramEnd"/>
-            <w:r>
-              <w:t>(</w:t>
+              <w:t>${{ ‘{:,.0f}’.format(</w:t>
             </w:r>
             <w:proofErr w:type="spellStart"/>
             <w:r>
@@ -2738,27 +2364,18 @@
               <w:ind w:left="180" w:hanging="180"/>
             </w:pPr>
             <w:r>
-              <w:t xml:space="preserve">  </w:t>
-            </w:r>
-            <w:proofErr w:type="gramStart"/>
-            <w:r>
-              <w:t>3.1C  Medical</w:t>
-            </w:r>
-            <w:proofErr w:type="gramEnd"/>
+              <w:t xml:space="preserve">  3.1C  Medical </w:t>
+            </w:r>
+            <w:r>
+              <w:t>d</w:t>
+            </w:r>
+            <w:r>
+              <w:t>eduction</w:t>
+            </w:r>
             <w:r>
               <w:t xml:space="preserve"> </w:t>
             </w:r>
             <w:r>
-              <w:t>d</w:t>
-            </w:r>
-            <w:r>
-              <w:t>eduction</w:t>
-            </w:r>
-            <w:r>
-              <w:t xml:space="preserve"> </w:t>
-            </w:r>
-            <w:proofErr w:type="gramStart"/>
-            <w:r>
               <w:rPr>
                 <w:sz w:val="18"/>
               </w:rPr>
@@ -2772,7 +2389,6 @@
               <w:t>ExcessMedTag</w:t>
             </w:r>
             <w:proofErr w:type="spellEnd"/>
-            <w:proofErr w:type="gramEnd"/>
             <w:r>
               <w:rPr>
                 <w:sz w:val="18"/>
@@ -2794,23 +2410,7 @@
               <w:t xml:space="preserve">+ </w:t>
             </w:r>
             <w:r>
-              <w:t>$</w:t>
-            </w:r>
-            <w:proofErr w:type="gramStart"/>
-            <w:r>
-              <w:t>{{ ‘</w:t>
-            </w:r>
-            <w:proofErr w:type="gramEnd"/>
-            <w:r>
-              <w:t>{:,.0f}</w:t>
-            </w:r>
-            <w:proofErr w:type="gramStart"/>
-            <w:r>
-              <w:t>’.format</w:t>
-            </w:r>
-            <w:proofErr w:type="gramEnd"/>
-            <w:r>
-              <w:t>(</w:t>
+              <w:t>${{ ‘{:,.0f}’.format(</w:t>
             </w:r>
             <w:proofErr w:type="spellStart"/>
             <w:r>
@@ -2833,15 +2433,7 @@
               <w:spacing w:after="0"/>
             </w:pPr>
             <w:r>
-              <w:t xml:space="preserve">  </w:t>
-            </w:r>
-            <w:proofErr w:type="gramStart"/>
-            <w:r>
-              <w:t>3.1D  Dependent</w:t>
-            </w:r>
-            <w:proofErr w:type="gramEnd"/>
-            <w:r>
-              <w:t xml:space="preserve"> </w:t>
+              <w:t xml:space="preserve">  3.1D  Dependent </w:t>
             </w:r>
             <w:r>
               <w:t>c</w:t>
@@ -2870,23 +2462,7 @@
               <w:t xml:space="preserve">+ </w:t>
             </w:r>
             <w:r>
-              <w:t>$</w:t>
-            </w:r>
-            <w:proofErr w:type="gramStart"/>
-            <w:r>
-              <w:t>{{ ‘</w:t>
-            </w:r>
-            <w:proofErr w:type="gramEnd"/>
-            <w:r>
-              <w:t>{:,.0f}</w:t>
-            </w:r>
-            <w:proofErr w:type="gramStart"/>
-            <w:r>
-              <w:t>’.format</w:t>
-            </w:r>
-            <w:proofErr w:type="gramEnd"/>
-            <w:r>
-              <w:t>(</w:t>
+              <w:t>${{ ‘{:,.0f}’.format(</w:t>
             </w:r>
             <w:proofErr w:type="spellStart"/>
             <w:r>
@@ -2909,15 +2485,7 @@
               <w:spacing w:after="0"/>
             </w:pPr>
             <w:r>
-              <w:t xml:space="preserve">  </w:t>
-            </w:r>
-            <w:proofErr w:type="gramStart"/>
-            <w:r>
-              <w:t>3.1E  Total</w:t>
-            </w:r>
-            <w:proofErr w:type="gramEnd"/>
-            <w:r>
-              <w:t xml:space="preserve"> Income Deductions (sum of 3.1A – 3.1D)</w:t>
+              <w:t xml:space="preserve">  3.1E  Total Income Deductions (sum of 3.1A – 3.1D)</w:t>
             </w:r>
           </w:p>
         </w:tc>
@@ -2934,23 +2502,7 @@
               <w:t xml:space="preserve">= </w:t>
             </w:r>
             <w:r>
-              <w:t>$</w:t>
-            </w:r>
-            <w:proofErr w:type="gramStart"/>
-            <w:r>
-              <w:t>{{ ‘</w:t>
-            </w:r>
-            <w:proofErr w:type="gramEnd"/>
-            <w:r>
-              <w:t>{:,.0f}</w:t>
-            </w:r>
-            <w:proofErr w:type="gramStart"/>
-            <w:r>
-              <w:t>’.format</w:t>
-            </w:r>
-            <w:proofErr w:type="gramEnd"/>
-            <w:r>
-              <w:t>(</w:t>
+              <w:t>${{ ‘{:,.0f}’.format(</w:t>
             </w:r>
             <w:proofErr w:type="spellStart"/>
             <w:r>
@@ -2979,21 +2531,7 @@
               <w:rPr>
                 <w:b/>
               </w:rPr>
-              <w:t xml:space="preserve">  </w:t>
-            </w:r>
-            <w:proofErr w:type="gramStart"/>
-            <w:r>
-              <w:rPr>
-                <w:b/>
-              </w:rPr>
-              <w:t>3.1F  Adjusted</w:t>
-            </w:r>
-            <w:proofErr w:type="gramEnd"/>
-            <w:r>
-              <w:rPr>
-                <w:b/>
-              </w:rPr>
-              <w:t xml:space="preserve"> Monthly Income (2D – 3.1E)</w:t>
+              <w:t xml:space="preserve">  3.1F  Adjusted Monthly Income (2D – 3.1E)</w:t>
             </w:r>
           </w:p>
         </w:tc>
@@ -3013,35 +2551,7 @@
               <w:rPr>
                 <w:b/>
               </w:rPr>
-              <w:t>$</w:t>
-            </w:r>
-            <w:proofErr w:type="gramStart"/>
-            <w:r>
-              <w:rPr>
-                <w:b/>
-              </w:rPr>
-              <w:t>{{ ‘</w:t>
-            </w:r>
-            <w:proofErr w:type="gramEnd"/>
-            <w:r>
-              <w:rPr>
-                <w:b/>
-              </w:rPr>
-              <w:t>{:,.0f}</w:t>
-            </w:r>
-            <w:proofErr w:type="gramStart"/>
-            <w:r>
-              <w:rPr>
-                <w:b/>
-              </w:rPr>
-              <w:t>’.format</w:t>
-            </w:r>
-            <w:proofErr w:type="gramEnd"/>
-            <w:r>
-              <w:rPr>
-                <w:b/>
-              </w:rPr>
-              <w:t>(</w:t>
+              <w:t>${{ ‘{:,.0f}’.format(</w:t>
             </w:r>
             <w:proofErr w:type="spellStart"/>
             <w:r>
@@ -3133,21 +2643,13 @@
             </w:r>
             <w:proofErr w:type="spellEnd"/>
             <w:r>
-              <w:t xml:space="preserve"> == “Yes” </w:t>
-            </w:r>
-            <w:proofErr w:type="gramStart"/>
-            <w:r>
-              <w:t>%}</w:t>
+              <w:t xml:space="preserve"> == “Yes” %}</w:t>
             </w:r>
             <w:r>
               <w:t xml:space="preserve">  </w:t>
             </w:r>
             <w:r>
-              <w:t>Mortgage</w:t>
-            </w:r>
-            <w:proofErr w:type="gramEnd"/>
-            <w:r>
-              <w:t xml:space="preserve"> or rent</w:t>
+              <w:t>Mortgage or rent</w:t>
             </w:r>
           </w:p>
         </w:tc>
@@ -3161,23 +2663,7 @@
               <w:jc w:val="right"/>
             </w:pPr>
             <w:r>
-              <w:t>$</w:t>
-            </w:r>
-            <w:proofErr w:type="gramStart"/>
-            <w:r>
-              <w:t>{{ ‘</w:t>
-            </w:r>
-            <w:proofErr w:type="gramEnd"/>
-            <w:r>
-              <w:t>{:,.0f}</w:t>
-            </w:r>
-            <w:proofErr w:type="gramStart"/>
-            <w:r>
-              <w:t>’.format</w:t>
-            </w:r>
-            <w:proofErr w:type="gramEnd"/>
-            <w:r>
-              <w:t>(</w:t>
+              <w:t>${{ ‘{:,.0f}’.format(</w:t>
             </w:r>
             <w:proofErr w:type="spellStart"/>
             <w:r>
@@ -3223,39 +2709,18 @@
               <w:t xml:space="preserve">+ </w:t>
             </w:r>
             <w:r>
-              <w:t>$</w:t>
-            </w:r>
-            <w:proofErr w:type="gramStart"/>
-            <w:r>
-              <w:t>{{ ‘</w:t>
-            </w:r>
-            <w:proofErr w:type="gramEnd"/>
-            <w:r>
-              <w:t>{:,.0f}</w:t>
-            </w:r>
-            <w:proofErr w:type="gramStart"/>
-            <w:r>
-              <w:t>’.format</w:t>
-            </w:r>
-            <w:proofErr w:type="gramEnd"/>
-            <w:r>
-              <w:t>(</w:t>
+              <w:t>${{ ‘{:,.0f}’.format(</w:t>
             </w:r>
             <w:proofErr w:type="spellStart"/>
             <w:r>
               <w:t>HomeownerDed</w:t>
             </w:r>
             <w:proofErr w:type="spellEnd"/>
-            <w:proofErr w:type="gramStart"/>
             <w:r>
               <w:t>) }}</w:t>
             </w:r>
             <w:r>
-              <w:t>{</w:t>
-            </w:r>
-            <w:proofErr w:type="gramEnd"/>
-            <w:r>
-              <w:t xml:space="preserve">% if </w:t>
+              <w:t xml:space="preserve">{% if </w:t>
             </w:r>
             <w:proofErr w:type="spellStart"/>
             <w:r>
@@ -3295,37 +2760,16 @@
               <w:t xml:space="preserve">+ </w:t>
             </w:r>
             <w:r>
-              <w:t>$</w:t>
-            </w:r>
-            <w:proofErr w:type="gramStart"/>
-            <w:r>
-              <w:t>{{ ‘</w:t>
-            </w:r>
-            <w:proofErr w:type="gramEnd"/>
-            <w:r>
-              <w:t>{:,.0f}</w:t>
-            </w:r>
-            <w:proofErr w:type="gramStart"/>
-            <w:r>
-              <w:t>’.format</w:t>
-            </w:r>
-            <w:proofErr w:type="gramEnd"/>
-            <w:r>
-              <w:t>(</w:t>
+              <w:t>${{ ‘{:,.0f}’.format(</w:t>
             </w:r>
             <w:r>
               <w:t>SHELTER_HEAT_UTILITY</w:t>
             </w:r>
-            <w:proofErr w:type="gramStart"/>
             <w:r>
               <w:t>) }}</w:t>
             </w:r>
             <w:r>
-              <w:t>{</w:t>
-            </w:r>
-            <w:proofErr w:type="gramEnd"/>
-            <w:r>
-              <w:t>% endif %}</w:t>
+              <w:t>{% endif %}</w:t>
             </w:r>
           </w:p>
         </w:tc>
@@ -3367,7 +2811,6 @@
             <w:r>
               <w:tab/>
             </w:r>
-            <w:proofErr w:type="gramStart"/>
             <w:r>
               <w:rPr>
                 <w:sz w:val="20"/>
@@ -3382,7 +2825,6 @@
               <w:t>utilityList</w:t>
             </w:r>
             <w:proofErr w:type="spellEnd"/>
-            <w:proofErr w:type="gramEnd"/>
             <w:r>
               <w:rPr>
                 <w:sz w:val="20"/>
@@ -3404,18 +2846,13 @@
               </w:rPr>
             </w:pPr>
             <w:r>
-              <w:t>$</w:t>
-            </w:r>
-            <w:proofErr w:type="gramStart"/>
-            <w:r>
-              <w:t xml:space="preserve">{{ </w:t>
+              <w:t xml:space="preserve">${{ </w:t>
             </w:r>
             <w:proofErr w:type="spellStart"/>
             <w:r>
               <w:t>StdUtilAllowance</w:t>
             </w:r>
             <w:proofErr w:type="spellEnd"/>
-            <w:proofErr w:type="gramEnd"/>
             <w:r>
               <w:t xml:space="preserve"> }}</w:t>
             </w:r>
@@ -3438,27 +2875,13 @@
               <w:rPr>
                 <w:b/>
               </w:rPr>
-              <w:t xml:space="preserve">{% endif </w:t>
-            </w:r>
-            <w:proofErr w:type="gramStart"/>
-            <w:r>
-              <w:rPr>
-                <w:b/>
-              </w:rPr>
-              <w:t xml:space="preserve">%}  </w:t>
-            </w:r>
-            <w:r>
-              <w:rPr>
-                <w:b/>
-              </w:rPr>
-              <w:t>3.2A</w:t>
-            </w:r>
-            <w:proofErr w:type="gramEnd"/>
-            <w:r>
-              <w:rPr>
-                <w:b/>
-              </w:rPr>
-              <w:t xml:space="preserve">  </w:t>
+              <w:t xml:space="preserve">{% endif %}  </w:t>
+            </w:r>
+            <w:r>
+              <w:rPr>
+                <w:b/>
+              </w:rPr>
+              <w:t xml:space="preserve">3.2A  </w:t>
             </w:r>
             <w:r>
               <w:rPr>
@@ -3484,35 +2907,7 @@
               <w:rPr>
                 <w:b/>
               </w:rPr>
-              <w:t>$</w:t>
-            </w:r>
-            <w:proofErr w:type="gramStart"/>
-            <w:r>
-              <w:rPr>
-                <w:b/>
-              </w:rPr>
-              <w:t>{{ ‘</w:t>
-            </w:r>
-            <w:proofErr w:type="gramEnd"/>
-            <w:r>
-              <w:rPr>
-                <w:b/>
-              </w:rPr>
-              <w:t>{:,.0f}</w:t>
-            </w:r>
-            <w:proofErr w:type="gramStart"/>
-            <w:r>
-              <w:rPr>
-                <w:b/>
-              </w:rPr>
-              <w:t>’.format</w:t>
-            </w:r>
-            <w:proofErr w:type="gramEnd"/>
-            <w:r>
-              <w:rPr>
-                <w:b/>
-              </w:rPr>
-              <w:t>(</w:t>
+              <w:t>${{ ‘{:,.0f}’.format(</w:t>
             </w:r>
             <w:proofErr w:type="spellStart"/>
             <w:r>
@@ -3555,23 +2950,7 @@
               <w:jc w:val="right"/>
             </w:pPr>
             <w:r>
-              <w:t>$</w:t>
-            </w:r>
-            <w:proofErr w:type="gramStart"/>
-            <w:r>
-              <w:t>{{ ‘</w:t>
-            </w:r>
-            <w:proofErr w:type="gramEnd"/>
-            <w:r>
-              <w:t>{:,.0f}</w:t>
-            </w:r>
-            <w:proofErr w:type="gramStart"/>
-            <w:r>
-              <w:t>’.format</w:t>
-            </w:r>
-            <w:proofErr w:type="gramEnd"/>
-            <w:r>
-              <w:t>(</w:t>
+              <w:t>${{ ‘{:,.0f}’.format(</w:t>
             </w:r>
             <w:proofErr w:type="spellStart"/>
             <w:r>
@@ -3617,23 +2996,7 @@
               <w:jc w:val="right"/>
             </w:pPr>
             <w:r>
-              <w:t>$</w:t>
-            </w:r>
-            <w:proofErr w:type="gramStart"/>
-            <w:r>
-              <w:t>{{ ‘</w:t>
-            </w:r>
-            <w:proofErr w:type="gramEnd"/>
-            <w:r>
-              <w:t>{:,.0f}</w:t>
-            </w:r>
-            <w:proofErr w:type="gramStart"/>
-            <w:r>
-              <w:t>’.format</w:t>
-            </w:r>
-            <w:proofErr w:type="gramEnd"/>
-            <w:r>
-              <w:t>(</w:t>
+              <w:t>${{ ‘{:,.0f}’.format(</w:t>
             </w:r>
             <w:proofErr w:type="spellStart"/>
             <w:r>
@@ -3656,15 +3019,7 @@
               <w:spacing w:after="0"/>
             </w:pPr>
             <w:r>
-              <w:t xml:space="preserve">  Shelter deduction </w:t>
-            </w:r>
-            <w:proofErr w:type="gramStart"/>
-            <w:r>
-              <w:t>in excess of</w:t>
-            </w:r>
-            <w:proofErr w:type="gramEnd"/>
-            <w:r>
-              <w:t xml:space="preserve"> 50% of adjusted income</w:t>
+              <w:t xml:space="preserve">  Shelter deduction in excess of 50% of adjusted income</w:t>
             </w:r>
           </w:p>
         </w:tc>
@@ -3678,23 +3033,7 @@
               <w:jc w:val="right"/>
             </w:pPr>
             <w:r>
-              <w:t>$</w:t>
-            </w:r>
-            <w:proofErr w:type="gramStart"/>
-            <w:r>
-              <w:t>{{ ‘</w:t>
-            </w:r>
-            <w:proofErr w:type="gramEnd"/>
-            <w:r>
-              <w:t>{:,.0f}</w:t>
-            </w:r>
-            <w:proofErr w:type="gramStart"/>
-            <w:r>
-              <w:t>’.format</w:t>
-            </w:r>
-            <w:proofErr w:type="gramEnd"/>
-            <w:r>
-              <w:t>(</w:t>
+              <w:t>${{ ‘{:,.0f}’.format(</w:t>
             </w:r>
             <w:proofErr w:type="spellStart"/>
             <w:r>
@@ -3717,6 +3056,7 @@
               <w:spacing w:after="0"/>
             </w:pPr>
             <w:r>
+              <w:lastRenderedPageBreak/>
               <w:t xml:space="preserve">  Deduction cap (not applicable to elderly / disabled households)</w:t>
             </w:r>
           </w:p>
@@ -3731,23 +3071,7 @@
               <w:jc w:val="right"/>
             </w:pPr>
             <w:r>
-              <w:t>$</w:t>
-            </w:r>
-            <w:proofErr w:type="gramStart"/>
-            <w:r>
-              <w:t>{{ ‘</w:t>
-            </w:r>
-            <w:proofErr w:type="gramEnd"/>
-            <w:r>
-              <w:t>{:,.0f}</w:t>
-            </w:r>
-            <w:proofErr w:type="gramStart"/>
-            <w:r>
-              <w:t>’.format</w:t>
-            </w:r>
-            <w:proofErr w:type="gramEnd"/>
-            <w:r>
-              <w:t>(</w:t>
+              <w:t>${{ ‘{:,.0f}’.format(</w:t>
             </w:r>
             <w:proofErr w:type="spellStart"/>
             <w:r>
@@ -3776,10 +3100,8 @@
               <w:rPr>
                 <w:b/>
               </w:rPr>
-              <w:lastRenderedPageBreak/>
               <w:t xml:space="preserve">  </w:t>
             </w:r>
-            <w:proofErr w:type="gramStart"/>
             <w:r>
               <w:rPr>
                 <w:b/>
@@ -3790,14 +3112,7 @@
               <w:rPr>
                 <w:b/>
               </w:rPr>
-              <w:t>Actual</w:t>
-            </w:r>
-            <w:proofErr w:type="gramEnd"/>
-            <w:r>
-              <w:rPr>
-                <w:b/>
-              </w:rPr>
-              <w:t xml:space="preserve"> shelter deduction</w:t>
+              <w:t>Actual shelter deduction</w:t>
             </w:r>
           </w:p>
         </w:tc>
@@ -3817,35 +3132,7 @@
               <w:rPr>
                 <w:b/>
               </w:rPr>
-              <w:t>$</w:t>
-            </w:r>
-            <w:proofErr w:type="gramStart"/>
-            <w:r>
-              <w:rPr>
-                <w:b/>
-              </w:rPr>
-              <w:t>{{ ‘</w:t>
-            </w:r>
-            <w:proofErr w:type="gramEnd"/>
-            <w:r>
-              <w:rPr>
-                <w:b/>
-              </w:rPr>
-              <w:t>{:,.0f}</w:t>
-            </w:r>
-            <w:proofErr w:type="gramStart"/>
-            <w:r>
-              <w:rPr>
-                <w:b/>
-              </w:rPr>
-              <w:t>’.format</w:t>
-            </w:r>
-            <w:proofErr w:type="gramEnd"/>
-            <w:r>
-              <w:rPr>
-                <w:b/>
-              </w:rPr>
-              <w:t>(</w:t>
+              <w:t>${{ ‘{:,.0f}’.format(</w:t>
             </w:r>
             <w:proofErr w:type="spellStart"/>
             <w:r>
@@ -3855,19 +3142,11 @@
               <w:t>ShelterDedResult</w:t>
             </w:r>
             <w:proofErr w:type="spellEnd"/>
-            <w:proofErr w:type="gramStart"/>
-            <w:r>
-              <w:rPr>
-                <w:b/>
-              </w:rPr>
-              <w:t>) }}{</w:t>
-            </w:r>
-            <w:proofErr w:type="gramEnd"/>
-            <w:r>
-              <w:rPr>
-                <w:b/>
-              </w:rPr>
-              <w:t xml:space="preserve">% if </w:t>
+            <w:r>
+              <w:rPr>
+                <w:b/>
+              </w:rPr>
+              <w:t xml:space="preserve">) }}{% if </w:t>
             </w:r>
             <w:proofErr w:type="spellStart"/>
             <w:r>
@@ -3910,39 +3189,26 @@
               <w:jc w:val="right"/>
             </w:pPr>
             <w:r>
-              <w:t>$</w:t>
-            </w:r>
-            <w:proofErr w:type="gramStart"/>
-            <w:r>
-              <w:t>{{ ‘</w:t>
-            </w:r>
-            <w:proofErr w:type="gramEnd"/>
-            <w:r>
-              <w:t>{:,.0f}</w:t>
-            </w:r>
-            <w:proofErr w:type="gramStart"/>
-            <w:r>
-              <w:t>’.format</w:t>
-            </w:r>
-            <w:proofErr w:type="gramEnd"/>
-            <w:r>
-              <w:t>(</w:t>
+              <w:t>${{ ‘{:,.0f}’.format(</w:t>
             </w:r>
             <w:proofErr w:type="spellStart"/>
             <w:r>
               <w:t>HomelessDed</w:t>
             </w:r>
             <w:proofErr w:type="spellEnd"/>
-            <w:proofErr w:type="gramStart"/>
             <w:r>
               <w:t>) }}</w:t>
             </w:r>
             <w:r>
-              <w:t>{</w:t>
-            </w:r>
-            <w:proofErr w:type="gramEnd"/>
-            <w:r>
-              <w:t>% endif %}</w:t>
+              <w:t xml:space="preserve">{% </w:t>
+            </w:r>
+            <w:proofErr w:type="spellStart"/>
+            <w:r>
+              <w:t>endif</w:t>
+            </w:r>
+            <w:proofErr w:type="spellEnd"/>
+            <w:r>
+              <w:t xml:space="preserve"> %}</w:t>
             </w:r>
           </w:p>
         </w:tc>
@@ -3963,7 +3229,6 @@
             <w:r>
               <w:t xml:space="preserve"> </w:t>
             </w:r>
-            <w:proofErr w:type="gramStart"/>
             <w:r>
               <w:rPr>
                 <w:b/>
@@ -3974,21 +3239,7 @@
               <w:rPr>
                 <w:b/>
               </w:rPr>
-              <w:t>Total</w:t>
-            </w:r>
-            <w:proofErr w:type="gramEnd"/>
-            <w:r>
-              <w:rPr>
-                <w:b/>
-              </w:rPr>
-              <w:t xml:space="preserve"> Shelter </w:t>
-            </w:r>
-            <w:proofErr w:type="gramStart"/>
-            <w:r>
-              <w:rPr>
-                <w:b/>
-              </w:rPr>
-              <w:t>Deduction</w:t>
+              <w:t>Total Shelter Deduction</w:t>
             </w:r>
             <w:r>
               <w:t xml:space="preserve">  </w:t>
@@ -3997,14 +3248,7 @@
               <w:rPr>
                 <w:sz w:val="18"/>
               </w:rPr>
-              <w:t>{{ ShelterNote</w:t>
-            </w:r>
-            <w:proofErr w:type="gramEnd"/>
-            <w:r>
-              <w:rPr>
-                <w:sz w:val="18"/>
-              </w:rPr>
-              <w:t xml:space="preserve"> }}</w:t>
+              <w:t>{{ ShelterNote }}</w:t>
             </w:r>
           </w:p>
         </w:tc>
@@ -4021,41 +3265,13 @@
               <w:rPr>
                 <w:b/>
               </w:rPr>
-              <w:t>$</w:t>
-            </w:r>
-            <w:proofErr w:type="gramStart"/>
-            <w:r>
-              <w:rPr>
-                <w:b/>
-              </w:rPr>
-              <w:t>{{ ‘</w:t>
-            </w:r>
-            <w:proofErr w:type="gramEnd"/>
-            <w:r>
-              <w:rPr>
-                <w:b/>
-              </w:rPr>
-              <w:t>{:,.0</w:t>
-            </w:r>
-            <w:r>
-              <w:rPr>
-                <w:b/>
-              </w:rPr>
-              <w:t>f}</w:t>
-            </w:r>
-            <w:proofErr w:type="gramStart"/>
-            <w:r>
-              <w:rPr>
-                <w:b/>
-              </w:rPr>
-              <w:t>’.format</w:t>
-            </w:r>
-            <w:proofErr w:type="gramEnd"/>
-            <w:r>
-              <w:rPr>
-                <w:b/>
-              </w:rPr>
-              <w:t>(</w:t>
+              <w:t>${{ ‘{:,.0</w:t>
+            </w:r>
+            <w:r>
+              <w:rPr>
+                <w:b/>
+              </w:rPr>
+              <w:t>f}’.format(</w:t>
             </w:r>
             <w:proofErr w:type="spellStart"/>
             <w:r>
@@ -4140,27 +3356,123 @@
               <w:spacing w:after="0"/>
             </w:pPr>
             <w:r>
+              <w:t xml:space="preserve">  3.3A  Net Income (3.1F – </w:t>
+            </w:r>
+            <w:r>
+              <w:t>3.2C</w:t>
+            </w:r>
+            <w:r>
+              <w:t>)</w:t>
+            </w:r>
+          </w:p>
+        </w:tc>
+        <w:tc>
+          <w:tcPr>
+            <w:tcW w:w="4140" w:type="dxa"/>
+          </w:tcPr>
+          <w:p>
+            <w:pPr>
+              <w:spacing w:after="0"/>
+              <w:jc w:val="right"/>
+            </w:pPr>
+            <w:r>
+              <w:t>${{ ‘{:,.0f}’.format(</w:t>
+            </w:r>
+            <w:proofErr w:type="spellStart"/>
+            <w:r>
+              <w:t>MonthlyNIC</w:t>
+            </w:r>
+            <w:proofErr w:type="spellEnd"/>
+            <w:r>
+              <w:t>) }}</w:t>
+            </w:r>
+            <w:r>
+              <w:t xml:space="preserve">{% if </w:t>
+            </w:r>
+            <w:proofErr w:type="spellStart"/>
+            <w:r>
+              <w:t>ApplyNetIncomeTest</w:t>
+            </w:r>
+            <w:proofErr w:type="spellEnd"/>
+            <w:r>
+              <w:t xml:space="preserve"> == “Yes” %}</w:t>
+            </w:r>
+          </w:p>
+        </w:tc>
+      </w:tr>
+      <w:tr>
+        <w:tc>
+          <w:tcPr>
+            <w:tcW w:w="6138" w:type="dxa"/>
+          </w:tcPr>
+          <w:p>
+            <w:pPr>
+              <w:spacing w:after="0"/>
+            </w:pPr>
+            <w:r>
+              <w:t xml:space="preserve">  Net Income Limit</w:t>
+            </w:r>
+          </w:p>
+        </w:tc>
+        <w:tc>
+          <w:tcPr>
+            <w:tcW w:w="4140" w:type="dxa"/>
+          </w:tcPr>
+          <w:p>
+            <w:pPr>
+              <w:spacing w:after="0"/>
+              <w:jc w:val="right"/>
+            </w:pPr>
+            <w:bookmarkStart w:id="0" w:name="_GoBack"/>
+            <w:r>
+              <w:t xml:space="preserve">{{ </w:t>
+            </w:r>
+            <w:proofErr w:type="spellStart"/>
+            <w:r>
+              <w:t>MaxTotMonthlyNICLabel</w:t>
+            </w:r>
+            <w:proofErr w:type="spellEnd"/>
+            <w:r>
+              <w:t xml:space="preserve"> }}</w:t>
+            </w:r>
+            <w:bookmarkEnd w:id="0"/>
+          </w:p>
+        </w:tc>
+      </w:tr>
+      <w:tr>
+        <w:tc>
+          <w:tcPr>
+            <w:tcW w:w="6138" w:type="dxa"/>
+            <w:shd w:val="clear" w:color="auto" w:fill="DBE5F1" w:themeFill="accent1" w:themeFillTint="33"/>
+          </w:tcPr>
+          <w:p>
+            <w:pPr>
+              <w:spacing w:after="0"/>
+            </w:pPr>
+            <w:r>
+              <w:rPr>
+                <w:b/>
+              </w:rPr>
               <w:t xml:space="preserve">  </w:t>
             </w:r>
-            <w:proofErr w:type="gramStart"/>
-            <w:r>
-              <w:t>3.3A  Net</w:t>
-            </w:r>
-            <w:proofErr w:type="gramEnd"/>
-            <w:r>
-              <w:t xml:space="preserve"> Income (3.1F – </w:t>
-            </w:r>
-            <w:r>
-              <w:t>3.2C</w:t>
-            </w:r>
-            <w:r>
-              <w:t>)</w:t>
+            <w:r>
+              <w:rPr>
+                <w:b/>
+              </w:rPr>
+              <w:t xml:space="preserve">Net </w:t>
+            </w:r>
+            <w:r>
+              <w:rPr>
+                <w:b/>
+              </w:rPr>
+              <w:t>Income Test result</w:t>
             </w:r>
           </w:p>
         </w:tc>
         <w:tc>
           <w:tcPr>
             <w:tcW w:w="4140" w:type="dxa"/>
+            <w:shd w:val="clear" w:color="auto" w:fill="DBE5F1" w:themeFill="accent1" w:themeFillTint="33"/>
           </w:tcPr>
           <w:p>
             <w:pPr>
@@ -4168,31 +3480,90 @@
               <w:jc w:val="right"/>
             </w:pPr>
             <w:r>
-              <w:t>$</w:t>
-            </w:r>
-            <w:proofErr w:type="gramStart"/>
-            <w:r>
-              <w:t>{{ ‘</w:t>
-            </w:r>
-            <w:proofErr w:type="gramEnd"/>
-            <w:r>
-              <w:t>{:,.0f}</w:t>
-            </w:r>
-            <w:proofErr w:type="gramStart"/>
-            <w:r>
-              <w:t>’.format</w:t>
-            </w:r>
-            <w:proofErr w:type="gramEnd"/>
-            <w:r>
-              <w:t>(</w:t>
-            </w:r>
-            <w:proofErr w:type="spellStart"/>
-            <w:r>
-              <w:t>MonthlyNIC</w:t>
-            </w:r>
-            <w:proofErr w:type="spellEnd"/>
-            <w:r>
-              <w:t>) }}</w:t>
+              <w:rPr>
+                <w:b/>
+              </w:rPr>
+              <w:t xml:space="preserve">{{ </w:t>
+            </w:r>
+            <w:proofErr w:type="spellStart"/>
+            <w:r>
+              <w:rPr>
+                <w:b/>
+              </w:rPr>
+              <w:t>NICTest</w:t>
+            </w:r>
+            <w:r>
+              <w:rPr>
+                <w:b/>
+              </w:rPr>
+              <w:t>Result</w:t>
+            </w:r>
+            <w:proofErr w:type="spellEnd"/>
+            <w:r>
+              <w:rPr>
+                <w:b/>
+              </w:rPr>
+              <w:t xml:space="preserve"> }}</w:t>
+            </w:r>
+            <w:r>
+              <w:rPr>
+                <w:b/>
+              </w:rPr>
+              <w:t xml:space="preserve"> {% if </w:t>
+            </w:r>
+            <w:proofErr w:type="spellStart"/>
+            <w:r>
+              <w:rPr>
+                <w:b/>
+              </w:rPr>
+              <w:t>NICTest</w:t>
+            </w:r>
+            <w:r>
+              <w:rPr>
+                <w:b/>
+              </w:rPr>
+              <w:t>Result</w:t>
+            </w:r>
+            <w:proofErr w:type="spellEnd"/>
+            <w:r>
+              <w:rPr>
+                <w:b/>
+              </w:rPr>
+              <w:t xml:space="preserve"> == “FAILED” %} (ineligible for FAP) {% </w:t>
+            </w:r>
+            <w:proofErr w:type="spellStart"/>
+            <w:r>
+              <w:rPr>
+                <w:b/>
+              </w:rPr>
+              <w:t>endif</w:t>
+            </w:r>
+            <w:proofErr w:type="spellEnd"/>
+            <w:r>
+              <w:rPr>
+                <w:b/>
+              </w:rPr>
+              <w:t xml:space="preserve"> %}</w:t>
+            </w:r>
+            <w:r>
+              <w:rPr>
+                <w:b/>
+              </w:rPr>
+              <w:t xml:space="preserve">{% </w:t>
+            </w:r>
+            <w:proofErr w:type="spellStart"/>
+            <w:r>
+              <w:rPr>
+                <w:b/>
+              </w:rPr>
+              <w:t>endif</w:t>
+            </w:r>
+            <w:proofErr w:type="spellEnd"/>
+            <w:r>
+              <w:rPr>
+                <w:b/>
+              </w:rPr>
+              <w:t xml:space="preserve"> %}</w:t>
             </w:r>
           </w:p>
         </w:tc>
@@ -4245,20 +3616,11 @@
             <w:pPr>
               <w:spacing w:after="0" w:line="240" w:lineRule="auto"/>
             </w:pPr>
-            <w:proofErr w:type="gramStart"/>
-            <w:r>
-              <w:t>Maximum</w:t>
-            </w:r>
-            <w:proofErr w:type="gramEnd"/>
-            <w:r>
-              <w:t xml:space="preserve"> allot for household size o</w:t>
-            </w:r>
-            <w:r>
-              <w:t xml:space="preserve">f </w:t>
-            </w:r>
-            <w:proofErr w:type="gramStart"/>
-            <w:r>
-              <w:t xml:space="preserve">{{ </w:t>
+            <w:r>
+              <w:t>Maximum allot for household size o</w:t>
+            </w:r>
+            <w:r>
+              <w:t xml:space="preserve">f {{ </w:t>
             </w:r>
             <w:proofErr w:type="spellStart"/>
             <w:r>
@@ -4268,7 +3630,6 @@
               <w:t>Adjusted</w:t>
             </w:r>
             <w:proofErr w:type="spellEnd"/>
-            <w:proofErr w:type="gramEnd"/>
             <w:r>
               <w:t xml:space="preserve"> }}</w:t>
             </w:r>
@@ -4284,23 +3645,7 @@
               <w:jc w:val="right"/>
             </w:pPr>
             <w:r>
-              <w:t>$</w:t>
-            </w:r>
-            <w:proofErr w:type="gramStart"/>
-            <w:r>
-              <w:t>{{ ‘</w:t>
-            </w:r>
-            <w:proofErr w:type="gramEnd"/>
-            <w:r>
-              <w:t>{:,.0f}</w:t>
-            </w:r>
-            <w:proofErr w:type="gramStart"/>
-            <w:r>
-              <w:t>’.format</w:t>
-            </w:r>
-            <w:proofErr w:type="gramEnd"/>
-            <w:r>
-              <w:t>(</w:t>
+              <w:t>${{ ‘{:,.0f}’.format(</w:t>
             </w:r>
             <w:proofErr w:type="spellStart"/>
             <w:r>
@@ -4341,18 +3686,10 @@
               <w:t>3.3A</w:t>
             </w:r>
             <w:r>
-              <w:t xml:space="preserve"> x </w:t>
-            </w:r>
-            <w:proofErr w:type="gramStart"/>
-            <w:r>
-              <w:t xml:space="preserve">{{ </w:t>
-            </w:r>
-            <w:r>
-              <w:t>NET</w:t>
-            </w:r>
-            <w:proofErr w:type="gramEnd"/>
-            <w:r>
-              <w:t>_INCOME_PCT</w:t>
+              <w:t xml:space="preserve"> x {{ </w:t>
+            </w:r>
+            <w:r>
+              <w:t>NET_INCOME_PCT</w:t>
             </w:r>
             <w:r>
               <w:t xml:space="preserve"> }})</w:t>
@@ -4372,23 +3709,7 @@
               <w:t xml:space="preserve">- </w:t>
             </w:r>
             <w:r>
-              <w:t>$</w:t>
-            </w:r>
-            <w:proofErr w:type="gramStart"/>
-            <w:r>
-              <w:t>{{ ‘</w:t>
-            </w:r>
-            <w:proofErr w:type="gramEnd"/>
-            <w:r>
-              <w:t>{:,.0f}</w:t>
-            </w:r>
-            <w:proofErr w:type="gramStart"/>
-            <w:r>
-              <w:t>’.format</w:t>
-            </w:r>
-            <w:proofErr w:type="gramEnd"/>
-            <w:r>
-              <w:t>(</w:t>
+              <w:t>${{ ‘{:,.0f}’.format(</w:t>
             </w:r>
             <w:proofErr w:type="spellStart"/>
             <w:r>
@@ -4412,48 +3733,34 @@
               <w:spacing w:before="40" w:after="40" w:line="240" w:lineRule="auto"/>
               <w:rPr>
                 <w:b/>
-                <w:sz w:val="24"/>
-              </w:rPr>
-            </w:pPr>
-            <w:r>
-              <w:rPr>
-                <w:b/>
-                <w:sz w:val="24"/>
+              </w:rPr>
+            </w:pPr>
+            <w:r>
+              <w:rPr>
+                <w:b/>
               </w:rPr>
               <w:t>Approximate allotment</w:t>
             </w:r>
             <w:r>
               <w:rPr>
                 <w:b/>
-                <w:sz w:val="24"/>
-              </w:rPr>
+              </w:rPr>
+              <w:t xml:space="preserve"> {{</w:t>
+            </w:r>
+            <w:r>
               <w:t xml:space="preserve"> </w:t>
             </w:r>
-            <w:proofErr w:type="gramStart"/>
-            <w:r>
-              <w:rPr>
-                <w:b/>
-                <w:sz w:val="24"/>
-              </w:rPr>
-              <w:t>{{</w:t>
-            </w:r>
-            <w:r>
-              <w:t xml:space="preserve"> </w:t>
-            </w:r>
-            <w:proofErr w:type="spellStart"/>
-            <w:r>
-              <w:rPr>
-                <w:b/>
-                <w:sz w:val="24"/>
+            <w:proofErr w:type="spellStart"/>
+            <w:r>
+              <w:rPr>
+                <w:b/>
               </w:rPr>
               <w:t>MinimumGrantTag</w:t>
             </w:r>
             <w:proofErr w:type="spellEnd"/>
-            <w:proofErr w:type="gramEnd"/>
-            <w:r>
-              <w:rPr>
-                <w:b/>
-                <w:sz w:val="24"/>
+            <w:r>
+              <w:rPr>
+                <w:b/>
               </w:rPr>
               <w:t xml:space="preserve"> }}</w:t>
             </w:r>
@@ -4470,53 +3777,18 @@
               <w:jc w:val="right"/>
               <w:rPr>
                 <w:b/>
-                <w:sz w:val="24"/>
-              </w:rPr>
-            </w:pPr>
-            <w:r>
-              <w:rPr>
-                <w:b/>
-                <w:sz w:val="24"/>
-              </w:rPr>
-              <w:t>$</w:t>
-            </w:r>
-            <w:proofErr w:type="gramStart"/>
-            <w:r>
-              <w:rPr>
-                <w:b/>
-                <w:sz w:val="24"/>
-              </w:rPr>
-              <w:t>{{ ‘</w:t>
-            </w:r>
-            <w:proofErr w:type="gramEnd"/>
-            <w:r>
-              <w:rPr>
-                <w:b/>
-                <w:sz w:val="24"/>
-              </w:rPr>
-              <w:t>{:,.0f}</w:t>
-            </w:r>
-            <w:proofErr w:type="gramStart"/>
-            <w:r>
-              <w:rPr>
-                <w:b/>
-                <w:sz w:val="24"/>
-              </w:rPr>
-              <w:t>’.format</w:t>
-            </w:r>
-            <w:proofErr w:type="gramEnd"/>
-            <w:r>
-              <w:rPr>
-                <w:b/>
-                <w:sz w:val="24"/>
-              </w:rPr>
-              <w:t>(</w:t>
-            </w:r>
-            <w:proofErr w:type="spellStart"/>
-            <w:r>
-              <w:rPr>
-                <w:b/>
-                <w:sz w:val="24"/>
+              </w:rPr>
+            </w:pPr>
+            <w:r>
+              <w:rPr>
+                <w:b/>
+              </w:rPr>
+              <w:t>${{ ‘{:,.0f}’.format(</w:t>
+            </w:r>
+            <w:proofErr w:type="spellStart"/>
+            <w:r>
+              <w:rPr>
+                <w:b/>
               </w:rPr>
               <w:t>FinalResult</w:t>
             </w:r>
@@ -4524,7 +3796,6 @@
             <w:r>
               <w:rPr>
                 <w:b/>
-                <w:sz w:val="24"/>
               </w:rPr>
               <w:t>) }}</w:t>
             </w:r>
@@ -4539,6 +3810,7 @@
       <w:r>
         <w:rPr>
           <w:noProof/>
+          <w:lang w:eastAsia="en-US"/>
         </w:rPr>
         <w:lastRenderedPageBreak/>
         <w:drawing>
@@ -4548,7 +3820,7 @@
             <wp:docPr id="1623593727" name="Picture 1">
               <a:extLst xmlns:a="http://schemas.openxmlformats.org/drawingml/2006/main">
                 <a:ext uri="{C183D7F6-B498-43B3-948B-1728B52AA6E4}">
-                  <adec:decorative xmlns:adec="http://schemas.microsoft.com/office/drawing/2017/decorative" val="1"/>
+                  <adec:decorative xmlns:adec="http://schemas.microsoft.com/office/drawing/2017/decorative" xmlns:w16sdtfl="http://schemas.microsoft.com/office/word/2024/wordml/sdtformatlock" xmlns:w16sdtdh="http://schemas.microsoft.com/office/word/2020/wordml/sdtdatahash" xmlns:w16du="http://schemas.microsoft.com/office/word/2023/wordml/word16du" xmlns:w16="http://schemas.microsoft.com/office/word/2018/wordml" xmlns:w16cid="http://schemas.microsoft.com/office/word/2016/wordml/cid" xmlns:w16cex="http://schemas.microsoft.com/office/word/2018/wordml/cex" xmlns:w="http://schemas.openxmlformats.org/wordprocessingml/2006/main" xmlns:w10="urn:schemas-microsoft-com:office:word" xmlns:v="urn:schemas-microsoft-com:vml" xmlns:oel="http://schemas.microsoft.com/office/2019/extlst" xmlns:o="urn:schemas-microsoft-com:office:office" xmlns:am3d="http://schemas.microsoft.com/office/drawing/2017/model3d" xmlns:aink="http://schemas.microsoft.com/office/drawing/2016/ink" xmlns:cx8="http://schemas.microsoft.com/office/drawing/2016/5/14/chartex" xmlns:cx7="http://schemas.microsoft.com/office/drawing/2016/5/13/chartex" xmlns:cx6="http://schemas.microsoft.com/office/drawing/2016/5/12/chartex" xmlns:cx5="http://schemas.microsoft.com/office/drawing/2016/5/11/chartex" xmlns:cx4="http://schemas.microsoft.com/office/drawing/2016/5/10/chartex" xmlns:cx3="http://schemas.microsoft.com/office/drawing/2016/5/9/chartex" xmlns:cx2="http://schemas.microsoft.com/office/drawing/2015/10/21/chartex" xmlns:cx1="http://schemas.microsoft.com/office/drawing/2015/9/8/chartex" xmlns="" val="1"/>
                 </a:ext>
               </a:extLst>
             </wp:docPr>
@@ -4562,7 +3834,7 @@
                     <pic:cNvPr id="1623593727" name="Picture 1">
                       <a:extLst>
                         <a:ext uri="{C183D7F6-B498-43B3-948B-1728B52AA6E4}">
-                          <adec:decorative xmlns:adec="http://schemas.microsoft.com/office/drawing/2017/decorative" val="1"/>
+                          <adec:decorative xmlns:adec="http://schemas.microsoft.com/office/drawing/2017/decorative" xmlns:w16sdtfl="http://schemas.microsoft.com/office/word/2024/wordml/sdtformatlock" xmlns:w16sdtdh="http://schemas.microsoft.com/office/word/2020/wordml/sdtdatahash" xmlns:w16du="http://schemas.microsoft.com/office/word/2023/wordml/word16du" xmlns:w16="http://schemas.microsoft.com/office/word/2018/wordml" xmlns:w16cid="http://schemas.microsoft.com/office/word/2016/wordml/cid" xmlns:w16cex="http://schemas.microsoft.com/office/word/2018/wordml/cex" xmlns:w="http://schemas.openxmlformats.org/wordprocessingml/2006/main" xmlns:w10="urn:schemas-microsoft-com:office:word" xmlns:v="urn:schemas-microsoft-com:vml" xmlns:oel="http://schemas.microsoft.com/office/2019/extlst" xmlns:o="urn:schemas-microsoft-com:office:office" xmlns:am3d="http://schemas.microsoft.com/office/drawing/2017/model3d" xmlns:aink="http://schemas.microsoft.com/office/drawing/2016/ink" xmlns:cx8="http://schemas.microsoft.com/office/drawing/2016/5/14/chartex" xmlns:cx7="http://schemas.microsoft.com/office/drawing/2016/5/13/chartex" xmlns:cx6="http://schemas.microsoft.com/office/drawing/2016/5/12/chartex" xmlns:cx5="http://schemas.microsoft.com/office/drawing/2016/5/11/chartex" xmlns:cx4="http://schemas.microsoft.com/office/drawing/2016/5/10/chartex" xmlns:cx3="http://schemas.microsoft.com/office/drawing/2016/5/9/chartex" xmlns:cx2="http://schemas.microsoft.com/office/drawing/2015/10/21/chartex" xmlns:cx1="http://schemas.microsoft.com/office/drawing/2015/9/8/chartex" xmlns="" val="1"/>
                         </a:ext>
                       </a:extLst>
                     </pic:cNvPr>
@@ -4645,18 +3917,7 @@
           <w:sz w:val="28"/>
           <w:szCs w:val="28"/>
         </w:rPr>
-        <w:t>_sheet_</w:t>
-      </w:r>
-      <w:proofErr w:type="gramStart"/>
-      <w:r>
-        <w:rPr>
-          <w:rFonts w:asciiTheme="minorHAnsi" w:hAnsiTheme="minorHAnsi" w:cstheme="minorHAnsi"/>
-          <w:noProof/>
-          <w:color w:val="auto"/>
-          <w:sz w:val="28"/>
-          <w:szCs w:val="28"/>
-        </w:rPr>
-        <w:t xml:space="preserve">share </w:t>
+        <w:t xml:space="preserve">_sheet_share </w:t>
       </w:r>
       <w:r>
         <w:rPr>
@@ -4665,17 +3926,7 @@
           <w:sz w:val="28"/>
           <w:szCs w:val="28"/>
         </w:rPr>
-        <w:t>}</w:t>
-      </w:r>
-      <w:proofErr w:type="gramEnd"/>
-      <w:r>
-        <w:rPr>
-          <w:rFonts w:asciiTheme="minorHAnsi" w:hAnsiTheme="minorHAnsi" w:cstheme="minorHAnsi"/>
-          <w:color w:val="auto"/>
-          <w:sz w:val="28"/>
-          <w:szCs w:val="28"/>
-        </w:rPr>
-        <w:t>}</w:t>
+        <w:t>}}</w:t>
       </w:r>
     </w:p>
     <w:p>
@@ -4713,17 +3964,7 @@
           <w:sz w:val="24"/>
           <w:szCs w:val="28"/>
         </w:rPr>
-        <w:t>_sheet_complete_</w:t>
-      </w:r>
-      <w:proofErr w:type="gramStart"/>
-      <w:r>
-        <w:rPr>
-          <w:rFonts w:cstheme="minorHAnsi"/>
-          <w:noProof/>
-          <w:sz w:val="24"/>
-          <w:szCs w:val="28"/>
-        </w:rPr>
-        <w:t xml:space="preserve">2 </w:t>
+        <w:t xml:space="preserve">_sheet_complete_2 </w:t>
       </w:r>
       <w:r>
         <w:rPr>
@@ -4731,16 +3972,7 @@
           <w:sz w:val="24"/>
           <w:szCs w:val="28"/>
         </w:rPr>
-        <w:t>}</w:t>
-      </w:r>
-      <w:proofErr w:type="gramEnd"/>
-      <w:r>
-        <w:rPr>
-          <w:rFonts w:cstheme="minorHAnsi"/>
-          <w:sz w:val="24"/>
-          <w:szCs w:val="28"/>
-        </w:rPr>
-        <w:t>}</w:t>
+        <w:t>}}</w:t>
       </w:r>
     </w:p>
     <w:p>
@@ -4812,61 +4044,25 @@
           <w:sz w:val="24"/>
           <w:szCs w:val="24"/>
         </w:rPr>
-        <w:t>} (</w:t>
-      </w:r>
-      <w:proofErr w:type="gramStart"/>
+        <w:t xml:space="preserve">} ({{ </w:t>
+      </w:r>
+      <w:proofErr w:type="spellStart"/>
       <w:r>
         <w:rPr>
           <w:rFonts w:cstheme="minorHAnsi"/>
           <w:sz w:val="24"/>
           <w:szCs w:val="24"/>
         </w:rPr>
-        <w:t xml:space="preserve">{{ </w:t>
-      </w:r>
-      <w:proofErr w:type="spellStart"/>
+        <w:t>survey_link_url_only</w:t>
+      </w:r>
+      <w:proofErr w:type="spellEnd"/>
       <w:r>
         <w:rPr>
           <w:rFonts w:cstheme="minorHAnsi"/>
           <w:sz w:val="24"/>
           <w:szCs w:val="24"/>
         </w:rPr>
-        <w:t>survey</w:t>
-      </w:r>
-      <w:proofErr w:type="gramEnd"/>
-      <w:r>
-        <w:rPr>
-          <w:rFonts w:cstheme="minorHAnsi"/>
-          <w:sz w:val="24"/>
-          <w:szCs w:val="24"/>
-        </w:rPr>
-        <w:t>_link_url_</w:t>
-      </w:r>
-      <w:proofErr w:type="gramStart"/>
-      <w:r>
-        <w:rPr>
-          <w:rFonts w:cstheme="minorHAnsi"/>
-          <w:sz w:val="24"/>
-          <w:szCs w:val="24"/>
-        </w:rPr>
-        <w:t>only</w:t>
-      </w:r>
-      <w:proofErr w:type="spellEnd"/>
-      <w:r>
-        <w:rPr>
-          <w:rFonts w:cstheme="minorHAnsi"/>
-          <w:sz w:val="24"/>
-          <w:szCs w:val="24"/>
-        </w:rPr>
-        <w:t xml:space="preserve"> }</w:t>
-      </w:r>
-      <w:proofErr w:type="gramEnd"/>
-      <w:r>
-        <w:rPr>
-          <w:rFonts w:cstheme="minorHAnsi"/>
-          <w:sz w:val="24"/>
-          <w:szCs w:val="24"/>
-        </w:rPr>
-        <w:t>}), or scan the survey QR code below:</w:t>
+        <w:t xml:space="preserve"> }}), or scan the survey QR code below:</w:t>
       </w:r>
     </w:p>
     <w:p>
@@ -4958,7 +4154,7 @@
     <w:sectPr>
       <w:headerReference w:type="default" r:id="rId20"/>
       <w:pgSz w:w="12240" w:h="15840"/>
-      <w:pgMar w:top="1008" w:right="720" w:bottom="720" w:left="720" w:header="720" w:footer="360" w:gutter="0"/>
+      <w:pgMar w:top="720" w:right="720" w:bottom="720" w:left="720" w:header="720" w:footer="360" w:gutter="0"/>
       <w:cols w:space="720"/>
       <w:formProt w:val="0"/>
       <w:docGrid w:linePitch="360" w:charSpace="4096"/>
@@ -4968,7 +4164,7 @@
 </file>
 
 <file path=word/endnotes.xml><?xml version="1.0" encoding="utf-8"?>
-<w:endnotes xmlns:wpc="http://schemas.microsoft.com/office/word/2010/wordprocessingCanvas" xmlns:cx="http://schemas.microsoft.com/office/drawing/2014/chartex" xmlns:cx1="http://schemas.microsoft.com/office/drawing/2015/9/8/chartex" xmlns:cx2="http://schemas.microsoft.com/office/drawing/2015/10/21/chartex" xmlns:cx3="http://schemas.microsoft.com/office/drawing/2016/5/9/chartex" xmlns:cx4="http://schemas.microsoft.com/office/drawing/2016/5/10/chartex" xmlns:cx5="http://schemas.microsoft.com/office/drawing/2016/5/11/chartex" xmlns:cx6="http://schemas.microsoft.com/office/drawing/2016/5/12/chartex" xmlns:cx7="http://schemas.microsoft.com/office/drawing/2016/5/13/chartex" xmlns:cx8="http://schemas.microsoft.com/office/drawing/2016/5/14/chartex" xmlns:mc="http://schemas.openxmlformats.org/markup-compatibility/2006" xmlns:aink="http://schemas.microsoft.com/office/drawing/2016/ink" xmlns:am3d="http://schemas.microsoft.com/office/drawing/2017/model3d" xmlns:o="urn:schemas-microsoft-com:office:office" xmlns:oel="http://schemas.microsoft.com/office/2019/extlst" xmlns:r="http://schemas.openxmlformats.org/officeDocument/2006/relationships" xmlns:m="http://schemas.openxmlformats.org/officeDocument/2006/math" xmlns:v="urn:schemas-microsoft-com:vml" xmlns:wp14="http://schemas.microsoft.com/office/word/2010/wordprocessingDrawing" xmlns:wp="http://schemas.openxmlformats.org/drawingml/2006/wordprocessingDrawing" xmlns:w10="urn:schemas-microsoft-com:office:word" xmlns:w="http://schemas.openxmlformats.org/wordprocessingml/2006/main" xmlns:w14="http://schemas.microsoft.com/office/word/2010/wordml" xmlns:w15="http://schemas.microsoft.com/office/word/2012/wordml" xmlns:w16cex="http://schemas.microsoft.com/office/word/2018/wordml/cex" xmlns:w16cid="http://schemas.microsoft.com/office/word/2016/wordml/cid" xmlns:w16="http://schemas.microsoft.com/office/word/2018/wordml" xmlns:w16du="http://schemas.microsoft.com/office/word/2023/wordml/word16du" xmlns:w16sdtdh="http://schemas.microsoft.com/office/word/2020/wordml/sdtdatahash" xmlns:w16sdtfl="http://schemas.microsoft.com/office/word/2024/wordml/sdtformatlock" xmlns:w16se="http://schemas.microsoft.com/office/word/2015/wordml/symex" xmlns:wpg="http://schemas.microsoft.com/office/word/2010/wordprocessingGroup" xmlns:wpi="http://schemas.microsoft.com/office/word/2010/wordprocessingInk" xmlns:wne="http://schemas.microsoft.com/office/word/2006/wordml" xmlns:wps="http://schemas.microsoft.com/office/word/2010/wordprocessingShape" mc:Ignorable="w14 w15 w16se w16cid w16 w16cex w16sdtdh w16sdtfl w16du wp14">
+<w:endnotes xmlns:wpc="http://schemas.microsoft.com/office/word/2010/wordprocessingCanvas" xmlns:cx="http://schemas.microsoft.com/office/drawing/2014/chartex" xmlns:mc="http://schemas.openxmlformats.org/markup-compatibility/2006" xmlns:o="urn:schemas-microsoft-com:office:office" xmlns:r="http://schemas.openxmlformats.org/officeDocument/2006/relationships" xmlns:m="http://schemas.openxmlformats.org/officeDocument/2006/math" xmlns:v="urn:schemas-microsoft-com:vml" xmlns:wp14="http://schemas.microsoft.com/office/word/2010/wordprocessingDrawing" xmlns:wp="http://schemas.openxmlformats.org/drawingml/2006/wordprocessingDrawing" xmlns:w10="urn:schemas-microsoft-com:office:word" xmlns:w="http://schemas.openxmlformats.org/wordprocessingml/2006/main" xmlns:w14="http://schemas.microsoft.com/office/word/2010/wordml" xmlns:w15="http://schemas.microsoft.com/office/word/2012/wordml" xmlns:w16se="http://schemas.microsoft.com/office/word/2015/wordml/symex" xmlns:wpg="http://schemas.microsoft.com/office/word/2010/wordprocessingGroup" xmlns:wpi="http://schemas.microsoft.com/office/word/2010/wordprocessingInk" xmlns:wne="http://schemas.microsoft.com/office/word/2006/wordml" xmlns:wps="http://schemas.microsoft.com/office/word/2010/wordprocessingShape" mc:Ignorable="w14 w15 w16se wp14">
   <w:endnote w:type="separator" w:id="-1">
     <w:p>
       <w:pPr>
@@ -4993,7 +4189,7 @@
 </file>
 
 <file path=word/footer1.xml><?xml version="1.0" encoding="utf-8"?>
-<w:ftr xmlns:wpc="http://schemas.microsoft.com/office/word/2010/wordprocessingCanvas" xmlns:cx="http://schemas.microsoft.com/office/drawing/2014/chartex" xmlns:cx1="http://schemas.microsoft.com/office/drawing/2015/9/8/chartex" xmlns:cx2="http://schemas.microsoft.com/office/drawing/2015/10/21/chartex" xmlns:cx3="http://schemas.microsoft.com/office/drawing/2016/5/9/chartex" xmlns:cx4="http://schemas.microsoft.com/office/drawing/2016/5/10/chartex" xmlns:cx5="http://schemas.microsoft.com/office/drawing/2016/5/11/chartex" xmlns:cx6="http://schemas.microsoft.com/office/drawing/2016/5/12/chartex" xmlns:cx7="http://schemas.microsoft.com/office/drawing/2016/5/13/chartex" xmlns:cx8="http://schemas.microsoft.com/office/drawing/2016/5/14/chartex" xmlns:mc="http://schemas.openxmlformats.org/markup-compatibility/2006" xmlns:aink="http://schemas.microsoft.com/office/drawing/2016/ink" xmlns:am3d="http://schemas.microsoft.com/office/drawing/2017/model3d" xmlns:o="urn:schemas-microsoft-com:office:office" xmlns:oel="http://schemas.microsoft.com/office/2019/extlst" xmlns:r="http://schemas.openxmlformats.org/officeDocument/2006/relationships" xmlns:m="http://schemas.openxmlformats.org/officeDocument/2006/math" xmlns:v="urn:schemas-microsoft-com:vml" xmlns:wp14="http://schemas.microsoft.com/office/word/2010/wordprocessingDrawing" xmlns:wp="http://schemas.openxmlformats.org/drawingml/2006/wordprocessingDrawing" xmlns:w10="urn:schemas-microsoft-com:office:word" xmlns:w="http://schemas.openxmlformats.org/wordprocessingml/2006/main" xmlns:w14="http://schemas.microsoft.com/office/word/2010/wordml" xmlns:w15="http://schemas.microsoft.com/office/word/2012/wordml" xmlns:w16cex="http://schemas.microsoft.com/office/word/2018/wordml/cex" xmlns:w16cid="http://schemas.microsoft.com/office/word/2016/wordml/cid" xmlns:w16="http://schemas.microsoft.com/office/word/2018/wordml" xmlns:w16du="http://schemas.microsoft.com/office/word/2023/wordml/word16du" xmlns:w16sdtdh="http://schemas.microsoft.com/office/word/2020/wordml/sdtdatahash" xmlns:w16sdtfl="http://schemas.microsoft.com/office/word/2024/wordml/sdtformatlock" xmlns:w16se="http://schemas.microsoft.com/office/word/2015/wordml/symex" xmlns:wpg="http://schemas.microsoft.com/office/word/2010/wordprocessingGroup" xmlns:wpi="http://schemas.microsoft.com/office/word/2010/wordprocessingInk" xmlns:wne="http://schemas.microsoft.com/office/word/2006/wordml" xmlns:wps="http://schemas.microsoft.com/office/word/2010/wordprocessingShape" mc:Ignorable="w14 w15 w16se w16cid w16 w16cex w16sdtdh w16sdtfl w16du wp14">
+<w:ftr xmlns:wpc="http://schemas.microsoft.com/office/word/2010/wordprocessingCanvas" xmlns:cx="http://schemas.microsoft.com/office/drawing/2014/chartex" xmlns:mc="http://schemas.openxmlformats.org/markup-compatibility/2006" xmlns:o="urn:schemas-microsoft-com:office:office" xmlns:r="http://schemas.openxmlformats.org/officeDocument/2006/relationships" xmlns:m="http://schemas.openxmlformats.org/officeDocument/2006/math" xmlns:v="urn:schemas-microsoft-com:vml" xmlns:wp14="http://schemas.microsoft.com/office/word/2010/wordprocessingDrawing" xmlns:wp="http://schemas.openxmlformats.org/drawingml/2006/wordprocessingDrawing" xmlns:w10="urn:schemas-microsoft-com:office:word" xmlns:w="http://schemas.openxmlformats.org/wordprocessingml/2006/main" xmlns:w14="http://schemas.microsoft.com/office/word/2010/wordml" xmlns:w15="http://schemas.microsoft.com/office/word/2012/wordml" xmlns:w16se="http://schemas.microsoft.com/office/word/2015/wordml/symex" xmlns:wpg="http://schemas.microsoft.com/office/word/2010/wordprocessingGroup" xmlns:wpi="http://schemas.microsoft.com/office/word/2010/wordprocessingInk" xmlns:wne="http://schemas.microsoft.com/office/word/2006/wordml" xmlns:wps="http://schemas.microsoft.com/office/word/2010/wordprocessingShape" mc:Ignorable="w14 w15 w16se wp14">
   <w:p>
     <w:pPr>
       <w:pStyle w:val="Footer"/>
@@ -5057,7 +4253,7 @@
             </wp:anchor>
           </w:drawing>
         </mc:Choice>
-        <mc:Fallback>
+        <mc:Fallback xmlns:w16sdtfl="http://schemas.microsoft.com/office/word/2024/wordml/sdtformatlock" xmlns:w16sdtdh="http://schemas.microsoft.com/office/word/2020/wordml/sdtdatahash" xmlns:w16du="http://schemas.microsoft.com/office/word/2023/wordml/word16du" xmlns:w16="http://schemas.microsoft.com/office/word/2018/wordml" xmlns:w16cid="http://schemas.microsoft.com/office/word/2016/wordml/cid" xmlns:w16cex="http://schemas.microsoft.com/office/word/2018/wordml/cex" xmlns:oel="http://schemas.microsoft.com/office/2019/extlst" xmlns:am3d="http://schemas.microsoft.com/office/drawing/2017/model3d" xmlns:aink="http://schemas.microsoft.com/office/drawing/2016/ink" xmlns:cx8="http://schemas.microsoft.com/office/drawing/2016/5/14/chartex" xmlns:cx7="http://schemas.microsoft.com/office/drawing/2016/5/13/chartex" xmlns:cx6="http://schemas.microsoft.com/office/drawing/2016/5/12/chartex" xmlns:cx5="http://schemas.microsoft.com/office/drawing/2016/5/11/chartex" xmlns:cx4="http://schemas.microsoft.com/office/drawing/2016/5/10/chartex" xmlns:cx3="http://schemas.microsoft.com/office/drawing/2016/5/9/chartex" xmlns:cx2="http://schemas.microsoft.com/office/drawing/2015/10/21/chartex" xmlns:cx1="http://schemas.microsoft.com/office/drawing/2015/9/8/chartex">
           <w:pict>
             <v:line w14:anchorId="76512BE5" id="Straight Connector 1" o:spid="_x0000_s1026" style="position:absolute;z-index:-251657728;visibility:visible;mso-wrap-style:square;mso-wrap-distance-left:0;mso-wrap-distance-top:0;mso-wrap-distance-right:0;mso-wrap-distance-bottom:0;mso-position-horizontal:absolute;mso-position-horizontal-relative:text;mso-position-vertical:absolute;mso-position-vertical-relative:text" from="-1.05pt,-7.65pt" to="521.4pt,-7.55pt" o:gfxdata="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" strokecolor="#4a7ebb"/>
           </w:pict>
@@ -5120,7 +4316,7 @@
         <w:rFonts w:ascii="Cambria" w:eastAsia="PMingLiU" w:hAnsi="Cambria"/>
         <w:noProof/>
       </w:rPr>
-      <w:t>1</w:t>
+      <w:t>5</w:t>
     </w:r>
     <w:r>
       <w:rPr>
@@ -5133,7 +4329,7 @@
 </file>
 
 <file path=word/footnotes.xml><?xml version="1.0" encoding="utf-8"?>
-<w:footnotes xmlns:wpc="http://schemas.microsoft.com/office/word/2010/wordprocessingCanvas" xmlns:cx="http://schemas.microsoft.com/office/drawing/2014/chartex" xmlns:cx1="http://schemas.microsoft.com/office/drawing/2015/9/8/chartex" xmlns:cx2="http://schemas.microsoft.com/office/drawing/2015/10/21/chartex" xmlns:cx3="http://schemas.microsoft.com/office/drawing/2016/5/9/chartex" xmlns:cx4="http://schemas.microsoft.com/office/drawing/2016/5/10/chartex" xmlns:cx5="http://schemas.microsoft.com/office/drawing/2016/5/11/chartex" xmlns:cx6="http://schemas.microsoft.com/office/drawing/2016/5/12/chartex" xmlns:cx7="http://schemas.microsoft.com/office/drawing/2016/5/13/chartex" xmlns:cx8="http://schemas.microsoft.com/office/drawing/2016/5/14/chartex" xmlns:mc="http://schemas.openxmlformats.org/markup-compatibility/2006" xmlns:aink="http://schemas.microsoft.com/office/drawing/2016/ink" xmlns:am3d="http://schemas.microsoft.com/office/drawing/2017/model3d" xmlns:o="urn:schemas-microsoft-com:office:office" xmlns:oel="http://schemas.microsoft.com/office/2019/extlst" xmlns:r="http://schemas.openxmlformats.org/officeDocument/2006/relationships" xmlns:m="http://schemas.openxmlformats.org/officeDocument/2006/math" xmlns:v="urn:schemas-microsoft-com:vml" xmlns:wp14="http://schemas.microsoft.com/office/word/2010/wordprocessingDrawing" xmlns:wp="http://schemas.openxmlformats.org/drawingml/2006/wordprocessingDrawing" xmlns:w10="urn:schemas-microsoft-com:office:word" xmlns:w="http://schemas.openxmlformats.org/wordprocessingml/2006/main" xmlns:w14="http://schemas.microsoft.com/office/word/2010/wordml" xmlns:w15="http://schemas.microsoft.com/office/word/2012/wordml" xmlns:w16cex="http://schemas.microsoft.com/office/word/2018/wordml/cex" xmlns:w16cid="http://schemas.microsoft.com/office/word/2016/wordml/cid" xmlns:w16="http://schemas.microsoft.com/office/word/2018/wordml" xmlns:w16du="http://schemas.microsoft.com/office/word/2023/wordml/word16du" xmlns:w16sdtdh="http://schemas.microsoft.com/office/word/2020/wordml/sdtdatahash" xmlns:w16sdtfl="http://schemas.microsoft.com/office/word/2024/wordml/sdtformatlock" xmlns:w16se="http://schemas.microsoft.com/office/word/2015/wordml/symex" xmlns:wpg="http://schemas.microsoft.com/office/word/2010/wordprocessingGroup" xmlns:wpi="http://schemas.microsoft.com/office/word/2010/wordprocessingInk" xmlns:wne="http://schemas.microsoft.com/office/word/2006/wordml" xmlns:wps="http://schemas.microsoft.com/office/word/2010/wordprocessingShape" mc:Ignorable="w14 w15 w16se w16cid w16 w16cex w16sdtdh w16sdtfl w16du wp14">
+<w:footnotes xmlns:wpc="http://schemas.microsoft.com/office/word/2010/wordprocessingCanvas" xmlns:cx="http://schemas.microsoft.com/office/drawing/2014/chartex" xmlns:mc="http://schemas.openxmlformats.org/markup-compatibility/2006" xmlns:o="urn:schemas-microsoft-com:office:office" xmlns:r="http://schemas.openxmlformats.org/officeDocument/2006/relationships" xmlns:m="http://schemas.openxmlformats.org/officeDocument/2006/math" xmlns:v="urn:schemas-microsoft-com:vml" xmlns:wp14="http://schemas.microsoft.com/office/word/2010/wordprocessingDrawing" xmlns:wp="http://schemas.openxmlformats.org/drawingml/2006/wordprocessingDrawing" xmlns:w10="urn:schemas-microsoft-com:office:word" xmlns:w="http://schemas.openxmlformats.org/wordprocessingml/2006/main" xmlns:w14="http://schemas.microsoft.com/office/word/2010/wordml" xmlns:w15="http://schemas.microsoft.com/office/word/2012/wordml" xmlns:w16se="http://schemas.microsoft.com/office/word/2015/wordml/symex" xmlns:wpg="http://schemas.microsoft.com/office/word/2010/wordprocessingGroup" xmlns:wpi="http://schemas.microsoft.com/office/word/2010/wordprocessingInk" xmlns:wne="http://schemas.microsoft.com/office/word/2006/wordml" xmlns:wps="http://schemas.microsoft.com/office/word/2010/wordprocessingShape" mc:Ignorable="w14 w15 w16se wp14">
   <w:footnote w:type="separator" w:id="-1">
     <w:p>
       <w:pPr>
@@ -5158,7 +4354,7 @@
 </file>
 
 <file path=word/header1.xml><?xml version="1.0" encoding="utf-8"?>
-<w:hdr xmlns:wpc="http://schemas.microsoft.com/office/word/2010/wordprocessingCanvas" xmlns:cx="http://schemas.microsoft.com/office/drawing/2014/chartex" xmlns:cx1="http://schemas.microsoft.com/office/drawing/2015/9/8/chartex" xmlns:cx2="http://schemas.microsoft.com/office/drawing/2015/10/21/chartex" xmlns:cx3="http://schemas.microsoft.com/office/drawing/2016/5/9/chartex" xmlns:cx4="http://schemas.microsoft.com/office/drawing/2016/5/10/chartex" xmlns:cx5="http://schemas.microsoft.com/office/drawing/2016/5/11/chartex" xmlns:cx6="http://schemas.microsoft.com/office/drawing/2016/5/12/chartex" xmlns:cx7="http://schemas.microsoft.com/office/drawing/2016/5/13/chartex" xmlns:cx8="http://schemas.microsoft.com/office/drawing/2016/5/14/chartex" xmlns:mc="http://schemas.openxmlformats.org/markup-compatibility/2006" xmlns:aink="http://schemas.microsoft.com/office/drawing/2016/ink" xmlns:am3d="http://schemas.microsoft.com/office/drawing/2017/model3d" xmlns:o="urn:schemas-microsoft-com:office:office" xmlns:oel="http://schemas.microsoft.com/office/2019/extlst" xmlns:r="http://schemas.openxmlformats.org/officeDocument/2006/relationships" xmlns:m="http://schemas.openxmlformats.org/officeDocument/2006/math" xmlns:v="urn:schemas-microsoft-com:vml" xmlns:wp14="http://schemas.microsoft.com/office/word/2010/wordprocessingDrawing" xmlns:wp="http://schemas.openxmlformats.org/drawingml/2006/wordprocessingDrawing" xmlns:w10="urn:schemas-microsoft-com:office:word" xmlns:w="http://schemas.openxmlformats.org/wordprocessingml/2006/main" xmlns:w14="http://schemas.microsoft.com/office/word/2010/wordml" xmlns:w15="http://schemas.microsoft.com/office/word/2012/wordml" xmlns:w16cex="http://schemas.microsoft.com/office/word/2018/wordml/cex" xmlns:w16cid="http://schemas.microsoft.com/office/word/2016/wordml/cid" xmlns:w16="http://schemas.microsoft.com/office/word/2018/wordml" xmlns:w16du="http://schemas.microsoft.com/office/word/2023/wordml/word16du" xmlns:w16sdtdh="http://schemas.microsoft.com/office/word/2020/wordml/sdtdatahash" xmlns:w16sdtfl="http://schemas.microsoft.com/office/word/2024/wordml/sdtformatlock" xmlns:w16se="http://schemas.microsoft.com/office/word/2015/wordml/symex" xmlns:wpg="http://schemas.microsoft.com/office/word/2010/wordprocessingGroup" xmlns:wpi="http://schemas.microsoft.com/office/word/2010/wordprocessingInk" xmlns:wne="http://schemas.microsoft.com/office/word/2006/wordml" xmlns:wps="http://schemas.microsoft.com/office/word/2010/wordprocessingShape" mc:Ignorable="w14 w15 w16se w16cid w16 w16cex w16sdtdh w16sdtfl w16du wp14">
+<w:hdr xmlns:wpc="http://schemas.microsoft.com/office/word/2010/wordprocessingCanvas" xmlns:cx="http://schemas.microsoft.com/office/drawing/2014/chartex" xmlns:mc="http://schemas.openxmlformats.org/markup-compatibility/2006" xmlns:o="urn:schemas-microsoft-com:office:office" xmlns:r="http://schemas.openxmlformats.org/officeDocument/2006/relationships" xmlns:m="http://schemas.openxmlformats.org/officeDocument/2006/math" xmlns:v="urn:schemas-microsoft-com:vml" xmlns:wp14="http://schemas.microsoft.com/office/word/2010/wordprocessingDrawing" xmlns:wp="http://schemas.openxmlformats.org/drawingml/2006/wordprocessingDrawing" xmlns:w10="urn:schemas-microsoft-com:office:word" xmlns:w="http://schemas.openxmlformats.org/wordprocessingml/2006/main" xmlns:w14="http://schemas.microsoft.com/office/word/2010/wordml" xmlns:w15="http://schemas.microsoft.com/office/word/2012/wordml" xmlns:w16se="http://schemas.microsoft.com/office/word/2015/wordml/symex" xmlns:wpg="http://schemas.microsoft.com/office/word/2010/wordprocessingGroup" xmlns:wpi="http://schemas.microsoft.com/office/word/2010/wordprocessingInk" xmlns:wne="http://schemas.microsoft.com/office/word/2006/wordml" xmlns:wps="http://schemas.microsoft.com/office/word/2010/wordprocessingShape" mc:Ignorable="w14 w15 w16se wp14">
   <w:p>
     <w:pPr>
       <w:pStyle w:val="Header"/>
@@ -5168,7 +4364,7 @@
 </file>
 
 <file path=word/numbering.xml><?xml version="1.0" encoding="utf-8"?>
-<w:numbering xmlns:wpc="http://schemas.microsoft.com/office/word/2010/wordprocessingCanvas" xmlns:cx="http://schemas.microsoft.com/office/drawing/2014/chartex" xmlns:cx1="http://schemas.microsoft.com/office/drawing/2015/9/8/chartex" xmlns:cx2="http://schemas.microsoft.com/office/drawing/2015/10/21/chartex" xmlns:cx3="http://schemas.microsoft.com/office/drawing/2016/5/9/chartex" xmlns:cx4="http://schemas.microsoft.com/office/drawing/2016/5/10/chartex" xmlns:cx5="http://schemas.microsoft.com/office/drawing/2016/5/11/chartex" xmlns:cx6="http://schemas.microsoft.com/office/drawing/2016/5/12/chartex" xmlns:cx7="http://schemas.microsoft.com/office/drawing/2016/5/13/chartex" xmlns:cx8="http://schemas.microsoft.com/office/drawing/2016/5/14/chartex" xmlns:mc="http://schemas.openxmlformats.org/markup-compatibility/2006" xmlns:aink="http://schemas.microsoft.com/office/drawing/2016/ink" xmlns:am3d="http://schemas.microsoft.com/office/drawing/2017/model3d" xmlns:o="urn:schemas-microsoft-com:office:office" xmlns:oel="http://schemas.microsoft.com/office/2019/extlst" xmlns:r="http://schemas.openxmlformats.org/officeDocument/2006/relationships" xmlns:m="http://schemas.openxmlformats.org/officeDocument/2006/math" xmlns:v="urn:schemas-microsoft-com:vml" xmlns:wp14="http://schemas.microsoft.com/office/word/2010/wordprocessingDrawing" xmlns:wp="http://schemas.openxmlformats.org/drawingml/2006/wordprocessingDrawing" xmlns:w10="urn:schemas-microsoft-com:office:word" xmlns:w="http://schemas.openxmlformats.org/wordprocessingml/2006/main" xmlns:w14="http://schemas.microsoft.com/office/word/2010/wordml" xmlns:w15="http://schemas.microsoft.com/office/word/2012/wordml" xmlns:w16cex="http://schemas.microsoft.com/office/word/2018/wordml/cex" xmlns:w16cid="http://schemas.microsoft.com/office/word/2016/wordml/cid" xmlns:w16="http://schemas.microsoft.com/office/word/2018/wordml" xmlns:w16du="http://schemas.microsoft.com/office/word/2023/wordml/word16du" xmlns:w16sdtdh="http://schemas.microsoft.com/office/word/2020/wordml/sdtdatahash" xmlns:w16sdtfl="http://schemas.microsoft.com/office/word/2024/wordml/sdtformatlock" xmlns:w16se="http://schemas.microsoft.com/office/word/2015/wordml/symex" xmlns:wpg="http://schemas.microsoft.com/office/word/2010/wordprocessingGroup" xmlns:wpi="http://schemas.microsoft.com/office/word/2010/wordprocessingInk" xmlns:wne="http://schemas.microsoft.com/office/word/2006/wordml" xmlns:wps="http://schemas.microsoft.com/office/word/2010/wordprocessingShape" mc:Ignorable="w14 w15 w16se w16cid w16 w16cex w16sdtdh w16sdtfl w16du wp14">
+<w:numbering xmlns:wpc="http://schemas.microsoft.com/office/word/2010/wordprocessingCanvas" xmlns:cx="http://schemas.microsoft.com/office/drawing/2014/chartex" xmlns:mc="http://schemas.openxmlformats.org/markup-compatibility/2006" xmlns:o="urn:schemas-microsoft-com:office:office" xmlns:r="http://schemas.openxmlformats.org/officeDocument/2006/relationships" xmlns:m="http://schemas.openxmlformats.org/officeDocument/2006/math" xmlns:v="urn:schemas-microsoft-com:vml" xmlns:wp14="http://schemas.microsoft.com/office/word/2010/wordprocessingDrawing" xmlns:wp="http://schemas.openxmlformats.org/drawingml/2006/wordprocessingDrawing" xmlns:w10="urn:schemas-microsoft-com:office:word" xmlns:w="http://schemas.openxmlformats.org/wordprocessingml/2006/main" xmlns:w14="http://schemas.microsoft.com/office/word/2010/wordml" xmlns:w15="http://schemas.microsoft.com/office/word/2012/wordml" xmlns:w16se="http://schemas.microsoft.com/office/word/2015/wordml/symex" xmlns:wpg="http://schemas.microsoft.com/office/word/2010/wordprocessingGroup" xmlns:wpi="http://schemas.microsoft.com/office/word/2010/wordprocessingInk" xmlns:wne="http://schemas.microsoft.com/office/word/2006/wordml" xmlns:wps="http://schemas.microsoft.com/office/word/2010/wordprocessingShape" mc:Ignorable="w14 w15 w16se wp14">
   <w:abstractNum w:abstractNumId="0" w15:restartNumberingAfterBreak="0">
     <w:nsid w:val="02565817"/>
     <w:multiLevelType w:val="multilevel"/>
@@ -6288,41 +5484,41 @@
       </w:pPr>
     </w:lvl>
   </w:abstractNum>
-  <w:num w:numId="1" w16cid:durableId="825360732">
+  <w:num w:numId="1">
     <w:abstractNumId w:val="1"/>
   </w:num>
-  <w:num w:numId="2" w16cid:durableId="1023089125">
+  <w:num w:numId="2">
     <w:abstractNumId w:val="0"/>
   </w:num>
-  <w:num w:numId="3" w16cid:durableId="910770059">
+  <w:num w:numId="3">
     <w:abstractNumId w:val="7"/>
   </w:num>
-  <w:num w:numId="4" w16cid:durableId="209464260">
+  <w:num w:numId="4">
     <w:abstractNumId w:val="5"/>
   </w:num>
-  <w:num w:numId="5" w16cid:durableId="243533127">
+  <w:num w:numId="5">
     <w:abstractNumId w:val="2"/>
   </w:num>
-  <w:num w:numId="6" w16cid:durableId="939444">
+  <w:num w:numId="6">
     <w:abstractNumId w:val="9"/>
   </w:num>
-  <w:num w:numId="7" w16cid:durableId="1310986817">
+  <w:num w:numId="7">
     <w:abstractNumId w:val="3"/>
   </w:num>
-  <w:num w:numId="8" w16cid:durableId="202911799">
+  <w:num w:numId="8">
     <w:abstractNumId w:val="8"/>
   </w:num>
-  <w:num w:numId="9" w16cid:durableId="478621731">
+  <w:num w:numId="9">
     <w:abstractNumId w:val="6"/>
   </w:num>
-  <w:num w:numId="10" w16cid:durableId="597836609">
+  <w:num w:numId="10">
     <w:abstractNumId w:val="4"/>
   </w:num>
 </w:numbering>
 </file>
 
 <file path=word/styles.xml><?xml version="1.0" encoding="utf-8"?>
-<w:styles xmlns:mc="http://schemas.openxmlformats.org/markup-compatibility/2006" xmlns:r="http://schemas.openxmlformats.org/officeDocument/2006/relationships" xmlns:w="http://schemas.openxmlformats.org/wordprocessingml/2006/main" xmlns:w14="http://schemas.microsoft.com/office/word/2010/wordml" xmlns:w15="http://schemas.microsoft.com/office/word/2012/wordml" xmlns:w16cex="http://schemas.microsoft.com/office/word/2018/wordml/cex" xmlns:w16cid="http://schemas.microsoft.com/office/word/2016/wordml/cid" xmlns:w16="http://schemas.microsoft.com/office/word/2018/wordml" xmlns:w16du="http://schemas.microsoft.com/office/word/2023/wordml/word16du" xmlns:w16sdtdh="http://schemas.microsoft.com/office/word/2020/wordml/sdtdatahash" xmlns:w16sdtfl="http://schemas.microsoft.com/office/word/2024/wordml/sdtformatlock" xmlns:w16se="http://schemas.microsoft.com/office/word/2015/wordml/symex" mc:Ignorable="w14 w15 w16se w16cid w16 w16cex w16sdtdh w16sdtfl w16du">
+<w:styles xmlns:mc="http://schemas.openxmlformats.org/markup-compatibility/2006" xmlns:r="http://schemas.openxmlformats.org/officeDocument/2006/relationships" xmlns:w="http://schemas.openxmlformats.org/wordprocessingml/2006/main" xmlns:w14="http://schemas.microsoft.com/office/word/2010/wordml" xmlns:w15="http://schemas.microsoft.com/office/word/2012/wordml" xmlns:w16se="http://schemas.microsoft.com/office/word/2015/wordml/symex" mc:Ignorable="w14 w15 w16se">
   <w:docDefaults>
     <w:rPrDefault>
       <w:rPr>
@@ -6333,7 +5529,7 @@
     </w:rPrDefault>
     <w:pPrDefault/>
   </w:docDefaults>
-  <w:latentStyles w:defLockedState="0" w:defUIPriority="99" w:defSemiHidden="0" w:defUnhideWhenUsed="0" w:defQFormat="0" w:count="376">
+  <w:latentStyles w:defLockedState="0" w:defUIPriority="99" w:defSemiHidden="0" w:defUnhideWhenUsed="0" w:defQFormat="0" w:count="371">
     <w:lsdException w:name="Normal" w:uiPriority="0" w:qFormat="1"/>
     <w:lsdException w:name="heading 1" w:uiPriority="9" w:qFormat="1"/>
     <w:lsdException w:name="heading 2" w:semiHidden="1" w:uiPriority="9" w:unhideWhenUsed="1" w:qFormat="1"/>
@@ -6705,11 +5901,6 @@
     <w:lsdException w:name="List Table 5 Dark Accent 6" w:uiPriority="50"/>
     <w:lsdException w:name="List Table 6 Colorful Accent 6" w:uiPriority="51"/>
     <w:lsdException w:name="List Table 7 Colorful Accent 6" w:uiPriority="52"/>
-    <w:lsdException w:name="Mention" w:semiHidden="1" w:unhideWhenUsed="1"/>
-    <w:lsdException w:name="Smart Hyperlink" w:semiHidden="1" w:unhideWhenUsed="1"/>
-    <w:lsdException w:name="Hashtag" w:semiHidden="1" w:unhideWhenUsed="1"/>
-    <w:lsdException w:name="Unresolved Mention" w:semiHidden="1" w:unhideWhenUsed="1"/>
-    <w:lsdException w:name="Smart Link" w:semiHidden="1" w:unhideWhenUsed="1"/>
   </w:latentStyles>
   <w:style w:type="paragraph" w:default="1" w:styleId="Normal">
     <w:name w:val="Normal"/>
@@ -7478,7 +6669,7 @@
 </file>
 
 <file path=customXml/itemProps1.xml><?xml version="1.0" encoding="utf-8"?>
-<ds:datastoreItem xmlns:ds="http://schemas.openxmlformats.org/officeDocument/2006/customXml" ds:itemID="{96E7E641-DAD3-48BC-80E5-02B840939C5F}">
+<ds:datastoreItem xmlns:ds="http://schemas.openxmlformats.org/officeDocument/2006/customXml" ds:itemID="{726BEE70-80C7-4E1C-9C99-C600C4C498EB}">
   <ds:schemaRefs>
     <ds:schemaRef ds:uri="http://schemas.openxmlformats.org/officeDocument/2006/bibliography"/>
   </ds:schemaRefs>

</xml_diff>

<commit_message>
add asset test message as needed. issue #30
</commit_message>
<xml_diff>
--- a/docassemble/MichiganFoodStampCalculator/data/templates/snap-summary.docx
+++ b/docassemble/MichiganFoodStampCalculator/data/templates/snap-summary.docx
@@ -1110,10 +1110,15 @@
               <w:t xml:space="preserve"> &gt; 0 %}</w:t>
             </w:r>
           </w:p>
-          <w:p/>
+          <w:p>
+            <w:pPr>
+              <w:spacing w:after="0"/>
+            </w:pPr>
+          </w:p>
           <w:p>
             <w:pPr>
               <w:pStyle w:val="Heading3"/>
+              <w:spacing w:before="0"/>
               <w:rPr>
                 <w:bCs/>
                 <w:sz w:val="22"/>
@@ -1209,6 +1214,90 @@
           <w:p>
             <w:pPr>
               <w:spacing w:after="0"/>
+            </w:pPr>
+          </w:p>
+          <w:p>
+            <w:pPr>
+              <w:spacing w:after="0"/>
+              <w:rPr>
+                <w:rFonts w:cstheme="minorHAnsi"/>
+                <w:b/>
+                <w:bCs/>
+              </w:rPr>
+            </w:pPr>
+            <w:r>
+              <w:rPr>
+                <w:rFonts w:cstheme="minorHAnsi"/>
+              </w:rPr>
+              <w:t xml:space="preserve">{{ </w:t>
+            </w:r>
+            <w:proofErr w:type="spellStart"/>
+            <w:r>
+              <w:rPr>
+                <w:rFonts w:cstheme="minorHAnsi"/>
+              </w:rPr>
+              <w:t>AssetTestScreenMsg</w:t>
+            </w:r>
+            <w:proofErr w:type="spellEnd"/>
+            <w:r>
+              <w:rPr>
+                <w:rFonts w:cstheme="minorHAnsi"/>
+              </w:rPr>
+              <w:t xml:space="preserve"> }}</w:t>
+            </w:r>
+            <w:r>
+              <w:rPr>
+                <w:rFonts w:cstheme="minorHAnsi"/>
+              </w:rPr>
+              <w:t xml:space="preserve"> </w:t>
+            </w:r>
+            <w:r>
+              <w:rPr>
+                <w:rFonts w:cstheme="minorHAnsi"/>
+                <w:color w:val="1F2328"/>
+                <w:shd w:val="clear" w:color="auto" w:fill="FFFFFF"/>
+              </w:rPr>
+              <w:t>Read</w:t>
+            </w:r>
+            <w:r>
+              <w:rPr>
+                <w:rFonts w:cstheme="minorHAnsi"/>
+                <w:color w:val="1F2328"/>
+                <w:shd w:val="clear" w:color="auto" w:fill="FFFFFF"/>
+              </w:rPr>
+              <w:t xml:space="preserve"> </w:t>
+            </w:r>
+            <w:hyperlink r:id="rId8" w:anchor="the-asset-limit" w:history="1">
+              <w:r>
+                <w:rPr>
+                  <w:rStyle w:val="Hyperlink"/>
+                  <w:rFonts w:cstheme="minorHAnsi"/>
+                  <w:color w:val="0969DA"/>
+                  <w:shd w:val="clear" w:color="auto" w:fill="FFFFFF"/>
+                </w:rPr>
+                <w:t>Income and Asset Limits for the Food Assistance Program (FAP)</w:t>
+              </w:r>
+            </w:hyperlink>
+            <w:r>
+              <w:rPr>
+                <w:rFonts w:cstheme="minorHAnsi"/>
+                <w:color w:val="1F2328"/>
+                <w:shd w:val="clear" w:color="auto" w:fill="FFFFFF"/>
+              </w:rPr>
+              <w:t xml:space="preserve"> </w:t>
+            </w:r>
+            <w:r>
+              <w:rPr>
+                <w:rFonts w:cstheme="minorHAnsi"/>
+                <w:color w:val="1F2328"/>
+                <w:shd w:val="clear" w:color="auto" w:fill="FFFFFF"/>
+              </w:rPr>
+              <w:t>to learn more.</w:t>
+            </w:r>
+          </w:p>
+          <w:p>
+            <w:pPr>
+              <w:spacing w:after="0"/>
               <w:rPr>
                 <w:b/>
                 <w:bCs/>
@@ -1217,7 +1306,15 @@
               </w:rPr>
             </w:pPr>
             <w:r>
-              <w:t>{%p endif %}</w:t>
+              <w:t xml:space="preserve">{%p </w:t>
+            </w:r>
+            <w:proofErr w:type="spellStart"/>
+            <w:r>
+              <w:t>endif</w:t>
+            </w:r>
+            <w:proofErr w:type="spellEnd"/>
+            <w:r>
+              <w:t xml:space="preserve"> %}</w:t>
             </w:r>
           </w:p>
           <w:p>
@@ -1262,6 +1359,8 @@
                 <w:szCs w:val="20"/>
               </w:rPr>
             </w:pPr>
+            <w:bookmarkStart w:id="0" w:name="_GoBack"/>
+            <w:bookmarkEnd w:id="0"/>
             <w:r>
               <w:rPr>
                 <w:sz w:val="20"/>
@@ -1355,7 +1454,7 @@
       <w:r>
         <w:t xml:space="preserve">The best way to apply for food stamps and other public benefits is online through </w:t>
       </w:r>
-      <w:hyperlink r:id="rId8" w:history="1">
+      <w:hyperlink r:id="rId9" w:history="1">
         <w:r>
           <w:rPr>
             <w:rStyle w:val="Hyperlink"/>
@@ -1366,7 +1465,7 @@
       <w:r>
         <w:t xml:space="preserve">. If you are unable to complete the application online, you can complete a </w:t>
       </w:r>
-      <w:hyperlink r:id="rId9" w:history="1">
+      <w:hyperlink r:id="rId10" w:history="1">
         <w:r>
           <w:rPr>
             <w:rStyle w:val="Hyperlink"/>
@@ -1380,7 +1479,7 @@
       <w:r>
         <w:t xml:space="preserve"> </w:t>
       </w:r>
-      <w:hyperlink r:id="rId10" w:history="1">
+      <w:hyperlink r:id="rId11" w:history="1">
         <w:r>
           <w:rPr>
             <w:rStyle w:val="Hyperlink"/>
@@ -1405,7 +1504,7 @@
       <w:r>
         <w:t xml:space="preserve">Visit </w:t>
       </w:r>
-      <w:hyperlink r:id="rId11" w:history="1">
+      <w:hyperlink r:id="rId12" w:history="1">
         <w:r>
           <w:rPr>
             <w:rStyle w:val="Hyperlink"/>
@@ -1416,7 +1515,7 @@
       <w:r>
         <w:t xml:space="preserve"> on </w:t>
       </w:r>
-      <w:hyperlink r:id="rId12" w:history="1">
+      <w:hyperlink r:id="rId13" w:history="1">
         <w:r>
           <w:rPr>
             <w:rStyle w:val="Hyperlink"/>
@@ -1437,7 +1536,7 @@
       <w:r>
         <w:t xml:space="preserve"> You may be eligible for additional </w:t>
       </w:r>
-      <w:hyperlink r:id="rId13" w:history="1">
+      <w:hyperlink r:id="rId14" w:history="1">
         <w:r>
           <w:rPr>
             <w:rStyle w:val="Hyperlink"/>
@@ -1456,7 +1555,7 @@
       <w:r>
         <w:t xml:space="preserve">If you are denied food stamps or other benefits and you think this is incorrect, your local legal services office may be able to help you. You can use the </w:t>
       </w:r>
-      <w:hyperlink r:id="rId14" w:history="1">
+      <w:hyperlink r:id="rId15" w:history="1">
         <w:r>
           <w:rPr>
             <w:rStyle w:val="Hyperlink"/>
@@ -1473,7 +1572,7 @@
       <w:r>
         <w:t xml:space="preserve">can also use our </w:t>
       </w:r>
-      <w:hyperlink r:id="rId15" w:history="1">
+      <w:hyperlink r:id="rId16" w:history="1">
         <w:r>
           <w:rPr>
             <w:rStyle w:val="Hyperlink"/>
@@ -1490,7 +1589,7 @@
       <w:r>
         <w:t xml:space="preserve">Visit the </w:t>
       </w:r>
-      <w:hyperlink r:id="rId16" w:history="1">
+      <w:hyperlink r:id="rId17" w:history="1">
         <w:r>
           <w:rPr>
             <w:rStyle w:val="Hyperlink"/>
@@ -1511,7 +1610,7 @@
           <w:szCs w:val="24"/>
         </w:rPr>
         <w:sectPr>
-          <w:footerReference w:type="default" r:id="rId17"/>
+          <w:footerReference w:type="default" r:id="rId18"/>
           <w:pgSz w:w="12240" w:h="15840"/>
           <w:pgMar w:top="1008" w:right="720" w:bottom="1080" w:left="720" w:header="288" w:footer="720" w:gutter="0"/>
           <w:cols w:space="720"/>
@@ -3423,7 +3522,6 @@
               <w:spacing w:after="0"/>
               <w:jc w:val="right"/>
             </w:pPr>
-            <w:bookmarkStart w:id="0" w:name="_GoBack"/>
             <w:r>
               <w:t xml:space="preserve">{{ </w:t>
             </w:r>
@@ -3435,7 +3533,6 @@
             <w:r>
               <w:t xml:space="preserve"> }}</w:t>
             </w:r>
-            <w:bookmarkEnd w:id="0"/>
           </w:p>
         </w:tc>
       </w:tr>
@@ -3843,7 +3940,7 @@
                     </pic:cNvPicPr>
                   </pic:nvPicPr>
                   <pic:blipFill>
-                    <a:blip r:embed="rId18" cstate="print">
+                    <a:blip r:embed="rId19" cstate="print">
                       <a:extLst>
                         <a:ext uri="{28A0092B-C50C-407E-A947-70E740481C1C}">
                           <a14:useLocalDpi xmlns:a14="http://schemas.microsoft.com/office/drawing/2010/main" val="0"/>
@@ -4110,7 +4207,7 @@
                     </pic:cNvPicPr>
                   </pic:nvPicPr>
                   <pic:blipFill>
-                    <a:blip r:embed="rId19" cstate="print">
+                    <a:blip r:embed="rId20" cstate="print">
                       <a:extLst>
                         <a:ext uri="{28A0092B-C50C-407E-A947-70E740481C1C}">
                           <a14:useLocalDpi xmlns:a14="http://schemas.microsoft.com/office/drawing/2010/main" val="0"/>
@@ -4152,7 +4249,7 @@
       </w:pPr>
     </w:p>
     <w:sectPr>
-      <w:headerReference w:type="default" r:id="rId20"/>
+      <w:headerReference w:type="default" r:id="rId21"/>
       <w:pgSz w:w="12240" w:h="15840"/>
       <w:pgMar w:top="720" w:right="720" w:bottom="720" w:left="720" w:header="720" w:footer="360" w:gutter="0"/>
       <w:cols w:space="720"/>
@@ -6669,7 +6766,7 @@
 </file>
 
 <file path=customXml/itemProps1.xml><?xml version="1.0" encoding="utf-8"?>
-<ds:datastoreItem xmlns:ds="http://schemas.openxmlformats.org/officeDocument/2006/customXml" ds:itemID="{726BEE70-80C7-4E1C-9C99-C600C4C498EB}">
+<ds:datastoreItem xmlns:ds="http://schemas.openxmlformats.org/officeDocument/2006/customXml" ds:itemID="{22B6259E-3756-49BA-8FFB-FF5761F701E2}">
   <ds:schemaRefs>
     <ds:schemaRef ds:uri="http://schemas.openxmlformats.org/officeDocument/2006/bibliography"/>
   </ds:schemaRefs>

</xml_diff>

<commit_message>
Adjust explanation on printout if user is ineligible. fixes #33
</commit_message>
<xml_diff>
--- a/docassemble/MichiganFoodStampCalculator/data/templates/snap-summary.docx
+++ b/docassemble/MichiganFoodStampCalculator/data/templates/snap-summary.docx
@@ -115,6 +115,28 @@
         <w:spacing w:after="140"/>
       </w:pPr>
       <w:r>
+        <w:t>{%</w:t>
+      </w:r>
+      <w:r>
+        <w:t>p</w:t>
+      </w:r>
+      <w:r>
+        <w:t xml:space="preserve"> if </w:t>
+      </w:r>
+      <w:proofErr w:type="spellStart"/>
+      <w:r>
+        <w:t>FinalResult</w:t>
+      </w:r>
+      <w:proofErr w:type="spellEnd"/>
+      <w:r>
+        <w:t xml:space="preserve"> &gt; 0 %}</w:t>
+      </w:r>
+    </w:p>
+    <w:p>
+      <w:pPr>
+        <w:spacing w:after="140"/>
+      </w:pPr>
+      <w:r>
         <w:t xml:space="preserve">Based on the information you gave, your </w:t>
       </w:r>
       <w:r>
@@ -169,7 +191,301 @@
         <w:t xml:space="preserve"> }} per month</w:t>
       </w:r>
       <w:r>
-        <w:t xml:space="preserve">. This amount is only an estimate - there is no guarantee that you will receive this amount. </w:t>
+        <w:t>. This amount is only an estimate - there is no guarantee that you will receive this amount.</w:t>
+      </w:r>
+    </w:p>
+    <w:p>
+      <w:pPr>
+        <w:spacing w:after="140"/>
+      </w:pPr>
+      <w:r>
+        <w:t>{%p else %}</w:t>
+      </w:r>
+    </w:p>
+    <w:p>
+      <w:pPr>
+        <w:spacing w:after="140"/>
+      </w:pPr>
+      <w:r>
+        <w:rPr>
+          <w:rFonts w:ascii="Segoe UI" w:hAnsi="Segoe UI" w:cs="Segoe UI"/>
+          <w:color w:val="1F2328"/>
+          <w:sz w:val="21"/>
+          <w:szCs w:val="21"/>
+        </w:rPr>
+        <w:t xml:space="preserve">Based on the information you </w:t>
+      </w:r>
+      <w:proofErr w:type="gramStart"/>
+      <w:r>
+        <w:rPr>
+          <w:rFonts w:ascii="Segoe UI" w:hAnsi="Segoe UI" w:cs="Segoe UI"/>
+          <w:color w:val="1F2328"/>
+          <w:sz w:val="21"/>
+          <w:szCs w:val="21"/>
+        </w:rPr>
+        <w:t>gave,</w:t>
+      </w:r>
+      <w:proofErr w:type="gramEnd"/>
+      <w:r>
+        <w:rPr>
+          <w:rFonts w:ascii="Segoe UI" w:hAnsi="Segoe UI" w:cs="Segoe UI"/>
+          <w:color w:val="1F2328"/>
+          <w:sz w:val="21"/>
+          <w:szCs w:val="21"/>
+        </w:rPr>
+        <w:t xml:space="preserve"> you do </w:t>
+      </w:r>
+      <w:r>
+        <w:rPr>
+          <w:rStyle w:val="Strong"/>
+          <w:rFonts w:ascii="Segoe UI" w:hAnsi="Segoe UI" w:cs="Segoe UI"/>
+          <w:color w:val="1F2328"/>
+          <w:sz w:val="21"/>
+          <w:szCs w:val="21"/>
+        </w:rPr>
+        <w:t>not</w:t>
+      </w:r>
+      <w:r>
+        <w:rPr>
+          <w:rFonts w:ascii="Segoe UI" w:hAnsi="Segoe UI" w:cs="Segoe UI"/>
+          <w:color w:val="1F2328"/>
+          <w:sz w:val="21"/>
+          <w:szCs w:val="21"/>
+        </w:rPr>
+        <w:t xml:space="preserve"> seem to be eligible for food stamp (FAP) benefits.</w:t>
+      </w:r>
+    </w:p>
+    <w:p>
+      <w:pPr>
+        <w:spacing w:after="140"/>
+      </w:pPr>
+      <w:r>
+        <w:t>{%p</w:t>
+      </w:r>
+      <w:bookmarkStart w:id="0" w:name="_GoBack"/>
+      <w:bookmarkEnd w:id="0"/>
+      <w:r>
+        <w:t xml:space="preserve"> if </w:t>
+      </w:r>
+      <w:proofErr w:type="spellStart"/>
+      <w:r>
+        <w:t>ElderlyOrDisabled</w:t>
+      </w:r>
+      <w:proofErr w:type="spellEnd"/>
+      <w:r>
+        <w:t xml:space="preserve"> == “Yes” and </w:t>
+      </w:r>
+      <w:proofErr w:type="spellStart"/>
+      <w:r>
+        <w:t>GITResult</w:t>
+      </w:r>
+      <w:proofErr w:type="spellEnd"/>
+      <w:r>
+        <w:t xml:space="preserve"> == “FAILED” and </w:t>
+      </w:r>
+      <w:proofErr w:type="spellStart"/>
+      <w:r>
+        <w:t>NICTestResult</w:t>
+      </w:r>
+      <w:proofErr w:type="spellEnd"/>
+      <w:r>
+        <w:t xml:space="preserve"> == “FAILED” %}</w:t>
+      </w:r>
+    </w:p>
+    <w:p>
+      <w:pPr>
+        <w:spacing w:after="140"/>
+      </w:pPr>
+      <w:r>
+        <w:rPr>
+          <w:rFonts w:ascii="Segoe UI" w:hAnsi="Segoe UI" w:cs="Segoe UI"/>
+          <w:color w:val="1F2328"/>
+          <w:sz w:val="21"/>
+          <w:szCs w:val="21"/>
+        </w:rPr>
+        <w:t>This is because your household's gross and net income both appear to be higher than the allowed levels.</w:t>
+      </w:r>
+    </w:p>
+    <w:p>
+      <w:pPr>
+        <w:spacing w:after="140"/>
+      </w:pPr>
+      <w:r>
+        <w:t xml:space="preserve">{%p </w:t>
+      </w:r>
+      <w:proofErr w:type="spellStart"/>
+      <w:r>
+        <w:t>el</w:t>
+      </w:r>
+      <w:r>
+        <w:t>if</w:t>
+      </w:r>
+      <w:proofErr w:type="spellEnd"/>
+      <w:r>
+        <w:t xml:space="preserve"> </w:t>
+      </w:r>
+      <w:proofErr w:type="spellStart"/>
+      <w:r>
+        <w:t>ElderlyOrDisabled</w:t>
+      </w:r>
+      <w:proofErr w:type="spellEnd"/>
+      <w:r>
+        <w:t xml:space="preserve"> == “</w:t>
+      </w:r>
+      <w:r>
+        <w:t>No</w:t>
+      </w:r>
+      <w:r>
+        <w:t xml:space="preserve">” and </w:t>
+      </w:r>
+      <w:proofErr w:type="spellStart"/>
+      <w:r>
+        <w:t>GITResult</w:t>
+      </w:r>
+      <w:proofErr w:type="spellEnd"/>
+      <w:r>
+        <w:t xml:space="preserve"> == “FAILED” %}</w:t>
+      </w:r>
+    </w:p>
+    <w:p>
+      <w:pPr>
+        <w:spacing w:after="140"/>
+      </w:pPr>
+      <w:r>
+        <w:rPr>
+          <w:rFonts w:ascii="Segoe UI" w:hAnsi="Segoe UI" w:cs="Segoe UI"/>
+          <w:color w:val="1F2328"/>
+          <w:sz w:val="21"/>
+          <w:szCs w:val="21"/>
+        </w:rPr>
+        <w:t>This is because your household's gross income appears to be higher than 200% of the federal poverty level</w:t>
+      </w:r>
+      <w:r>
+        <w:rPr>
+          <w:rFonts w:ascii="Segoe UI" w:hAnsi="Segoe UI" w:cs="Segoe UI"/>
+          <w:color w:val="1F2328"/>
+          <w:sz w:val="21"/>
+          <w:szCs w:val="21"/>
+        </w:rPr>
+        <w:t xml:space="preserve">. </w:t>
+      </w:r>
+    </w:p>
+    <w:p>
+      <w:pPr>
+        <w:spacing w:after="140"/>
+      </w:pPr>
+      <w:r>
+        <w:t>{%p else %}</w:t>
+      </w:r>
+    </w:p>
+    <w:p>
+      <w:pPr>
+        <w:spacing w:after="140"/>
+      </w:pPr>
+      <w:r>
+        <w:rPr>
+          <w:rFonts w:ascii="Segoe UI" w:hAnsi="Segoe UI" w:cs="Segoe UI"/>
+          <w:color w:val="1F2328"/>
+          <w:sz w:val="21"/>
+          <w:szCs w:val="21"/>
+        </w:rPr>
+        <w:t>At your household income level, the benefit amount would likely be $0.</w:t>
+      </w:r>
+      <w:r>
+        <w:rPr>
+          <w:rFonts w:ascii="Segoe UI" w:hAnsi="Segoe UI" w:cs="Segoe UI"/>
+          <w:color w:val="1F2328"/>
+          <w:sz w:val="21"/>
+          <w:szCs w:val="21"/>
+        </w:rPr>
+        <w:t xml:space="preserve"> </w:t>
+      </w:r>
+    </w:p>
+    <w:p>
+      <w:pPr>
+        <w:spacing w:after="140"/>
+      </w:pPr>
+      <w:r>
+        <w:t xml:space="preserve">{%p </w:t>
+      </w:r>
+      <w:proofErr w:type="spellStart"/>
+      <w:r>
+        <w:t>endif</w:t>
+      </w:r>
+      <w:proofErr w:type="spellEnd"/>
+      <w:r>
+        <w:t xml:space="preserve"> %}</w:t>
+      </w:r>
+    </w:p>
+    <w:p>
+      <w:pPr>
+        <w:pStyle w:val="NormalWeb"/>
+        <w:shd w:val="clear" w:color="auto" w:fill="FFFFFF"/>
+        <w:spacing w:before="0" w:beforeAutospacing="0" w:after="240" w:afterAutospacing="0"/>
+        <w:rPr>
+          <w:rFonts w:ascii="Segoe UI" w:hAnsi="Segoe UI" w:cs="Segoe UI"/>
+          <w:color w:val="1F2328"/>
+          <w:sz w:val="21"/>
+          <w:szCs w:val="21"/>
+        </w:rPr>
+      </w:pPr>
+      <w:r>
+        <w:rPr>
+          <w:rFonts w:ascii="Segoe UI" w:hAnsi="Segoe UI" w:cs="Segoe UI"/>
+          <w:color w:val="1F2328"/>
+          <w:sz w:val="21"/>
+          <w:szCs w:val="21"/>
+        </w:rPr>
+        <w:t xml:space="preserve">This is just an estimate. </w:t>
+      </w:r>
+      <w:r>
+        <w:rPr>
+          <w:rStyle w:val="Strong"/>
+          <w:rFonts w:ascii="Segoe UI" w:hAnsi="Segoe UI" w:cs="Segoe UI"/>
+          <w:color w:val="1F2328"/>
+          <w:sz w:val="21"/>
+          <w:szCs w:val="21"/>
+        </w:rPr>
+        <w:t xml:space="preserve">You can still </w:t>
+      </w:r>
+      <w:hyperlink r:id="rId8" w:history="1">
+        <w:r>
+          <w:rPr>
+            <w:rStyle w:val="Hyperlink"/>
+            <w:rFonts w:ascii="Segoe UI" w:hAnsi="Segoe UI" w:cs="Segoe UI"/>
+            <w:b/>
+            <w:bCs/>
+            <w:color w:val="0969DA"/>
+            <w:sz w:val="21"/>
+            <w:szCs w:val="21"/>
+          </w:rPr>
+          <w:t>apply for benefits</w:t>
+        </w:r>
+      </w:hyperlink>
+      <w:r>
+        <w:rPr>
+          <w:rFonts w:ascii="Segoe UI" w:hAnsi="Segoe UI" w:cs="Segoe UI"/>
+          <w:color w:val="1F2328"/>
+          <w:sz w:val="21"/>
+          <w:szCs w:val="21"/>
+        </w:rPr>
+        <w:t xml:space="preserve"> and MDHHS will make its own decision about whether you qualify.</w:t>
+      </w:r>
+    </w:p>
+    <w:p>
+      <w:pPr>
+        <w:spacing w:after="140"/>
+      </w:pPr>
+      <w:r>
+        <w:t xml:space="preserve">{%p </w:t>
+      </w:r>
+      <w:proofErr w:type="spellStart"/>
+      <w:r>
+        <w:t>endif</w:t>
+      </w:r>
+      <w:proofErr w:type="spellEnd"/>
+      <w:r>
+        <w:t xml:space="preserve"> %}</w:t>
       </w:r>
     </w:p>
     <w:tbl>
@@ -606,6 +922,7 @@
               </w:rPr>
             </w:pPr>
             <w:r>
+              <w:lastRenderedPageBreak/>
               <w:t xml:space="preserve">{%p if </w:t>
             </w:r>
             <w:proofErr w:type="spellStart"/>
@@ -1026,7 +1343,6 @@
               </w:rPr>
             </w:pPr>
             <w:r>
-              <w:lastRenderedPageBreak/>
               <w:t>Your monthly medical expenses are $</w:t>
             </w:r>
             <w:proofErr w:type="gramStart"/>
@@ -1257,17 +1573,9 @@
                 <w:color w:val="1F2328"/>
                 <w:shd w:val="clear" w:color="auto" w:fill="FFFFFF"/>
               </w:rPr>
-              <w:t>Read</w:t>
-            </w:r>
-            <w:r>
-              <w:rPr>
-                <w:rFonts w:cstheme="minorHAnsi"/>
-                <w:color w:val="1F2328"/>
-                <w:shd w:val="clear" w:color="auto" w:fill="FFFFFF"/>
-              </w:rPr>
-              <w:t xml:space="preserve"> </w:t>
-            </w:r>
-            <w:hyperlink r:id="rId8" w:anchor="the-asset-limit" w:history="1">
+              <w:t xml:space="preserve">Read </w:t>
+            </w:r>
+            <w:hyperlink r:id="rId9" w:anchor="the-asset-limit" w:history="1">
               <w:r>
                 <w:rPr>
                   <w:rStyle w:val="Hyperlink"/>
@@ -1284,15 +1592,7 @@
                 <w:color w:val="1F2328"/>
                 <w:shd w:val="clear" w:color="auto" w:fill="FFFFFF"/>
               </w:rPr>
-              <w:t xml:space="preserve"> </w:t>
-            </w:r>
-            <w:r>
-              <w:rPr>
-                <w:rFonts w:cstheme="minorHAnsi"/>
-                <w:color w:val="1F2328"/>
-                <w:shd w:val="clear" w:color="auto" w:fill="FFFFFF"/>
-              </w:rPr>
-              <w:t>to learn more.</w:t>
+              <w:t xml:space="preserve"> to learn more.</w:t>
             </w:r>
           </w:p>
           <w:p>
@@ -1359,8 +1659,6 @@
                 <w:szCs w:val="20"/>
               </w:rPr>
             </w:pPr>
-            <w:bookmarkStart w:id="0" w:name="_GoBack"/>
-            <w:bookmarkEnd w:id="0"/>
             <w:r>
               <w:rPr>
                 <w:sz w:val="20"/>
@@ -1454,7 +1752,7 @@
       <w:r>
         <w:t xml:space="preserve">The best way to apply for food stamps and other public benefits is online through </w:t>
       </w:r>
-      <w:hyperlink r:id="rId9" w:history="1">
+      <w:hyperlink r:id="rId10" w:history="1">
         <w:r>
           <w:rPr>
             <w:rStyle w:val="Hyperlink"/>
@@ -1465,7 +1763,7 @@
       <w:r>
         <w:t xml:space="preserve">. If you are unable to complete the application online, you can complete a </w:t>
       </w:r>
-      <w:hyperlink r:id="rId10" w:history="1">
+      <w:hyperlink r:id="rId11" w:history="1">
         <w:r>
           <w:rPr>
             <w:rStyle w:val="Hyperlink"/>
@@ -1479,7 +1777,7 @@
       <w:r>
         <w:t xml:space="preserve"> </w:t>
       </w:r>
-      <w:hyperlink r:id="rId11" w:history="1">
+      <w:hyperlink r:id="rId12" w:history="1">
         <w:r>
           <w:rPr>
             <w:rStyle w:val="Hyperlink"/>
@@ -1502,9 +1800,10 @@
         <w:spacing w:after="140"/>
       </w:pPr>
       <w:r>
+        <w:lastRenderedPageBreak/>
         <w:t xml:space="preserve">Visit </w:t>
       </w:r>
-      <w:hyperlink r:id="rId12" w:history="1">
+      <w:hyperlink r:id="rId13" w:history="1">
         <w:r>
           <w:rPr>
             <w:rStyle w:val="Hyperlink"/>
@@ -1515,7 +1814,7 @@
       <w:r>
         <w:t xml:space="preserve"> on </w:t>
       </w:r>
-      <w:hyperlink r:id="rId13" w:history="1">
+      <w:hyperlink r:id="rId14" w:history="1">
         <w:r>
           <w:rPr>
             <w:rStyle w:val="Hyperlink"/>
@@ -1536,7 +1835,7 @@
       <w:r>
         <w:t xml:space="preserve"> You may be eligible for additional </w:t>
       </w:r>
-      <w:hyperlink r:id="rId14" w:history="1">
+      <w:hyperlink r:id="rId15" w:history="1">
         <w:r>
           <w:rPr>
             <w:rStyle w:val="Hyperlink"/>
@@ -1555,7 +1854,7 @@
       <w:r>
         <w:t xml:space="preserve">If you are denied food stamps or other benefits and you think this is incorrect, your local legal services office may be able to help you. You can use the </w:t>
       </w:r>
-      <w:hyperlink r:id="rId15" w:history="1">
+      <w:hyperlink r:id="rId16" w:history="1">
         <w:r>
           <w:rPr>
             <w:rStyle w:val="Hyperlink"/>
@@ -1572,7 +1871,7 @@
       <w:r>
         <w:t xml:space="preserve">can also use our </w:t>
       </w:r>
-      <w:hyperlink r:id="rId16" w:history="1">
+      <w:hyperlink r:id="rId17" w:history="1">
         <w:r>
           <w:rPr>
             <w:rStyle w:val="Hyperlink"/>
@@ -1589,7 +1888,7 @@
       <w:r>
         <w:t xml:space="preserve">Visit the </w:t>
       </w:r>
-      <w:hyperlink r:id="rId17" w:history="1">
+      <w:hyperlink r:id="rId18" w:history="1">
         <w:r>
           <w:rPr>
             <w:rStyle w:val="Hyperlink"/>
@@ -1610,7 +1909,7 @@
           <w:szCs w:val="24"/>
         </w:rPr>
         <w:sectPr>
-          <w:footerReference w:type="default" r:id="rId18"/>
+          <w:footerReference w:type="default" r:id="rId19"/>
           <w:pgSz w:w="12240" w:h="15840"/>
           <w:pgMar w:top="1008" w:right="720" w:bottom="1080" w:left="720" w:header="288" w:footer="720" w:gutter="0"/>
           <w:cols w:space="720"/>
@@ -3917,7 +4216,7 @@
             <wp:docPr id="1623593727" name="Picture 1">
               <a:extLst xmlns:a="http://schemas.openxmlformats.org/drawingml/2006/main">
                 <a:ext uri="{C183D7F6-B498-43B3-948B-1728B52AA6E4}">
-                  <adec:decorative xmlns:adec="http://schemas.microsoft.com/office/drawing/2017/decorative" xmlns:w16sdtfl="http://schemas.microsoft.com/office/word/2024/wordml/sdtformatlock" xmlns:w16sdtdh="http://schemas.microsoft.com/office/word/2020/wordml/sdtdatahash" xmlns:w16du="http://schemas.microsoft.com/office/word/2023/wordml/word16du" xmlns:w16="http://schemas.microsoft.com/office/word/2018/wordml" xmlns:w16cid="http://schemas.microsoft.com/office/word/2016/wordml/cid" xmlns:w16cex="http://schemas.microsoft.com/office/word/2018/wordml/cex" xmlns:w="http://schemas.openxmlformats.org/wordprocessingml/2006/main" xmlns:w10="urn:schemas-microsoft-com:office:word" xmlns:v="urn:schemas-microsoft-com:vml" xmlns:oel="http://schemas.microsoft.com/office/2019/extlst" xmlns:o="urn:schemas-microsoft-com:office:office" xmlns:am3d="http://schemas.microsoft.com/office/drawing/2017/model3d" xmlns:aink="http://schemas.microsoft.com/office/drawing/2016/ink" xmlns:cx8="http://schemas.microsoft.com/office/drawing/2016/5/14/chartex" xmlns:cx7="http://schemas.microsoft.com/office/drawing/2016/5/13/chartex" xmlns:cx6="http://schemas.microsoft.com/office/drawing/2016/5/12/chartex" xmlns:cx5="http://schemas.microsoft.com/office/drawing/2016/5/11/chartex" xmlns:cx4="http://schemas.microsoft.com/office/drawing/2016/5/10/chartex" xmlns:cx3="http://schemas.microsoft.com/office/drawing/2016/5/9/chartex" xmlns:cx2="http://schemas.microsoft.com/office/drawing/2015/10/21/chartex" xmlns:cx1="http://schemas.microsoft.com/office/drawing/2015/9/8/chartex" xmlns="" val="1"/>
+                  <adec:decorative xmlns="" xmlns:cx1="http://schemas.microsoft.com/office/drawing/2015/9/8/chartex" xmlns:cx2="http://schemas.microsoft.com/office/drawing/2015/10/21/chartex" xmlns:cx3="http://schemas.microsoft.com/office/drawing/2016/5/9/chartex" xmlns:cx4="http://schemas.microsoft.com/office/drawing/2016/5/10/chartex" xmlns:cx5="http://schemas.microsoft.com/office/drawing/2016/5/11/chartex" xmlns:cx6="http://schemas.microsoft.com/office/drawing/2016/5/12/chartex" xmlns:cx7="http://schemas.microsoft.com/office/drawing/2016/5/13/chartex" xmlns:cx8="http://schemas.microsoft.com/office/drawing/2016/5/14/chartex" xmlns:aink="http://schemas.microsoft.com/office/drawing/2016/ink" xmlns:am3d="http://schemas.microsoft.com/office/drawing/2017/model3d" xmlns:o="urn:schemas-microsoft-com:office:office" xmlns:oel="http://schemas.microsoft.com/office/2019/extlst" xmlns:v="urn:schemas-microsoft-com:vml" xmlns:w10="urn:schemas-microsoft-com:office:word" xmlns:w="http://schemas.openxmlformats.org/wordprocessingml/2006/main" xmlns:w16cex="http://schemas.microsoft.com/office/word/2018/wordml/cex" xmlns:w16cid="http://schemas.microsoft.com/office/word/2016/wordml/cid" xmlns:w16="http://schemas.microsoft.com/office/word/2018/wordml" xmlns:w16du="http://schemas.microsoft.com/office/word/2023/wordml/word16du" xmlns:w16sdtdh="http://schemas.microsoft.com/office/word/2020/wordml/sdtdatahash" xmlns:w16sdtfl="http://schemas.microsoft.com/office/word/2024/wordml/sdtformatlock" xmlns:adec="http://schemas.microsoft.com/office/drawing/2017/decorative" val="1"/>
                 </a:ext>
               </a:extLst>
             </wp:docPr>
@@ -3931,7 +4230,7 @@
                     <pic:cNvPr id="1623593727" name="Picture 1">
                       <a:extLst>
                         <a:ext uri="{C183D7F6-B498-43B3-948B-1728B52AA6E4}">
-                          <adec:decorative xmlns:adec="http://schemas.microsoft.com/office/drawing/2017/decorative" xmlns:w16sdtfl="http://schemas.microsoft.com/office/word/2024/wordml/sdtformatlock" xmlns:w16sdtdh="http://schemas.microsoft.com/office/word/2020/wordml/sdtdatahash" xmlns:w16du="http://schemas.microsoft.com/office/word/2023/wordml/word16du" xmlns:w16="http://schemas.microsoft.com/office/word/2018/wordml" xmlns:w16cid="http://schemas.microsoft.com/office/word/2016/wordml/cid" xmlns:w16cex="http://schemas.microsoft.com/office/word/2018/wordml/cex" xmlns:w="http://schemas.openxmlformats.org/wordprocessingml/2006/main" xmlns:w10="urn:schemas-microsoft-com:office:word" xmlns:v="urn:schemas-microsoft-com:vml" xmlns:oel="http://schemas.microsoft.com/office/2019/extlst" xmlns:o="urn:schemas-microsoft-com:office:office" xmlns:am3d="http://schemas.microsoft.com/office/drawing/2017/model3d" xmlns:aink="http://schemas.microsoft.com/office/drawing/2016/ink" xmlns:cx8="http://schemas.microsoft.com/office/drawing/2016/5/14/chartex" xmlns:cx7="http://schemas.microsoft.com/office/drawing/2016/5/13/chartex" xmlns:cx6="http://schemas.microsoft.com/office/drawing/2016/5/12/chartex" xmlns:cx5="http://schemas.microsoft.com/office/drawing/2016/5/11/chartex" xmlns:cx4="http://schemas.microsoft.com/office/drawing/2016/5/10/chartex" xmlns:cx3="http://schemas.microsoft.com/office/drawing/2016/5/9/chartex" xmlns:cx2="http://schemas.microsoft.com/office/drawing/2015/10/21/chartex" xmlns:cx1="http://schemas.microsoft.com/office/drawing/2015/9/8/chartex" xmlns="" val="1"/>
+                          <adec:decorative xmlns="" xmlns:cx1="http://schemas.microsoft.com/office/drawing/2015/9/8/chartex" xmlns:cx2="http://schemas.microsoft.com/office/drawing/2015/10/21/chartex" xmlns:cx3="http://schemas.microsoft.com/office/drawing/2016/5/9/chartex" xmlns:cx4="http://schemas.microsoft.com/office/drawing/2016/5/10/chartex" xmlns:cx5="http://schemas.microsoft.com/office/drawing/2016/5/11/chartex" xmlns:cx6="http://schemas.microsoft.com/office/drawing/2016/5/12/chartex" xmlns:cx7="http://schemas.microsoft.com/office/drawing/2016/5/13/chartex" xmlns:cx8="http://schemas.microsoft.com/office/drawing/2016/5/14/chartex" xmlns:aink="http://schemas.microsoft.com/office/drawing/2016/ink" xmlns:am3d="http://schemas.microsoft.com/office/drawing/2017/model3d" xmlns:o="urn:schemas-microsoft-com:office:office" xmlns:oel="http://schemas.microsoft.com/office/2019/extlst" xmlns:v="urn:schemas-microsoft-com:vml" xmlns:w10="urn:schemas-microsoft-com:office:word" xmlns:w="http://schemas.openxmlformats.org/wordprocessingml/2006/main" xmlns:w16cex="http://schemas.microsoft.com/office/word/2018/wordml/cex" xmlns:w16cid="http://schemas.microsoft.com/office/word/2016/wordml/cid" xmlns:w16="http://schemas.microsoft.com/office/word/2018/wordml" xmlns:w16du="http://schemas.microsoft.com/office/word/2023/wordml/word16du" xmlns:w16sdtdh="http://schemas.microsoft.com/office/word/2020/wordml/sdtdatahash" xmlns:w16sdtfl="http://schemas.microsoft.com/office/word/2024/wordml/sdtformatlock" xmlns:adec="http://schemas.microsoft.com/office/drawing/2017/decorative" val="1"/>
                         </a:ext>
                       </a:extLst>
                     </pic:cNvPr>
@@ -3940,7 +4239,7 @@
                     </pic:cNvPicPr>
                   </pic:nvPicPr>
                   <pic:blipFill>
-                    <a:blip r:embed="rId19" cstate="print">
+                    <a:blip r:embed="rId20" cstate="print">
                       <a:extLst>
                         <a:ext uri="{28A0092B-C50C-407E-A947-70E740481C1C}">
                           <a14:useLocalDpi xmlns:a14="http://schemas.microsoft.com/office/drawing/2010/main" val="0"/>
@@ -4207,7 +4506,7 @@
                     </pic:cNvPicPr>
                   </pic:nvPicPr>
                   <pic:blipFill>
-                    <a:blip r:embed="rId20" cstate="print">
+                    <a:blip r:embed="rId21" cstate="print">
                       <a:extLst>
                         <a:ext uri="{28A0092B-C50C-407E-A947-70E740481C1C}">
                           <a14:useLocalDpi xmlns:a14="http://schemas.microsoft.com/office/drawing/2010/main" val="0"/>
@@ -4249,7 +4548,7 @@
       </w:pPr>
     </w:p>
     <w:sectPr>
-      <w:headerReference w:type="default" r:id="rId21"/>
+      <w:headerReference w:type="default" r:id="rId22"/>
       <w:pgSz w:w="12240" w:h="15840"/>
       <w:pgMar w:top="720" w:right="720" w:bottom="720" w:left="720" w:header="720" w:footer="360" w:gutter="0"/>
       <w:cols w:space="720"/>
@@ -4350,7 +4649,7 @@
             </wp:anchor>
           </w:drawing>
         </mc:Choice>
-        <mc:Fallback xmlns:w16sdtfl="http://schemas.microsoft.com/office/word/2024/wordml/sdtformatlock" xmlns:w16sdtdh="http://schemas.microsoft.com/office/word/2020/wordml/sdtdatahash" xmlns:w16du="http://schemas.microsoft.com/office/word/2023/wordml/word16du" xmlns:w16="http://schemas.microsoft.com/office/word/2018/wordml" xmlns:w16cid="http://schemas.microsoft.com/office/word/2016/wordml/cid" xmlns:w16cex="http://schemas.microsoft.com/office/word/2018/wordml/cex" xmlns:oel="http://schemas.microsoft.com/office/2019/extlst" xmlns:am3d="http://schemas.microsoft.com/office/drawing/2017/model3d" xmlns:aink="http://schemas.microsoft.com/office/drawing/2016/ink" xmlns:cx8="http://schemas.microsoft.com/office/drawing/2016/5/14/chartex" xmlns:cx7="http://schemas.microsoft.com/office/drawing/2016/5/13/chartex" xmlns:cx6="http://schemas.microsoft.com/office/drawing/2016/5/12/chartex" xmlns:cx5="http://schemas.microsoft.com/office/drawing/2016/5/11/chartex" xmlns:cx4="http://schemas.microsoft.com/office/drawing/2016/5/10/chartex" xmlns:cx3="http://schemas.microsoft.com/office/drawing/2016/5/9/chartex" xmlns:cx2="http://schemas.microsoft.com/office/drawing/2015/10/21/chartex" xmlns:cx1="http://schemas.microsoft.com/office/drawing/2015/9/8/chartex">
+        <mc:Fallback xmlns:cx1="http://schemas.microsoft.com/office/drawing/2015/9/8/chartex" xmlns:cx2="http://schemas.microsoft.com/office/drawing/2015/10/21/chartex" xmlns:cx3="http://schemas.microsoft.com/office/drawing/2016/5/9/chartex" xmlns:cx4="http://schemas.microsoft.com/office/drawing/2016/5/10/chartex" xmlns:cx5="http://schemas.microsoft.com/office/drawing/2016/5/11/chartex" xmlns:cx6="http://schemas.microsoft.com/office/drawing/2016/5/12/chartex" xmlns:cx7="http://schemas.microsoft.com/office/drawing/2016/5/13/chartex" xmlns:cx8="http://schemas.microsoft.com/office/drawing/2016/5/14/chartex" xmlns:aink="http://schemas.microsoft.com/office/drawing/2016/ink" xmlns:am3d="http://schemas.microsoft.com/office/drawing/2017/model3d" xmlns:oel="http://schemas.microsoft.com/office/2019/extlst" xmlns:w16cex="http://schemas.microsoft.com/office/word/2018/wordml/cex" xmlns:w16cid="http://schemas.microsoft.com/office/word/2016/wordml/cid" xmlns:w16="http://schemas.microsoft.com/office/word/2018/wordml" xmlns:w16du="http://schemas.microsoft.com/office/word/2023/wordml/word16du" xmlns:w16sdtdh="http://schemas.microsoft.com/office/word/2020/wordml/sdtdatahash" xmlns:w16sdtfl="http://schemas.microsoft.com/office/word/2024/wordml/sdtformatlock">
           <w:pict>
             <v:line w14:anchorId="76512BE5" id="Straight Connector 1" o:spid="_x0000_s1026" style="position:absolute;z-index:-251657728;visibility:visible;mso-wrap-style:square;mso-wrap-distance-left:0;mso-wrap-distance-top:0;mso-wrap-distance-right:0;mso-wrap-distance-bottom:0;mso-position-horizontal:absolute;mso-position-horizontal-relative:text;mso-position-vertical:absolute;mso-position-vertical-relative:text" from="-1.05pt,-7.65pt" to="521.4pt,-7.55pt" o:gfxdata="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" strokecolor="#4a7ebb"/>
           </w:pict>
@@ -4413,7 +4712,7 @@
         <w:rFonts w:ascii="Cambria" w:eastAsia="PMingLiU" w:hAnsi="Cambria"/>
         <w:noProof/>
       </w:rPr>
-      <w:t>5</w:t>
+      <w:t>6</w:t>
     </w:r>
     <w:r>
       <w:rPr>
@@ -6473,6 +6772,33 @@
       <w:color w:val="666666"/>
     </w:rPr>
   </w:style>
+  <w:style w:type="paragraph" w:styleId="NormalWeb">
+    <w:name w:val="Normal (Web)"/>
+    <w:basedOn w:val="Normal"/>
+    <w:uiPriority w:val="99"/>
+    <w:unhideWhenUsed/>
+    <w:rsid w:val="00777CFA"/>
+    <w:pPr>
+      <w:spacing w:before="100" w:beforeAutospacing="1" w:after="100" w:afterAutospacing="1" w:line="240" w:lineRule="auto"/>
+    </w:pPr>
+    <w:rPr>
+      <w:rFonts w:ascii="Times New Roman" w:eastAsia="Times New Roman" w:hAnsi="Times New Roman" w:cs="Times New Roman"/>
+      <w:sz w:val="24"/>
+      <w:szCs w:val="24"/>
+      <w:lang w:eastAsia="en-US"/>
+    </w:rPr>
+  </w:style>
+  <w:style w:type="character" w:styleId="Strong">
+    <w:name w:val="Strong"/>
+    <w:basedOn w:val="DefaultParagraphFont"/>
+    <w:uiPriority w:val="22"/>
+    <w:qFormat/>
+    <w:rsid w:val="00777CFA"/>
+    <w:rPr>
+      <w:b/>
+      <w:bCs/>
+    </w:rPr>
+  </w:style>
 </w:styles>
 </file>
 
@@ -6766,7 +7092,7 @@
 </file>
 
 <file path=customXml/itemProps1.xml><?xml version="1.0" encoding="utf-8"?>
-<ds:datastoreItem xmlns:ds="http://schemas.openxmlformats.org/officeDocument/2006/customXml" ds:itemID="{22B6259E-3756-49BA-8FFB-FF5761F701E2}">
+<ds:datastoreItem xmlns:ds="http://schemas.openxmlformats.org/officeDocument/2006/customXml" ds:itemID="{B62908E9-3FE5-49A4-A47C-3F5C16896D8F}">
   <ds:schemaRefs>
     <ds:schemaRef ds:uri="http://schemas.openxmlformats.org/officeDocument/2006/bibliography"/>
   </ds:schemaRefs>

</xml_diff>

<commit_message>
adjust spacing on form output message. issue #33
</commit_message>
<xml_diff>
--- a/docassemble/MichiganFoodStampCalculator/data/templates/snap-summary.docx
+++ b/docassemble/MichiganFoodStampCalculator/data/templates/snap-summary.docx
@@ -254,18 +254,11 @@
         </w:rPr>
         <w:t xml:space="preserve"> seem to be eligible for food stamp (FAP) benefits.</w:t>
       </w:r>
-    </w:p>
-    <w:p>
-      <w:pPr>
-        <w:spacing w:after="140"/>
-      </w:pPr>
-      <w:r>
-        <w:t>{%p</w:t>
-      </w:r>
-      <w:bookmarkStart w:id="0" w:name="_GoBack"/>
-      <w:bookmarkEnd w:id="0"/>
-      <w:r>
-        <w:t xml:space="preserve"> if </w:t>
+      <w:r>
+        <w:t xml:space="preserve"> </w:t>
+      </w:r>
+      <w:r>
+        <w:t xml:space="preserve">{% if </w:t>
       </w:r>
       <w:proofErr w:type="spellStart"/>
       <w:r>
@@ -289,13 +282,12 @@
       </w:r>
       <w:proofErr w:type="spellEnd"/>
       <w:r>
-        <w:t xml:space="preserve"> == “FAILED” %}</w:t>
-      </w:r>
-    </w:p>
-    <w:p>
-      <w:pPr>
-        <w:spacing w:after="140"/>
-      </w:pPr>
+        <w:t xml:space="preserve"> == “FAILED” </w:t>
+      </w:r>
+      <w:proofErr w:type="gramStart"/>
+      <w:r>
+        <w:t>%}</w:t>
+      </w:r>
       <w:r>
         <w:rPr>
           <w:rFonts w:ascii="Segoe UI" w:hAnsi="Segoe UI" w:cs="Segoe UI"/>
@@ -303,54 +295,9 @@
           <w:sz w:val="21"/>
           <w:szCs w:val="21"/>
         </w:rPr>
-        <w:t>This is because your household's gross and net income both appear to be higher than the allowed levels.</w:t>
-      </w:r>
-    </w:p>
-    <w:p>
-      <w:pPr>
-        <w:spacing w:after="140"/>
-      </w:pPr>
-      <w:r>
-        <w:t xml:space="preserve">{%p </w:t>
-      </w:r>
-      <w:proofErr w:type="spellStart"/>
-      <w:r>
-        <w:t>el</w:t>
-      </w:r>
-      <w:r>
-        <w:t>if</w:t>
-      </w:r>
-      <w:proofErr w:type="spellEnd"/>
-      <w:r>
-        <w:t xml:space="preserve"> </w:t>
-      </w:r>
-      <w:proofErr w:type="spellStart"/>
-      <w:r>
-        <w:t>ElderlyOrDisabled</w:t>
-      </w:r>
-      <w:proofErr w:type="spellEnd"/>
-      <w:r>
-        <w:t xml:space="preserve"> == “</w:t>
-      </w:r>
-      <w:r>
-        <w:t>No</w:t>
-      </w:r>
-      <w:r>
-        <w:t xml:space="preserve">” and </w:t>
-      </w:r>
-      <w:proofErr w:type="spellStart"/>
-      <w:r>
-        <w:t>GITResult</w:t>
-      </w:r>
-      <w:proofErr w:type="spellEnd"/>
-      <w:r>
-        <w:t xml:space="preserve"> == “FAILED” %}</w:t>
-      </w:r>
-    </w:p>
-    <w:p>
-      <w:pPr>
-        <w:spacing w:after="140"/>
-      </w:pPr>
+        <w:t>This</w:t>
+      </w:r>
+      <w:proofErr w:type="gramEnd"/>
       <w:r>
         <w:rPr>
           <w:rFonts w:ascii="Segoe UI" w:hAnsi="Segoe UI" w:cs="Segoe UI"/>
@@ -358,7 +305,7 @@
           <w:sz w:val="21"/>
           <w:szCs w:val="21"/>
         </w:rPr>
-        <w:t>This is because your household's gross income appears to be higher than 200% of the federal poverty level</w:t>
+        <w:t xml:space="preserve"> is because your household's gross and net income both appear to be higher than the allowed levels.</w:t>
       </w:r>
       <w:r>
         <w:rPr>
@@ -367,21 +314,48 @@
           <w:sz w:val="21"/>
           <w:szCs w:val="21"/>
         </w:rPr>
-        <w:t xml:space="preserve">. </w:t>
-      </w:r>
-    </w:p>
-    <w:p>
-      <w:pPr>
-        <w:spacing w:after="140"/>
-      </w:pPr>
-      <w:r>
-        <w:t>{%p else %}</w:t>
-      </w:r>
-    </w:p>
-    <w:p>
-      <w:pPr>
-        <w:spacing w:after="140"/>
-      </w:pPr>
+        <w:t xml:space="preserve"> </w:t>
+      </w:r>
+      <w:r>
+        <w:t xml:space="preserve">{% </w:t>
+      </w:r>
+      <w:proofErr w:type="spellStart"/>
+      <w:r>
+        <w:t>el</w:t>
+      </w:r>
+      <w:r>
+        <w:t>if</w:t>
+      </w:r>
+      <w:proofErr w:type="spellEnd"/>
+      <w:r>
+        <w:t xml:space="preserve"> </w:t>
+      </w:r>
+      <w:proofErr w:type="spellStart"/>
+      <w:r>
+        <w:t>ElderlyOrDisabled</w:t>
+      </w:r>
+      <w:proofErr w:type="spellEnd"/>
+      <w:r>
+        <w:t xml:space="preserve"> == “</w:t>
+      </w:r>
+      <w:r>
+        <w:t>No</w:t>
+      </w:r>
+      <w:r>
+        <w:t xml:space="preserve">” and </w:t>
+      </w:r>
+      <w:proofErr w:type="spellStart"/>
+      <w:r>
+        <w:t>GITResult</w:t>
+      </w:r>
+      <w:proofErr w:type="spellEnd"/>
+      <w:r>
+        <w:t xml:space="preserve"> == “FAILED” </w:t>
+      </w:r>
+      <w:proofErr w:type="gramStart"/>
+      <w:r>
+        <w:t>%}</w:t>
+      </w:r>
       <w:r>
         <w:rPr>
           <w:rFonts w:ascii="Segoe UI" w:hAnsi="Segoe UI" w:cs="Segoe UI"/>
@@ -389,8 +363,9 @@
           <w:sz w:val="21"/>
           <w:szCs w:val="21"/>
         </w:rPr>
-        <w:t>At your household income level, the benefit amount would likely be $0.</w:t>
-      </w:r>
+        <w:t>This</w:t>
+      </w:r>
+      <w:proofErr w:type="gramEnd"/>
       <w:r>
         <w:rPr>
           <w:rFonts w:ascii="Segoe UI" w:hAnsi="Segoe UI" w:cs="Segoe UI"/>
@@ -398,15 +373,54 @@
           <w:sz w:val="21"/>
           <w:szCs w:val="21"/>
         </w:rPr>
+        <w:t xml:space="preserve"> is because your household's gross income appears to be higher than 200% of the federal poverty level</w:t>
+      </w:r>
+      <w:r>
+        <w:rPr>
+          <w:rFonts w:ascii="Segoe UI" w:hAnsi="Segoe UI" w:cs="Segoe UI"/>
+          <w:color w:val="1F2328"/>
+          <w:sz w:val="21"/>
+          <w:szCs w:val="21"/>
+        </w:rPr>
+        <w:t xml:space="preserve">. </w:t>
+      </w:r>
+      <w:r>
+        <w:t xml:space="preserve">{% else </w:t>
+      </w:r>
+      <w:proofErr w:type="gramStart"/>
+      <w:r>
+        <w:t>%}</w:t>
+      </w:r>
+      <w:r>
+        <w:rPr>
+          <w:rFonts w:ascii="Segoe UI" w:hAnsi="Segoe UI" w:cs="Segoe UI"/>
+          <w:color w:val="1F2328"/>
+          <w:sz w:val="21"/>
+          <w:szCs w:val="21"/>
+        </w:rPr>
+        <w:t>At</w:t>
+      </w:r>
+      <w:proofErr w:type="gramEnd"/>
+      <w:r>
+        <w:rPr>
+          <w:rFonts w:ascii="Segoe UI" w:hAnsi="Segoe UI" w:cs="Segoe UI"/>
+          <w:color w:val="1F2328"/>
+          <w:sz w:val="21"/>
+          <w:szCs w:val="21"/>
+        </w:rPr>
+        <w:t xml:space="preserve"> your household income level, the benefit amount would likely be $0.</w:t>
+      </w:r>
+      <w:r>
+        <w:rPr>
+          <w:rFonts w:ascii="Segoe UI" w:hAnsi="Segoe UI" w:cs="Segoe UI"/>
+          <w:color w:val="1F2328"/>
+          <w:sz w:val="21"/>
+          <w:szCs w:val="21"/>
+        </w:rPr>
         <w:t xml:space="preserve"> </w:t>
       </w:r>
-    </w:p>
-    <w:p>
-      <w:pPr>
-        <w:spacing w:after="140"/>
-      </w:pPr>
-      <w:r>
-        <w:t xml:space="preserve">{%p </w:t>
+      <w:r>
+        <w:t xml:space="preserve">{% </w:t>
       </w:r>
       <w:proofErr w:type="spellStart"/>
       <w:r>
@@ -416,6 +430,8 @@
       <w:r>
         <w:t xml:space="preserve"> %}</w:t>
       </w:r>
+      <w:bookmarkStart w:id="0" w:name="_GoBack"/>
+      <w:bookmarkEnd w:id="0"/>
     </w:p>
     <w:p>
       <w:pPr>
@@ -922,7 +938,6 @@
               </w:rPr>
             </w:pPr>
             <w:r>
-              <w:lastRenderedPageBreak/>
               <w:t xml:space="preserve">{%p if </w:t>
             </w:r>
             <w:proofErr w:type="spellStart"/>
@@ -1040,6 +1055,7 @@
               </w:rPr>
             </w:pPr>
             <w:r>
+              <w:lastRenderedPageBreak/>
               <w:t>{%p endif %}</w:t>
             </w:r>
           </w:p>
@@ -1800,7 +1816,6 @@
         <w:spacing w:after="140"/>
       </w:pPr>
       <w:r>
-        <w:lastRenderedPageBreak/>
         <w:t xml:space="preserve">Visit </w:t>
       </w:r>
       <w:hyperlink r:id="rId13" w:history="1">
@@ -7092,7 +7107,7 @@
 </file>
 
 <file path=customXml/itemProps1.xml><?xml version="1.0" encoding="utf-8"?>
-<ds:datastoreItem xmlns:ds="http://schemas.openxmlformats.org/officeDocument/2006/customXml" ds:itemID="{B62908E9-3FE5-49A4-A47C-3F5C16896D8F}">
+<ds:datastoreItem xmlns:ds="http://schemas.openxmlformats.org/officeDocument/2006/customXml" ds:itemID="{E592F88B-78E1-4BA7-82AD-77E66525E8EF}">
   <ds:schemaRefs>
     <ds:schemaRef ds:uri="http://schemas.openxmlformats.org/officeDocument/2006/bibliography"/>
   </ds:schemaRefs>

</xml_diff>

<commit_message>
advanced to 1.0.0, pre-launch tweaks; adjust email to self; fix collapsed help text showing up with different font
</commit_message>
<xml_diff>
--- a/docassemble/MichiganFoodStampCalculator/data/templates/snap-summary.docx
+++ b/docassemble/MichiganFoodStampCalculator/data/templates/snap-summary.docx
@@ -122,219 +122,516 @@
     <w:p>
       <w:pPr>
         <w:spacing w:after="140"/>
-      </w:pPr>
-      <w:r>
+        <w:rPr>
+          <w:rFonts w:cstheme="minorHAnsi"/>
+          <w:sz w:val="24"/>
+          <w:szCs w:val="24"/>
+        </w:rPr>
+      </w:pPr>
+      <w:r>
+        <w:rPr>
+          <w:rFonts w:cstheme="minorHAnsi"/>
+          <w:sz w:val="24"/>
+          <w:szCs w:val="24"/>
+        </w:rPr>
         <w:t>{%</w:t>
       </w:r>
       <w:r>
+        <w:rPr>
+          <w:rFonts w:cstheme="minorHAnsi"/>
+          <w:sz w:val="24"/>
+          <w:szCs w:val="24"/>
+        </w:rPr>
         <w:t>p</w:t>
       </w:r>
       <w:r>
+        <w:rPr>
+          <w:rFonts w:cstheme="minorHAnsi"/>
+          <w:sz w:val="24"/>
+          <w:szCs w:val="24"/>
+        </w:rPr>
         <w:t xml:space="preserve"> if </w:t>
       </w:r>
       <w:proofErr w:type="spellStart"/>
       <w:r>
+        <w:rPr>
+          <w:rFonts w:cstheme="minorHAnsi"/>
+          <w:sz w:val="24"/>
+          <w:szCs w:val="24"/>
+        </w:rPr>
         <w:t>FinalResult</w:t>
       </w:r>
       <w:proofErr w:type="spellEnd"/>
       <w:r>
-        <w:t xml:space="preserve"> &gt; 0 %}</w:t>
-      </w:r>
+        <w:rPr>
+          <w:rFonts w:cstheme="minorHAnsi"/>
+          <w:sz w:val="24"/>
+          <w:szCs w:val="24"/>
+        </w:rPr>
+        <w:t xml:space="preserve"> &gt; </w:t>
+      </w:r>
+      <w:proofErr w:type="gramStart"/>
+      <w:r>
+        <w:rPr>
+          <w:rFonts w:cstheme="minorHAnsi"/>
+          <w:sz w:val="24"/>
+          <w:szCs w:val="24"/>
+        </w:rPr>
+        <w:t>0 %}</w:t>
+      </w:r>
+      <w:proofErr w:type="gramEnd"/>
     </w:p>
     <w:p>
       <w:pPr>
         <w:spacing w:after="140"/>
-      </w:pPr>
-      <w:r>
+        <w:rPr>
+          <w:rFonts w:cstheme="minorHAnsi"/>
+          <w:sz w:val="24"/>
+          <w:szCs w:val="24"/>
+        </w:rPr>
+      </w:pPr>
+      <w:r>
+        <w:rPr>
+          <w:rFonts w:cstheme="minorHAnsi"/>
+          <w:sz w:val="24"/>
+          <w:szCs w:val="24"/>
+        </w:rPr>
         <w:t xml:space="preserve">Based on the information you gave, your </w:t>
       </w:r>
       <w:r>
         <w:rPr>
+          <w:rFonts w:cstheme="minorHAnsi"/>
           <w:b/>
+          <w:sz w:val="24"/>
+          <w:szCs w:val="24"/>
         </w:rPr>
         <w:t>estimated</w:t>
       </w:r>
       <w:r>
-        <w:t xml:space="preserve"> food stamp allotment is </w:t>
-      </w:r>
-      <w:r>
-        <w:rPr>
+        <w:rPr>
+          <w:rFonts w:cstheme="minorHAnsi"/>
+          <w:sz w:val="24"/>
+          <w:szCs w:val="24"/>
+        </w:rPr>
+        <w:t xml:space="preserve"> food stamp a</w:t>
+      </w:r>
+      <w:r>
+        <w:rPr>
+          <w:rFonts w:cstheme="minorHAnsi"/>
+          <w:sz w:val="24"/>
+          <w:szCs w:val="24"/>
+        </w:rPr>
+        <w:t>mount</w:t>
+      </w:r>
+      <w:r>
+        <w:rPr>
+          <w:rFonts w:cstheme="minorHAnsi"/>
+          <w:sz w:val="24"/>
+          <w:szCs w:val="24"/>
+        </w:rPr>
+        <w:t xml:space="preserve"> is </w:t>
+      </w:r>
+      <w:r>
+        <w:rPr>
+          <w:rFonts w:cstheme="minorHAnsi"/>
           <w:b/>
-        </w:rPr>
-        <w:t>${{ (</w:t>
+          <w:sz w:val="24"/>
+          <w:szCs w:val="24"/>
+        </w:rPr>
+        <w:t>$</w:t>
+      </w:r>
+      <w:proofErr w:type="gramStart"/>
+      <w:r>
+        <w:rPr>
+          <w:rFonts w:cstheme="minorHAnsi"/>
+          <w:b/>
+          <w:sz w:val="24"/>
+          <w:szCs w:val="24"/>
+        </w:rPr>
+        <w:t>{{ (</w:t>
       </w:r>
       <w:proofErr w:type="spellStart"/>
-      <w:r>
-        <w:rPr>
+      <w:proofErr w:type="gramEnd"/>
+      <w:r>
+        <w:rPr>
+          <w:rFonts w:cstheme="minorHAnsi"/>
           <w:b/>
+          <w:sz w:val="24"/>
+          <w:szCs w:val="24"/>
         </w:rPr>
         <w:t>FinalResult</w:t>
       </w:r>
       <w:proofErr w:type="spellEnd"/>
       <w:r>
         <w:rPr>
+          <w:rFonts w:cstheme="minorHAnsi"/>
           <w:b/>
+          <w:sz w:val="24"/>
+          <w:szCs w:val="24"/>
         </w:rPr>
         <w:t>)|</w:t>
       </w:r>
       <w:proofErr w:type="spellStart"/>
       <w:r>
         <w:rPr>
+          <w:rFonts w:cstheme="minorHAnsi"/>
           <w:b/>
-        </w:rPr>
-        <w:t>round|int</w:t>
+          <w:sz w:val="24"/>
+          <w:szCs w:val="24"/>
+        </w:rPr>
+        <w:t>round|</w:t>
+      </w:r>
+      <w:proofErr w:type="gramStart"/>
+      <w:r>
+        <w:rPr>
+          <w:rFonts w:cstheme="minorHAnsi"/>
+          <w:b/>
+          <w:sz w:val="24"/>
+          <w:szCs w:val="24"/>
+        </w:rPr>
+        <w:t>int</w:t>
       </w:r>
       <w:proofErr w:type="spellEnd"/>
       <w:r>
         <w:rPr>
+          <w:rFonts w:cstheme="minorHAnsi"/>
           <w:b/>
-        </w:rPr>
-        <w:t xml:space="preserve"> }} per month</w:t>
-      </w:r>
-      <w:r>
+          <w:sz w:val="24"/>
+          <w:szCs w:val="24"/>
+        </w:rPr>
+        <w:t xml:space="preserve"> }</w:t>
+      </w:r>
+      <w:proofErr w:type="gramEnd"/>
+      <w:r>
+        <w:rPr>
+          <w:rFonts w:cstheme="minorHAnsi"/>
+          <w:b/>
+          <w:sz w:val="24"/>
+          <w:szCs w:val="24"/>
+        </w:rPr>
+        <w:t>} per month</w:t>
+      </w:r>
+      <w:r>
+        <w:rPr>
+          <w:rFonts w:cstheme="minorHAnsi"/>
+          <w:sz w:val="24"/>
+          <w:szCs w:val="24"/>
+        </w:rPr>
         <w:t>. This amount is only an estimate - there is no guarantee that you will receive this amount.</w:t>
       </w:r>
     </w:p>
     <w:p>
       <w:pPr>
         <w:spacing w:after="140"/>
-      </w:pPr>
-      <w:r>
-        <w:t>{%p else %}</w:t>
-      </w:r>
+        <w:rPr>
+          <w:rFonts w:cstheme="minorHAnsi"/>
+          <w:sz w:val="24"/>
+          <w:szCs w:val="24"/>
+        </w:rPr>
+      </w:pPr>
+      <w:r>
+        <w:rPr>
+          <w:rFonts w:cstheme="minorHAnsi"/>
+          <w:sz w:val="24"/>
+          <w:szCs w:val="24"/>
+        </w:rPr>
+        <w:t xml:space="preserve">{%p </w:t>
+      </w:r>
+      <w:proofErr w:type="gramStart"/>
+      <w:r>
+        <w:rPr>
+          <w:rFonts w:cstheme="minorHAnsi"/>
+          <w:sz w:val="24"/>
+          <w:szCs w:val="24"/>
+        </w:rPr>
+        <w:t>else %}</w:t>
+      </w:r>
+      <w:proofErr w:type="gramEnd"/>
     </w:p>
     <w:p>
       <w:pPr>
         <w:spacing w:after="140"/>
-      </w:pPr>
-      <w:r>
-        <w:rPr>
-          <w:rFonts w:ascii="Segoe UI" w:hAnsi="Segoe UI" w:cs="Segoe UI"/>
+        <w:rPr>
+          <w:rFonts w:cstheme="minorHAnsi"/>
+          <w:sz w:val="24"/>
+          <w:szCs w:val="24"/>
+        </w:rPr>
+      </w:pPr>
+      <w:r>
+        <w:rPr>
+          <w:rFonts w:cstheme="minorHAnsi"/>
           <w:color w:val="1F2328"/>
-          <w:sz w:val="21"/>
-          <w:szCs w:val="21"/>
+          <w:sz w:val="24"/>
+          <w:szCs w:val="24"/>
         </w:rPr>
         <w:t xml:space="preserve">Based on the information you gave, you do </w:t>
       </w:r>
       <w:r>
         <w:rPr>
           <w:rStyle w:val="Strong"/>
-          <w:rFonts w:ascii="Segoe UI" w:hAnsi="Segoe UI" w:cs="Segoe UI"/>
+          <w:rFonts w:cstheme="minorHAnsi"/>
           <w:color w:val="1F2328"/>
-          <w:sz w:val="21"/>
-          <w:szCs w:val="21"/>
+          <w:sz w:val="24"/>
+          <w:szCs w:val="24"/>
         </w:rPr>
         <w:t>not</w:t>
       </w:r>
       <w:r>
         <w:rPr>
-          <w:rFonts w:ascii="Segoe UI" w:hAnsi="Segoe UI" w:cs="Segoe UI"/>
+          <w:rFonts w:cstheme="minorHAnsi"/>
           <w:color w:val="1F2328"/>
-          <w:sz w:val="21"/>
-          <w:szCs w:val="21"/>
+          <w:sz w:val="24"/>
+          <w:szCs w:val="24"/>
         </w:rPr>
         <w:t xml:space="preserve"> seem to be eligible for food stamp (FAP) benefits.</w:t>
       </w:r>
       <w:r>
+        <w:rPr>
+          <w:rFonts w:cstheme="minorHAnsi"/>
+          <w:sz w:val="24"/>
+          <w:szCs w:val="24"/>
+        </w:rPr>
         <w:t xml:space="preserve"> </w:t>
       </w:r>
       <w:r>
+        <w:rPr>
+          <w:rFonts w:cstheme="minorHAnsi"/>
+          <w:sz w:val="24"/>
+          <w:szCs w:val="24"/>
+        </w:rPr>
         <w:t xml:space="preserve">{% if </w:t>
       </w:r>
       <w:proofErr w:type="spellStart"/>
       <w:r>
+        <w:rPr>
+          <w:rFonts w:cstheme="minorHAnsi"/>
+          <w:sz w:val="24"/>
+          <w:szCs w:val="24"/>
+        </w:rPr>
         <w:t>ElderlyOrDisabled</w:t>
       </w:r>
       <w:proofErr w:type="spellEnd"/>
       <w:r>
+        <w:rPr>
+          <w:rFonts w:cstheme="minorHAnsi"/>
+          <w:sz w:val="24"/>
+          <w:szCs w:val="24"/>
+        </w:rPr>
         <w:t xml:space="preserve"> == “Yes” and </w:t>
       </w:r>
       <w:proofErr w:type="spellStart"/>
       <w:r>
+        <w:rPr>
+          <w:rFonts w:cstheme="minorHAnsi"/>
+          <w:sz w:val="24"/>
+          <w:szCs w:val="24"/>
+        </w:rPr>
         <w:t>GITResult</w:t>
       </w:r>
       <w:proofErr w:type="spellEnd"/>
       <w:r>
+        <w:rPr>
+          <w:rFonts w:cstheme="minorHAnsi"/>
+          <w:sz w:val="24"/>
+          <w:szCs w:val="24"/>
+        </w:rPr>
         <w:t xml:space="preserve"> == “FAILED” and </w:t>
       </w:r>
       <w:proofErr w:type="spellStart"/>
       <w:r>
+        <w:rPr>
+          <w:rFonts w:cstheme="minorHAnsi"/>
+          <w:sz w:val="24"/>
+          <w:szCs w:val="24"/>
+        </w:rPr>
         <w:t>NICTestResult</w:t>
       </w:r>
       <w:proofErr w:type="spellEnd"/>
       <w:r>
-        <w:t xml:space="preserve"> == “FAILED” %}</w:t>
-      </w:r>
-      <w:r>
-        <w:rPr>
-          <w:rFonts w:ascii="Segoe UI" w:hAnsi="Segoe UI" w:cs="Segoe UI"/>
+        <w:rPr>
+          <w:rFonts w:cstheme="minorHAnsi"/>
+          <w:sz w:val="24"/>
+          <w:szCs w:val="24"/>
+        </w:rPr>
+        <w:t xml:space="preserve"> == “FAILED” </w:t>
+      </w:r>
+      <w:proofErr w:type="gramStart"/>
+      <w:r>
+        <w:rPr>
+          <w:rFonts w:cstheme="minorHAnsi"/>
+          <w:sz w:val="24"/>
+          <w:szCs w:val="24"/>
+        </w:rPr>
+        <w:t>%}</w:t>
+      </w:r>
+      <w:r>
+        <w:rPr>
+          <w:rFonts w:cstheme="minorHAnsi"/>
           <w:color w:val="1F2328"/>
-          <w:sz w:val="21"/>
-          <w:szCs w:val="21"/>
-        </w:rPr>
-        <w:t>This is because your household's gross and net income both appear to be higher than the allowed levels.</w:t>
-      </w:r>
-      <w:r>
-        <w:rPr>
-          <w:rFonts w:ascii="Segoe UI" w:hAnsi="Segoe UI" w:cs="Segoe UI"/>
+          <w:sz w:val="24"/>
+          <w:szCs w:val="24"/>
+        </w:rPr>
+        <w:t>This</w:t>
+      </w:r>
+      <w:proofErr w:type="gramEnd"/>
+      <w:r>
+        <w:rPr>
+          <w:rFonts w:cstheme="minorHAnsi"/>
           <w:color w:val="1F2328"/>
-          <w:sz w:val="21"/>
-          <w:szCs w:val="21"/>
+          <w:sz w:val="24"/>
+          <w:szCs w:val="24"/>
+        </w:rPr>
+        <w:t xml:space="preserve"> is because your household's gross and net income both appear to be higher than the allowed levels.</w:t>
+      </w:r>
+      <w:r>
+        <w:rPr>
+          <w:rFonts w:cstheme="minorHAnsi"/>
+          <w:color w:val="1F2328"/>
+          <w:sz w:val="24"/>
+          <w:szCs w:val="24"/>
         </w:rPr>
         <w:t xml:space="preserve"> </w:t>
       </w:r>
       <w:r>
+        <w:rPr>
+          <w:rFonts w:cstheme="minorHAnsi"/>
+          <w:sz w:val="24"/>
+          <w:szCs w:val="24"/>
+        </w:rPr>
         <w:t xml:space="preserve">{% </w:t>
       </w:r>
       <w:proofErr w:type="spellStart"/>
       <w:r>
+        <w:rPr>
+          <w:rFonts w:cstheme="minorHAnsi"/>
+          <w:sz w:val="24"/>
+          <w:szCs w:val="24"/>
+        </w:rPr>
         <w:t>el</w:t>
       </w:r>
       <w:r>
+        <w:rPr>
+          <w:rFonts w:cstheme="minorHAnsi"/>
+          <w:sz w:val="24"/>
+          <w:szCs w:val="24"/>
+        </w:rPr>
         <w:t>if</w:t>
       </w:r>
       <w:proofErr w:type="spellEnd"/>
       <w:r>
+        <w:rPr>
+          <w:rFonts w:cstheme="minorHAnsi"/>
+          <w:sz w:val="24"/>
+          <w:szCs w:val="24"/>
+        </w:rPr>
         <w:t xml:space="preserve"> </w:t>
       </w:r>
       <w:proofErr w:type="spellStart"/>
       <w:r>
+        <w:rPr>
+          <w:rFonts w:cstheme="minorHAnsi"/>
+          <w:sz w:val="24"/>
+          <w:szCs w:val="24"/>
+        </w:rPr>
         <w:t>ElderlyOrDisabled</w:t>
       </w:r>
       <w:proofErr w:type="spellEnd"/>
       <w:r>
+        <w:rPr>
+          <w:rFonts w:cstheme="minorHAnsi"/>
+          <w:sz w:val="24"/>
+          <w:szCs w:val="24"/>
+        </w:rPr>
         <w:t xml:space="preserve"> == “No” and </w:t>
       </w:r>
       <w:proofErr w:type="spellStart"/>
       <w:r>
+        <w:rPr>
+          <w:rFonts w:cstheme="minorHAnsi"/>
+          <w:sz w:val="24"/>
+          <w:szCs w:val="24"/>
+        </w:rPr>
         <w:t>GITResult</w:t>
       </w:r>
       <w:proofErr w:type="spellEnd"/>
       <w:r>
-        <w:t xml:space="preserve"> == “FAILED” %}</w:t>
-      </w:r>
-      <w:r>
-        <w:rPr>
-          <w:rFonts w:ascii="Segoe UI" w:hAnsi="Segoe UI" w:cs="Segoe UI"/>
+        <w:rPr>
+          <w:rFonts w:cstheme="minorHAnsi"/>
+          <w:sz w:val="24"/>
+          <w:szCs w:val="24"/>
+        </w:rPr>
+        <w:t xml:space="preserve"> == “FAILED” </w:t>
+      </w:r>
+      <w:proofErr w:type="gramStart"/>
+      <w:r>
+        <w:rPr>
+          <w:rFonts w:cstheme="minorHAnsi"/>
+          <w:sz w:val="24"/>
+          <w:szCs w:val="24"/>
+        </w:rPr>
+        <w:t>%}</w:t>
+      </w:r>
+      <w:r>
+        <w:rPr>
+          <w:rFonts w:cstheme="minorHAnsi"/>
           <w:color w:val="1F2328"/>
-          <w:sz w:val="21"/>
-          <w:szCs w:val="21"/>
-        </w:rPr>
-        <w:t xml:space="preserve">This is because your household's gross income appears to be higher than 200% of the federal poverty level. </w:t>
-      </w:r>
-      <w:r>
-        <w:t>{% else %}</w:t>
-      </w:r>
-      <w:r>
-        <w:rPr>
-          <w:rFonts w:ascii="Segoe UI" w:hAnsi="Segoe UI" w:cs="Segoe UI"/>
+          <w:sz w:val="24"/>
+          <w:szCs w:val="24"/>
+        </w:rPr>
+        <w:t>This</w:t>
+      </w:r>
+      <w:proofErr w:type="gramEnd"/>
+      <w:r>
+        <w:rPr>
+          <w:rFonts w:cstheme="minorHAnsi"/>
           <w:color w:val="1F2328"/>
-          <w:sz w:val="21"/>
-          <w:szCs w:val="21"/>
-        </w:rPr>
-        <w:t xml:space="preserve">At your household income level, the benefit amount would likely be $0. </w:t>
-      </w:r>
-      <w:r>
+          <w:sz w:val="24"/>
+          <w:szCs w:val="24"/>
+        </w:rPr>
+        <w:t xml:space="preserve"> is because your household's gross income appears to be higher than 200% of the federal poverty level. </w:t>
+      </w:r>
+      <w:r>
+        <w:rPr>
+          <w:rFonts w:cstheme="minorHAnsi"/>
+          <w:sz w:val="24"/>
+          <w:szCs w:val="24"/>
+        </w:rPr>
+        <w:t xml:space="preserve">{% else </w:t>
+      </w:r>
+      <w:proofErr w:type="gramStart"/>
+      <w:r>
+        <w:rPr>
+          <w:rFonts w:cstheme="minorHAnsi"/>
+          <w:sz w:val="24"/>
+          <w:szCs w:val="24"/>
+        </w:rPr>
+        <w:t>%}</w:t>
+      </w:r>
+      <w:r>
+        <w:rPr>
+          <w:rFonts w:cstheme="minorHAnsi"/>
+          <w:color w:val="1F2328"/>
+          <w:sz w:val="24"/>
+          <w:szCs w:val="24"/>
+        </w:rPr>
+        <w:t>At</w:t>
+      </w:r>
+      <w:proofErr w:type="gramEnd"/>
+      <w:r>
+        <w:rPr>
+          <w:rFonts w:cstheme="minorHAnsi"/>
+          <w:color w:val="1F2328"/>
+          <w:sz w:val="24"/>
+          <w:szCs w:val="24"/>
+        </w:rPr>
+        <w:t xml:space="preserve"> your household income level, the benefit amount would likely be $0. </w:t>
+      </w:r>
+      <w:r>
+        <w:rPr>
+          <w:rFonts w:cstheme="minorHAnsi"/>
+          <w:sz w:val="24"/>
+          <w:szCs w:val="24"/>
+        </w:rPr>
         <w:t>{% endif %}</w:t>
       </w:r>
     </w:p>
@@ -344,28 +641,22 @@
         <w:shd w:val="clear" w:color="auto" w:fill="FFFFFF"/>
         <w:spacing w:before="0" w:beforeAutospacing="0" w:after="240" w:afterAutospacing="0"/>
         <w:rPr>
-          <w:rFonts w:ascii="Segoe UI" w:hAnsi="Segoe UI" w:cs="Segoe UI"/>
+          <w:rFonts w:asciiTheme="minorHAnsi" w:hAnsiTheme="minorHAnsi" w:cstheme="minorHAnsi"/>
           <w:color w:val="1F2328"/>
-          <w:sz w:val="21"/>
-          <w:szCs w:val="21"/>
-        </w:rPr>
-      </w:pPr>
-      <w:r>
-        <w:rPr>
-          <w:rFonts w:ascii="Segoe UI" w:hAnsi="Segoe UI" w:cs="Segoe UI"/>
+        </w:rPr>
+      </w:pPr>
+      <w:r>
+        <w:rPr>
+          <w:rFonts w:asciiTheme="minorHAnsi" w:hAnsiTheme="minorHAnsi" w:cstheme="minorHAnsi"/>
           <w:color w:val="1F2328"/>
-          <w:sz w:val="21"/>
-          <w:szCs w:val="21"/>
         </w:rPr>
         <w:t xml:space="preserve">This is just an estimate. </w:t>
       </w:r>
       <w:r>
         <w:rPr>
           <w:rStyle w:val="Strong"/>
-          <w:rFonts w:ascii="Segoe UI" w:hAnsi="Segoe UI" w:cs="Segoe UI"/>
+          <w:rFonts w:asciiTheme="minorHAnsi" w:hAnsiTheme="minorHAnsi" w:cstheme="minorHAnsi"/>
           <w:color w:val="1F2328"/>
-          <w:sz w:val="21"/>
-          <w:szCs w:val="21"/>
         </w:rPr>
         <w:t xml:space="preserve">You can still </w:t>
       </w:r>
@@ -373,22 +664,18 @@
         <w:r>
           <w:rPr>
             <w:rStyle w:val="Hyperlink"/>
-            <w:rFonts w:ascii="Segoe UI" w:hAnsi="Segoe UI" w:cs="Segoe UI"/>
+            <w:rFonts w:asciiTheme="minorHAnsi" w:hAnsiTheme="minorHAnsi" w:cstheme="minorHAnsi"/>
             <w:b/>
             <w:bCs/>
             <w:color w:val="0969DA"/>
-            <w:sz w:val="21"/>
-            <w:szCs w:val="21"/>
           </w:rPr>
           <w:t>apply for benefits</w:t>
         </w:r>
       </w:hyperlink>
       <w:r>
         <w:rPr>
-          <w:rFonts w:ascii="Segoe UI" w:hAnsi="Segoe UI" w:cs="Segoe UI"/>
+          <w:rFonts w:asciiTheme="minorHAnsi" w:hAnsiTheme="minorHAnsi" w:cstheme="minorHAnsi"/>
           <w:color w:val="1F2328"/>
-          <w:sz w:val="21"/>
-          <w:szCs w:val="21"/>
         </w:rPr>
         <w:t xml:space="preserve"> and MDHHS will make its own decision about whether you qualify.</w:t>
       </w:r>
@@ -396,10 +683,30 @@
     <w:p>
       <w:pPr>
         <w:spacing w:after="140"/>
-      </w:pPr>
-      <w:r>
-        <w:t>{%p endif %}</w:t>
-      </w:r>
+        <w:rPr>
+          <w:rFonts w:cstheme="minorHAnsi"/>
+          <w:sz w:val="24"/>
+          <w:szCs w:val="24"/>
+        </w:rPr>
+      </w:pPr>
+      <w:r>
+        <w:rPr>
+          <w:rFonts w:cstheme="minorHAnsi"/>
+          <w:sz w:val="24"/>
+          <w:szCs w:val="24"/>
+        </w:rPr>
+        <w:t xml:space="preserve">{%p </w:t>
+      </w:r>
+      <w:proofErr w:type="gramStart"/>
+      <w:r>
+        <w:rPr>
+          <w:rFonts w:cstheme="minorHAnsi"/>
+          <w:sz w:val="24"/>
+          <w:szCs w:val="24"/>
+        </w:rPr>
+        <w:t>endif %}</w:t>
+      </w:r>
+      <w:proofErr w:type="gramEnd"/>
     </w:p>
     <w:tbl>
       <w:tblPr>
@@ -1311,67 +1618,122 @@
                 <w:sz w:val="22"/>
                 <w:szCs w:val="22"/>
               </w:rPr>
-              <w:t xml:space="preserve">Based on this information, you may be eligible for monthly </w:t>
+              <w:t>Y</w:t>
             </w:r>
             <w:r>
               <w:rPr>
                 <w:sz w:val="22"/>
                 <w:szCs w:val="22"/>
               </w:rPr>
-              <w:t>F</w:t>
+              <w:t xml:space="preserve">ou may be eligible for monthly </w:t>
             </w:r>
             <w:r>
               <w:rPr>
                 <w:sz w:val="22"/>
                 <w:szCs w:val="22"/>
               </w:rPr>
-              <w:t>AP benefits of</w:t>
+              <w:t>F</w:t>
             </w:r>
             <w:r>
               <w:rPr>
                 <w:sz w:val="22"/>
                 <w:szCs w:val="22"/>
               </w:rPr>
-              <w:t xml:space="preserve"> ${{ (</w:t>
-            </w:r>
-            <w:proofErr w:type="spellStart"/>
+              <w:t>AP benefits of</w:t>
+            </w:r>
             <w:r>
               <w:rPr>
                 <w:sz w:val="22"/>
                 <w:szCs w:val="22"/>
               </w:rPr>
-              <w:t>FinalResult</w:t>
-            </w:r>
-            <w:proofErr w:type="spellEnd"/>
+              <w:t xml:space="preserve"> </w:t>
+            </w:r>
             <w:r>
               <w:rPr>
                 <w:sz w:val="22"/>
                 <w:szCs w:val="22"/>
-              </w:rPr>
-              <w:t>)|</w:t>
-            </w:r>
-            <w:proofErr w:type="spellStart"/>
+                <w:u w:val="single"/>
+              </w:rPr>
+              <w:t>$</w:t>
+            </w:r>
+            <w:proofErr w:type="gramStart"/>
             <w:r>
               <w:rPr>
                 <w:sz w:val="22"/>
                 <w:szCs w:val="22"/>
-              </w:rPr>
-              <w:t>round|int</w:t>
-            </w:r>
-            <w:proofErr w:type="spellEnd"/>
+                <w:u w:val="single"/>
+              </w:rPr>
+              <w:t>{{ (</w:t>
+            </w:r>
+            <w:proofErr w:type="spellStart"/>
+            <w:proofErr w:type="gramEnd"/>
             <w:r>
               <w:rPr>
                 <w:sz w:val="22"/>
                 <w:szCs w:val="22"/>
-              </w:rPr>
-              <w:t xml:space="preserve"> }} per </w:t>
-            </w:r>
+                <w:u w:val="single"/>
+              </w:rPr>
+              <w:t>FinalResult</w:t>
+            </w:r>
+            <w:proofErr w:type="spellEnd"/>
             <w:r>
               <w:rPr>
                 <w:sz w:val="22"/>
                 <w:szCs w:val="22"/>
-              </w:rPr>
-              <w:t xml:space="preserve">month. </w:t>
+                <w:u w:val="single"/>
+              </w:rPr>
+              <w:t>)|</w:t>
+            </w:r>
+            <w:proofErr w:type="spellStart"/>
+            <w:r>
+              <w:rPr>
+                <w:sz w:val="22"/>
+                <w:szCs w:val="22"/>
+                <w:u w:val="single"/>
+              </w:rPr>
+              <w:t>round|</w:t>
+            </w:r>
+            <w:proofErr w:type="gramStart"/>
+            <w:r>
+              <w:rPr>
+                <w:sz w:val="22"/>
+                <w:szCs w:val="22"/>
+                <w:u w:val="single"/>
+              </w:rPr>
+              <w:t>int</w:t>
+            </w:r>
+            <w:proofErr w:type="spellEnd"/>
+            <w:r>
+              <w:rPr>
+                <w:sz w:val="22"/>
+                <w:szCs w:val="22"/>
+                <w:u w:val="single"/>
+              </w:rPr>
+              <w:t xml:space="preserve"> }</w:t>
+            </w:r>
+            <w:proofErr w:type="gramEnd"/>
+            <w:r>
+              <w:rPr>
+                <w:sz w:val="22"/>
+                <w:szCs w:val="22"/>
+                <w:u w:val="single"/>
+              </w:rPr>
+              <w:t xml:space="preserve">} per </w:t>
+            </w:r>
+            <w:r>
+              <w:rPr>
+                <w:sz w:val="22"/>
+                <w:szCs w:val="22"/>
+                <w:u w:val="single"/>
+              </w:rPr>
+              <w:t>month</w:t>
+            </w:r>
+            <w:r>
+              <w:rPr>
+                <w:sz w:val="22"/>
+                <w:szCs w:val="22"/>
+              </w:rPr>
+              <w:t xml:space="preserve">. </w:t>
             </w:r>
             <w:r>
               <w:rPr>
@@ -1393,10 +1755,11 @@
               <w:spacing w:after="0"/>
               <w:rPr>
                 <w:rFonts w:cstheme="minorHAnsi"/>
-                <w:b/>
-                <w:bCs/>
-              </w:rPr>
-            </w:pPr>
+                <w:color w:val="1F2328"/>
+                <w:shd w:val="clear" w:color="auto" w:fill="FFFFFF"/>
+              </w:rPr>
+            </w:pPr>
+            <w:proofErr w:type="gramStart"/>
             <w:r>
               <w:rPr>
                 <w:rFonts w:cstheme="minorHAnsi"/>
@@ -1411,6 +1774,7 @@
               <w:t>AssetTestScreenMsg</w:t>
             </w:r>
             <w:proofErr w:type="spellEnd"/>
+            <w:proofErr w:type="gramEnd"/>
             <w:r>
               <w:rPr>
                 <w:rFonts w:cstheme="minorHAnsi"/>
@@ -1454,6 +1818,19 @@
           <w:p>
             <w:pPr>
               <w:spacing w:after="0"/>
+            </w:pPr>
+            <w:r>
+              <w:t xml:space="preserve">{%p </w:t>
+            </w:r>
+            <w:proofErr w:type="gramStart"/>
+            <w:r>
+              <w:t>else %}</w:t>
+            </w:r>
+            <w:proofErr w:type="gramEnd"/>
+          </w:p>
+          <w:p>
+            <w:pPr>
+              <w:spacing w:after="0"/>
               <w:rPr>
                 <w:b/>
                 <w:bCs/>
@@ -1461,9 +1838,57 @@
                 <w:szCs w:val="20"/>
               </w:rPr>
             </w:pPr>
-            <w:r>
-              <w:t>{%p endif %}</w:t>
-            </w:r>
+          </w:p>
+          <w:p>
+            <w:pPr>
+              <w:spacing w:after="0"/>
+              <w:rPr>
+                <w:rFonts w:cstheme="minorHAnsi"/>
+                <w:b/>
+                <w:bCs/>
+              </w:rPr>
+            </w:pPr>
+            <w:r>
+              <w:rPr>
+                <w:b/>
+                <w:bCs/>
+              </w:rPr>
+              <w:t xml:space="preserve">You do </w:t>
+            </w:r>
+            <w:r>
+              <w:rPr>
+                <w:b/>
+                <w:bCs/>
+                <w:u w:val="single"/>
+              </w:rPr>
+              <w:t>not</w:t>
+            </w:r>
+            <w:r>
+              <w:rPr>
+                <w:b/>
+                <w:bCs/>
+              </w:rPr>
+              <w:t xml:space="preserve"> appear to be eligible for FAP benefits.</w:t>
+            </w:r>
+          </w:p>
+          <w:p>
+            <w:pPr>
+              <w:spacing w:after="0"/>
+              <w:rPr>
+                <w:b/>
+                <w:bCs/>
+                <w:sz w:val="20"/>
+                <w:szCs w:val="20"/>
+              </w:rPr>
+            </w:pPr>
+            <w:r>
+              <w:t xml:space="preserve">{%p </w:t>
+            </w:r>
+            <w:proofErr w:type="gramStart"/>
+            <w:r>
+              <w:t>endif %}</w:t>
+            </w:r>
+            <w:proofErr w:type="gramEnd"/>
           </w:p>
           <w:p>
             <w:pPr>
@@ -1604,7 +2029,18 @@
         </w:r>
       </w:hyperlink>
       <w:r>
-        <w:t xml:space="preserve">. If you are unable to complete the application online, you can complete a </w:t>
+        <w:t xml:space="preserve">. </w:t>
+      </w:r>
+    </w:p>
+    <w:p>
+      <w:pPr>
+        <w:spacing w:after="140"/>
+      </w:pPr>
+      <w:r>
+        <w:t>Another option is to</w:t>
+      </w:r>
+      <w:r>
+        <w:t xml:space="preserve"> complete a </w:t>
       </w:r>
       <w:hyperlink r:id="rId11" w:history="1">
         <w:r>
@@ -1694,6 +2130,7 @@
         <w:spacing w:after="140"/>
       </w:pPr>
       <w:r>
+        <w:lastRenderedPageBreak/>
         <w:t xml:space="preserve">If you are denied food stamps or other benefits and you think this is incorrect, your local legal services office may be able to help you. You can use the </w:t>
       </w:r>
       <w:hyperlink r:id="rId16" w:history="1">
@@ -1727,20 +2164,6 @@
       <w:r>
         <w:t xml:space="preserve">. </w:t>
       </w:r>
-      <w:r>
-        <w:t xml:space="preserve">Visit the </w:t>
-      </w:r>
-      <w:hyperlink r:id="rId18" w:history="1">
-        <w:r>
-          <w:rPr>
-            <w:rStyle w:val="Hyperlink"/>
-          </w:rPr>
-          <w:t>Public Assistance</w:t>
-        </w:r>
-      </w:hyperlink>
-      <w:r>
-        <w:t xml:space="preserve"> section on MichiganLegalHelp.org to learn more about different benefits and their eligibility requirements.</w:t>
-      </w:r>
     </w:p>
     <w:p>
       <w:pPr>
@@ -1751,7 +2174,7 @@
           <w:szCs w:val="24"/>
         </w:rPr>
         <w:sectPr>
-          <w:footerReference w:type="default" r:id="rId19"/>
+          <w:footerReference w:type="default" r:id="rId18"/>
           <w:pgSz w:w="12240" w:h="15840"/>
           <w:pgMar w:top="1008" w:right="720" w:bottom="1080" w:left="720" w:header="288" w:footer="720" w:gutter="0"/>
           <w:cols w:space="720"/>
@@ -4055,7 +4478,7 @@
                     </pic:cNvPicPr>
                   </pic:nvPicPr>
                   <pic:blipFill>
-                    <a:blip r:embed="rId20" cstate="print">
+                    <a:blip r:embed="rId19" cstate="print">
                       <a:extLst>
                         <a:ext uri="{28A0092B-C50C-407E-A947-70E740481C1C}">
                           <a14:useLocalDpi xmlns:a14="http://schemas.microsoft.com/office/drawing/2010/main" val="0"/>
@@ -4398,7 +4821,7 @@
                     </pic:cNvPicPr>
                   </pic:nvPicPr>
                   <pic:blipFill>
-                    <a:blip r:embed="rId21" cstate="print">
+                    <a:blip r:embed="rId20" cstate="print">
                       <a:extLst>
                         <a:ext uri="{28A0092B-C50C-407E-A947-70E740481C1C}">
                           <a14:useLocalDpi xmlns:a14="http://schemas.microsoft.com/office/drawing/2010/main" val="0"/>
@@ -4440,7 +4863,7 @@
       </w:pPr>
     </w:p>
     <w:sectPr>
-      <w:headerReference w:type="default" r:id="rId22"/>
+      <w:headerReference w:type="default" r:id="rId21"/>
       <w:pgSz w:w="12240" w:h="15840"/>
       <w:pgMar w:top="720" w:right="720" w:bottom="720" w:left="720" w:header="720" w:footer="360" w:gutter="0"/>
       <w:cols w:space="720"/>

</xml_diff>